<commit_message>
docs: add chapter 12 on command-interface mechanism selection
把 2026-09-20 关于指挥接口机制的讨论结论补进设计表，新增第十二章（文档
由 14 页增至 17 页）：

- 12.1 Action 的本质：3 个 service + 2 个 topic 的约定层，不是新的传输
  原语。由此推出两条结论——不提供比 topic/service 更强的传输保证（弱点
  全部继承），以及 5 个端点是"多消息实现"的直接代价
- 12.2 封装的价值在约定不在传输：goal_id、标准状态机、两侧标准实现、
  生态工具；对照本项目已有的两处手写版本（reliability.py 的 ACK 重发、
  本次 do_action 的 goal_id），后者是 Action 的最小子集
- 12.3 若把起飞改 Action：三层里只有"SDK↔机载"这一层变，选手代码、
  GCS 两个按钮、pt4ctrl 与手工 topic pub 全不变；附变化点与不变点清单，
  以及 rosbridge 2.0.8 对 ROS 2 action 封装不完整的核实结论
- 12.4 入口结构：纵向串联（不是旁路，最终仍落到 takeoff_land，飞控侧
  只有一个指令来源），横向双入口；由此产生的单点、无法独占、多写者三点
  影响
- 12.5 记录 do_action goal_id 改造的动机、两侧实现、实现要点、兼容性、
  验证方式与生效条件
- 12.6 推进顺序建议，含"只加 server 不切换调用方"这个零风险先行步

同时更新 9.2 现状表：do_action 单独成行，标注 goal_id 已落地，并写明仍
缺 cancel、标准状态机与 feedback。

Co-Authored-By: Claude Opus 5 <noreply@anthropic.com>
</commit_message>
<xml_diff>
--- a/模块运行位置与消息流转设计表.docx
+++ b/模块运行位置与消息流转设计表.docx
@@ -12435,7 +12435,7 @@
                 <w:rFonts w:ascii="Noto Sans CJK SC" w:hAnsi="Noto Sans CJK SC" w:eastAsia="Noto Sans CJK SC"/>
                 <w:sz w:val="16"/>
               </w:rPr>
-              <w:t>center_on_target / precision_land / do_action / formation_follow</w:t>
+              <w:t>center_on_target / precision_land / formation_follow</w:t>
             </w:r>
           </w:p>
         </w:tc>
@@ -12490,6 +12490,80 @@
                 <w:sz w:val="16"/>
               </w:rPr>
               <w:t>参数是状态不是命令：无请求-结果关联、无幂等去重、无取消语义；service 同步调用已两次死锁（_set_relay_mode、~/reset_scenario）</w:t>
+            </w:r>
+          </w:p>
+        </w:tc>
+      </w:tr>
+      <w:tr>
+        <w:tc>
+          <w:tcPr>
+            <w:tcW w:type="dxa" w:w="2835"/>
+          </w:tcPr>
+          <w:p>
+            <w:pPr>
+              <w:spacing w:after="0"/>
+            </w:pPr>
+            <w:r/>
+            <w:r>
+              <w:rPr>
+                <w:rFonts w:ascii="Noto Sans CJK SC" w:hAnsi="Noto Sans CJK SC" w:eastAsia="Noto Sans CJK SC"/>
+                <w:sz w:val="16"/>
+              </w:rPr>
+              <w:t>do_action</w:t>
+            </w:r>
+          </w:p>
+        </w:tc>
+        <w:tc>
+          <w:tcPr>
+            <w:tcW w:type="dxa" w:w="4082"/>
+          </w:tcPr>
+          <w:p>
+            <w:pPr>
+              <w:spacing w:after="0"/>
+            </w:pPr>
+            <w:r/>
+            <w:r>
+              <w:rPr>
+                <w:rFonts w:ascii="Noto Sans CJK SC" w:hAnsi="Noto Sans CJK SC" w:eastAsia="Noto Sans CJK SC"/>
+                <w:sz w:val="16"/>
+              </w:rPr>
+              <w:t>同上，但 2026-09-20 已补 action_goal_id（见第十二章 12.5）</w:t>
+            </w:r>
+          </w:p>
+        </w:tc>
+        <w:tc>
+          <w:tcPr>
+            <w:tcW w:type="dxa" w:w="3742"/>
+          </w:tcPr>
+          <w:p>
+            <w:pPr>
+              <w:spacing w:after="0"/>
+            </w:pPr>
+            <w:r/>
+            <w:r>
+              <w:rPr>
+                <w:rFonts w:ascii="Noto Sans CJK SC" w:hAnsi="Noto Sans CJK SC" w:eastAsia="Noto Sans CJK SC"/>
+                <w:sz w:val="16"/>
+              </w:rPr>
+              <w:t>机载执行并回带 goal_id</w:t>
+            </w:r>
+          </w:p>
+        </w:tc>
+        <w:tc>
+          <w:tcPr>
+            <w:tcW w:type="dxa" w:w="4535"/>
+          </w:tcPr>
+          <w:p>
+            <w:pPr>
+              <w:spacing w:after="0"/>
+            </w:pPr>
+            <w:r/>
+            <w:r>
+              <w:rPr>
+                <w:rFonts w:ascii="Noto Sans CJK SC" w:hAnsi="Noto Sans CJK SC" w:eastAsia="Noto Sans CJK SC"/>
+                <w:sz w:val="16"/>
+              </w:rPr>
+              <w:t>幂等与结果关联已解决；仍无 cancel、无标准状态机、无 feedback，命令行工具不认识这套自定义约定</w:t>
             </w:r>
           </w:p>
         </w:tc>
@@ -18482,6 +18556,2264 @@
                 <w:sz w:val="16"/>
               </w:rPr>
               <w:t>什么时候起飞、飞哪、何时降落</w:t>
+            </w:r>
+          </w:p>
+        </w:tc>
+      </w:tr>
+    </w:tbl>
+    <w:p>
+      <w:pPr>
+        <w:spacing w:after="120"/>
+      </w:pPr>
+    </w:p>
+    <w:p>
+      <w:r>
+        <w:br w:type="page"/>
+      </w:r>
+    </w:p>
+    <w:p>
+      <w:pPr>
+        <w:pStyle w:val="Heading1"/>
+      </w:pPr>
+      <w:r>
+        <w:rPr>
+          <w:rFonts w:ascii="Noto Sans CJK SC" w:hAnsi="Noto Sans CJK SC" w:eastAsia="Noto Sans CJK SC"/>
+          <w:sz w:val="28"/>
+        </w:rPr>
+        <w:t>十二、指挥接口机制选型：讨论结论（2026-09-20）</w:t>
+      </w:r>
+    </w:p>
+    <w:p>
+      <w:pPr>
+        <w:pStyle w:val="Heading2"/>
+      </w:pPr>
+      <w:r>
+        <w:rPr>
+          <w:rFonts w:ascii="Noto Sans CJK SC" w:hAnsi="Noto Sans CJK SC" w:eastAsia="Noto Sans CJK SC"/>
+          <w:sz w:val="22"/>
+        </w:rPr>
+        <w:t>12.1 Action 的本质：话题与服务之上的约定层，不是新的传输原语</w:t>
+      </w:r>
+    </w:p>
+    <w:tbl>
+      <w:tblPr>
+        <w:tblStyle w:val="TableGrid"/>
+        <w:tblW w:type="auto" w:w="0"/>
+        <w:jc w:val="center"/>
+        <w:tblLook w:firstColumn="1" w:firstRow="1" w:lastColumn="0" w:lastRow="0" w:noHBand="0" w:noVBand="1" w:val="04A0"/>
+      </w:tblPr>
+      <w:tblGrid>
+        <w:gridCol w:w="7569"/>
+        <w:gridCol w:w="7569"/>
+      </w:tblGrid>
+      <w:tr>
+        <w:tc>
+          <w:tcPr>
+            <w:tcW w:type="dxa" w:w="4535"/>
+            <w:shd w:val="clear" w:fill="D9E2F3"/>
+          </w:tcPr>
+          <w:p>
+            <w:r/>
+            <w:r>
+              <w:rPr>
+                <w:rFonts w:ascii="Noto Sans CJK SC" w:hAnsi="Noto Sans CJK SC" w:eastAsia="Noto Sans CJK SC"/>
+                <w:b/>
+                <w:sz w:val="17"/>
+              </w:rPr>
+              <w:t>Action 的环节</w:t>
+            </w:r>
+          </w:p>
+        </w:tc>
+        <w:tc>
+          <w:tcPr>
+            <w:tcW w:type="dxa" w:w="10658"/>
+            <w:shd w:val="clear" w:fill="D9E2F3"/>
+          </w:tcPr>
+          <w:p>
+            <w:r/>
+            <w:r>
+              <w:rPr>
+                <w:rFonts w:ascii="Noto Sans CJK SC" w:hAnsi="Noto Sans CJK SC" w:eastAsia="Noto Sans CJK SC"/>
+                <w:b/>
+                <w:sz w:val="17"/>
+              </w:rPr>
+              <w:t>底层实际是什么</w:t>
+            </w:r>
+          </w:p>
+        </w:tc>
+      </w:tr>
+      <w:tr>
+        <w:tc>
+          <w:tcPr>
+            <w:tcW w:type="dxa" w:w="4535"/>
+          </w:tcPr>
+          <w:p>
+            <w:pPr>
+              <w:spacing w:after="0"/>
+            </w:pPr>
+            <w:r/>
+            <w:r>
+              <w:rPr>
+                <w:rFonts w:ascii="Noto Sans CJK SC" w:hAnsi="Noto Sans CJK SC" w:eastAsia="Noto Sans CJK SC"/>
+                <w:sz w:val="16"/>
+              </w:rPr>
+              <w:t>发送目标</w:t>
+            </w:r>
+          </w:p>
+        </w:tc>
+        <w:tc>
+          <w:tcPr>
+            <w:tcW w:type="dxa" w:w="10658"/>
+          </w:tcPr>
+          <w:p>
+            <w:pPr>
+              <w:spacing w:after="0"/>
+            </w:pPr>
+            <w:r/>
+            <w:r>
+              <w:rPr>
+                <w:rFonts w:ascii="Noto Sans CJK SC" w:hAnsi="Noto Sans CJK SC" w:eastAsia="Noto Sans CJK SC"/>
+                <w:sz w:val="16"/>
+              </w:rPr>
+              <w:t>service send_goal（返回 accepted / rejected）</w:t>
+            </w:r>
+          </w:p>
+        </w:tc>
+      </w:tr>
+      <w:tr>
+        <w:tc>
+          <w:tcPr>
+            <w:tcW w:type="dxa" w:w="4535"/>
+          </w:tcPr>
+          <w:p>
+            <w:pPr>
+              <w:spacing w:after="0"/>
+            </w:pPr>
+            <w:r/>
+            <w:r>
+              <w:rPr>
+                <w:rFonts w:ascii="Noto Sans CJK SC" w:hAnsi="Noto Sans CJK SC" w:eastAsia="Noto Sans CJK SC"/>
+                <w:sz w:val="16"/>
+              </w:rPr>
+              <w:t>取消</w:t>
+            </w:r>
+          </w:p>
+        </w:tc>
+        <w:tc>
+          <w:tcPr>
+            <w:tcW w:type="dxa" w:w="10658"/>
+          </w:tcPr>
+          <w:p>
+            <w:pPr>
+              <w:spacing w:after="0"/>
+            </w:pPr>
+            <w:r/>
+            <w:r>
+              <w:rPr>
+                <w:rFonts w:ascii="Noto Sans CJK SC" w:hAnsi="Noto Sans CJK SC" w:eastAsia="Noto Sans CJK SC"/>
+                <w:sz w:val="16"/>
+              </w:rPr>
+              <w:t>service cancel_goal</w:t>
+            </w:r>
+          </w:p>
+        </w:tc>
+      </w:tr>
+      <w:tr>
+        <w:tc>
+          <w:tcPr>
+            <w:tcW w:type="dxa" w:w="4535"/>
+          </w:tcPr>
+          <w:p>
+            <w:pPr>
+              <w:spacing w:after="0"/>
+            </w:pPr>
+            <w:r/>
+            <w:r>
+              <w:rPr>
+                <w:rFonts w:ascii="Noto Sans CJK SC" w:hAnsi="Noto Sans CJK SC" w:eastAsia="Noto Sans CJK SC"/>
+                <w:sz w:val="16"/>
+              </w:rPr>
+              <w:t>取结果</w:t>
+            </w:r>
+          </w:p>
+        </w:tc>
+        <w:tc>
+          <w:tcPr>
+            <w:tcW w:type="dxa" w:w="10658"/>
+          </w:tcPr>
+          <w:p>
+            <w:pPr>
+              <w:spacing w:after="0"/>
+            </w:pPr>
+            <w:r/>
+            <w:r>
+              <w:rPr>
+                <w:rFonts w:ascii="Noto Sans CJK SC" w:hAnsi="Noto Sans CJK SC" w:eastAsia="Noto Sans CJK SC"/>
+                <w:sz w:val="16"/>
+              </w:rPr>
+              <w:t>service get_result</w:t>
+            </w:r>
+          </w:p>
+        </w:tc>
+      </w:tr>
+      <w:tr>
+        <w:tc>
+          <w:tcPr>
+            <w:tcW w:type="dxa" w:w="4535"/>
+          </w:tcPr>
+          <w:p>
+            <w:pPr>
+              <w:spacing w:after="0"/>
+            </w:pPr>
+            <w:r/>
+            <w:r>
+              <w:rPr>
+                <w:rFonts w:ascii="Noto Sans CJK SC" w:hAnsi="Noto Sans CJK SC" w:eastAsia="Noto Sans CJK SC"/>
+                <w:sz w:val="16"/>
+              </w:rPr>
+              <w:t>进度反馈</w:t>
+            </w:r>
+          </w:p>
+        </w:tc>
+        <w:tc>
+          <w:tcPr>
+            <w:tcW w:type="dxa" w:w="10658"/>
+          </w:tcPr>
+          <w:p>
+            <w:pPr>
+              <w:spacing w:after="0"/>
+            </w:pPr>
+            <w:r/>
+            <w:r>
+              <w:rPr>
+                <w:rFonts w:ascii="Noto Sans CJK SC" w:hAnsi="Noto Sans CJK SC" w:eastAsia="Noto Sans CJK SC"/>
+                <w:sz w:val="16"/>
+              </w:rPr>
+              <w:t>topic feedback</w:t>
+            </w:r>
+          </w:p>
+        </w:tc>
+      </w:tr>
+      <w:tr>
+        <w:tc>
+          <w:tcPr>
+            <w:tcW w:type="dxa" w:w="4535"/>
+          </w:tcPr>
+          <w:p>
+            <w:pPr>
+              <w:spacing w:after="0"/>
+            </w:pPr>
+            <w:r/>
+            <w:r>
+              <w:rPr>
+                <w:rFonts w:ascii="Noto Sans CJK SC" w:hAnsi="Noto Sans CJK SC" w:eastAsia="Noto Sans CJK SC"/>
+                <w:sz w:val="16"/>
+              </w:rPr>
+              <w:t>状态广播</w:t>
+            </w:r>
+          </w:p>
+        </w:tc>
+        <w:tc>
+          <w:tcPr>
+            <w:tcW w:type="dxa" w:w="10658"/>
+          </w:tcPr>
+          <w:p>
+            <w:pPr>
+              <w:spacing w:after="0"/>
+            </w:pPr>
+            <w:r/>
+            <w:r>
+              <w:rPr>
+                <w:rFonts w:ascii="Noto Sans CJK SC" w:hAnsi="Noto Sans CJK SC" w:eastAsia="Noto Sans CJK SC"/>
+                <w:sz w:val="16"/>
+              </w:rPr>
+              <w:t>topic status（RELIABLE + TRANSIENT_LOCAL + depth 1，新订阅者能补到最新状态）</w:t>
+            </w:r>
+          </w:p>
+        </w:tc>
+      </w:tr>
+    </w:tbl>
+    <w:p>
+      <w:pPr>
+        <w:spacing w:after="120"/>
+      </w:pPr>
+    </w:p>
+    <w:p>
+      <w:pPr>
+        <w:spacing w:after="80"/>
+      </w:pPr>
+      <w:r>
+        <w:rPr>
+          <w:rFonts w:ascii="Noto Sans CJK SC" w:hAnsi="Noto Sans CJK SC" w:eastAsia="Noto Sans CJK SC"/>
+          <w:b w:val="0"/>
+          <w:i w:val="0"/>
+          <w:sz w:val="18"/>
+        </w:rPr>
+        <w:t>service 本身在 DDS 里也是一对请求/应答话题，靠 request id 做关联，所以整条栈拆到底就是发布订阅。由此推出两个结论：① Action 不提供比 topic / service 更强的传输保证——get_result 响应丢失、server 重启丢 goal 这些弱点它都继承；② 每个 action 建 3 service + 2 topic 的 DDS 实体，是"多消息实现"的直接代价，实体过多会加重发现负载。</w:t>
+      </w:r>
+    </w:p>
+    <w:p>
+      <w:pPr>
+        <w:pStyle w:val="Heading2"/>
+      </w:pPr>
+      <w:r>
+        <w:rPr>
+          <w:rFonts w:ascii="Noto Sans CJK SC" w:hAnsi="Noto Sans CJK SC" w:eastAsia="Noto Sans CJK SC"/>
+          <w:sz w:val="22"/>
+        </w:rPr>
+        <w:t>12.2 封装的价值在约定，不在传输</w:t>
+      </w:r>
+    </w:p>
+    <w:tbl>
+      <w:tblPr>
+        <w:tblStyle w:val="TableGrid"/>
+        <w:tblW w:type="auto" w:w="0"/>
+        <w:jc w:val="center"/>
+        <w:tblLook w:firstColumn="1" w:firstRow="1" w:lastColumn="0" w:lastRow="0" w:noHBand="0" w:noVBand="1" w:val="04A0"/>
+      </w:tblPr>
+      <w:tblGrid>
+        <w:gridCol w:w="7569"/>
+        <w:gridCol w:w="7569"/>
+      </w:tblGrid>
+      <w:tr>
+        <w:tc>
+          <w:tcPr>
+            <w:tcW w:type="dxa" w:w="5896"/>
+            <w:shd w:val="clear" w:fill="D9E2F3"/>
+          </w:tcPr>
+          <w:p>
+            <w:r/>
+            <w:r>
+              <w:rPr>
+                <w:rFonts w:ascii="Noto Sans CJK SC" w:hAnsi="Noto Sans CJK SC" w:eastAsia="Noto Sans CJK SC"/>
+                <w:b/>
+                <w:sz w:val="17"/>
+              </w:rPr>
+              <w:t>Action 提供的</w:t>
+            </w:r>
+          </w:p>
+        </w:tc>
+        <w:tc>
+          <w:tcPr>
+            <w:tcW w:type="dxa" w:w="9298"/>
+            <w:shd w:val="clear" w:fill="D9E2F3"/>
+          </w:tcPr>
+          <w:p>
+            <w:r/>
+            <w:r>
+              <w:rPr>
+                <w:rFonts w:ascii="Noto Sans CJK SC" w:hAnsi="Noto Sans CJK SC" w:eastAsia="Noto Sans CJK SC"/>
+                <w:b/>
+                <w:sz w:val="17"/>
+              </w:rPr>
+              <w:t>自己用 topic 手写等价物要做的</w:t>
+            </w:r>
+          </w:p>
+        </w:tc>
+      </w:tr>
+      <w:tr>
+        <w:tc>
+          <w:tcPr>
+            <w:tcW w:type="dxa" w:w="5896"/>
+          </w:tcPr>
+          <w:p>
+            <w:pPr>
+              <w:spacing w:after="0"/>
+            </w:pPr>
+            <w:r/>
+            <w:r>
+              <w:rPr>
+                <w:rFonts w:ascii="Noto Sans CJK SC" w:hAnsi="Noto Sans CJK SC" w:eastAsia="Noto Sans CJK SC"/>
+                <w:sz w:val="16"/>
+              </w:rPr>
+              <w:t>goal_id 由框架生成与维护</w:t>
+            </w:r>
+          </w:p>
+        </w:tc>
+        <w:tc>
+          <w:tcPr>
+            <w:tcW w:type="dxa" w:w="9298"/>
+          </w:tcPr>
+          <w:p>
+            <w:pPr>
+              <w:spacing w:after="0"/>
+            </w:pPr>
+            <w:r/>
+            <w:r>
+              <w:rPr>
+                <w:rFonts w:ascii="Noto Sans CJK SC" w:hAnsi="Noto Sans CJK SC" w:eastAsia="Noto Sans CJK SC"/>
+                <w:sz w:val="16"/>
+              </w:rPr>
+              <w:t>自己定义编码规则、传递方式、去重表</w:t>
+            </w:r>
+          </w:p>
+        </w:tc>
+      </w:tr>
+      <w:tr>
+        <w:tc>
+          <w:tcPr>
+            <w:tcW w:type="dxa" w:w="5896"/>
+          </w:tcPr>
+          <w:p>
+            <w:pPr>
+              <w:spacing w:after="0"/>
+            </w:pPr>
+            <w:r/>
+            <w:r>
+              <w:rPr>
+                <w:rFonts w:ascii="Noto Sans CJK SC" w:hAnsi="Noto Sans CJK SC" w:eastAsia="Noto Sans CJK SC"/>
+                <w:sz w:val="16"/>
+              </w:rPr>
+              <w:t>标准状态机：ACCEPTED / EXECUTING / CANCELING / SUCCEEDED / ABORTED / CANCELED</w:t>
+            </w:r>
+          </w:p>
+        </w:tc>
+        <w:tc>
+          <w:tcPr>
+            <w:tcW w:type="dxa" w:w="9298"/>
+          </w:tcPr>
+          <w:p>
+            <w:pPr>
+              <w:spacing w:after="0"/>
+            </w:pPr>
+            <w:r/>
+            <w:r>
+              <w:rPr>
+                <w:rFonts w:ascii="Noto Sans CJK SC" w:hAnsi="Noto Sans CJK SC" w:eastAsia="Noto Sans CJK SC"/>
+                <w:sz w:val="16"/>
+              </w:rPr>
+              <w:t>自己定义状态取值，并保证收发两侧理解一致</w:t>
+            </w:r>
+          </w:p>
+        </w:tc>
+      </w:tr>
+      <w:tr>
+        <w:tc>
+          <w:tcPr>
+            <w:tcW w:type="dxa" w:w="5896"/>
+          </w:tcPr>
+          <w:p>
+            <w:pPr>
+              <w:spacing w:after="0"/>
+            </w:pPr>
+            <w:r/>
+            <w:r>
+              <w:rPr>
+                <w:rFonts w:ascii="Noto Sans CJK SC" w:hAnsi="Noto Sans CJK SC" w:eastAsia="Noto Sans CJK SC"/>
+                <w:sz w:val="16"/>
+              </w:rPr>
+              <w:t>客户端与服务端的标准实现：超时、并发策略、cancel 传播、result 缓存</w:t>
+            </w:r>
+          </w:p>
+        </w:tc>
+        <w:tc>
+          <w:tcPr>
+            <w:tcW w:type="dxa" w:w="9298"/>
+          </w:tcPr>
+          <w:p>
+            <w:pPr>
+              <w:spacing w:after="0"/>
+            </w:pPr>
+            <w:r/>
+            <w:r>
+              <w:rPr>
+                <w:rFonts w:ascii="Noto Sans CJK SC" w:hAnsi="Noto Sans CJK SC" w:eastAsia="Noto Sans CJK SC"/>
+                <w:sz w:val="16"/>
+              </w:rPr>
+              <w:t>逐项自己实现</w:t>
+            </w:r>
+          </w:p>
+        </w:tc>
+      </w:tr>
+      <w:tr>
+        <w:tc>
+          <w:tcPr>
+            <w:tcW w:type="dxa" w:w="5896"/>
+          </w:tcPr>
+          <w:p>
+            <w:pPr>
+              <w:spacing w:after="0"/>
+            </w:pPr>
+            <w:r/>
+            <w:r>
+              <w:rPr>
+                <w:rFonts w:ascii="Noto Sans CJK SC" w:hAnsi="Noto Sans CJK SC" w:eastAsia="Noto Sans CJK SC"/>
+                <w:sz w:val="16"/>
+              </w:rPr>
+              <w:t>生态统一：ros2 action list / send_goal 命令行可用，rqt 可视，rosbag 录标准结构</w:t>
+            </w:r>
+          </w:p>
+        </w:tc>
+        <w:tc>
+          <w:tcPr>
+            <w:tcW w:type="dxa" w:w="9298"/>
+          </w:tcPr>
+          <w:p>
+            <w:pPr>
+              <w:spacing w:after="0"/>
+            </w:pPr>
+            <w:r/>
+            <w:r>
+              <w:rPr>
+                <w:rFonts w:ascii="Noto Sans CJK SC" w:hAnsi="Noto Sans CJK SC" w:eastAsia="Noto Sans CJK SC"/>
+                <w:sz w:val="16"/>
+              </w:rPr>
+              <w:t>自定义协议，工具不认识，接手的人要先读懂协议</w:t>
+            </w:r>
+          </w:p>
+        </w:tc>
+      </w:tr>
+    </w:tbl>
+    <w:p>
+      <w:pPr>
+        <w:spacing w:after="120"/>
+      </w:pPr>
+    </w:p>
+    <w:p>
+      <w:pPr>
+        <w:spacing w:after="80"/>
+      </w:pPr>
+      <w:r>
+        <w:rPr>
+          <w:rFonts w:ascii="Noto Sans CJK SC" w:hAnsi="Noto Sans CJK SC" w:eastAsia="Noto Sans CJK SC"/>
+          <w:b w:val="0"/>
+          <w:i w:val="0"/>
+          <w:sz w:val="18"/>
+        </w:rPr>
+        <w:t>判断标准不是"Action 有没有黑魔法"，而是"这套约定要不要自己维护"。写一两处没问题；写到五六处、还要保证语义一致、还要让接手的人看懂，就不如用框架现成的。反过来，只需要"发一次、知道收到了"的场景，手写确实更轻，不必为了用 Action 而用 Action。</w:t>
+      </w:r>
+    </w:p>
+    <w:p>
+      <w:pPr>
+        <w:spacing w:after="80"/>
+      </w:pPr>
+      <w:r>
+        <w:rPr>
+          <w:rFonts w:ascii="Noto Sans CJK SC" w:hAnsi="Noto Sans CJK SC" w:eastAsia="Noto Sans CJK SC"/>
+          <w:b w:val="0"/>
+          <w:i w:val="0"/>
+          <w:sz w:val="18"/>
+        </w:rPr>
+        <w:t>本项目已有两处手写版本：reliability.py 的 ACK + 1Hz 重发（跨机事件），以及 2026-09-20 给 do_action 补的 goal_id 去重与结果关联（约 100 行，见 12.5）。后者正是 Action 的一个最小子集——没有 cancel、没有标准状态机、没有 feedback、命令行工具不认识。</w:t>
+      </w:r>
+    </w:p>
+    <w:p>
+      <w:pPr>
+        <w:pStyle w:val="Heading2"/>
+      </w:pPr>
+      <w:r>
+        <w:rPr>
+          <w:rFonts w:ascii="Noto Sans CJK SC" w:hAnsi="Noto Sans CJK SC" w:eastAsia="Noto Sans CJK SC"/>
+          <w:sz w:val="22"/>
+        </w:rPr>
+        <w:t>12.3 若把起飞改成 Action：三层里只有中间一层变</w:t>
+      </w:r>
+    </w:p>
+    <w:tbl>
+      <w:tblPr>
+        <w:tblStyle w:val="TableGrid"/>
+        <w:tblW w:type="auto" w:w="0"/>
+        <w:jc w:val="center"/>
+        <w:tblLook w:firstColumn="1" w:firstRow="1" w:lastColumn="0" w:lastRow="0" w:noHBand="0" w:noVBand="1" w:val="04A0"/>
+      </w:tblPr>
+      <w:tblGrid>
+        <w:gridCol w:w="5046"/>
+        <w:gridCol w:w="5046"/>
+        <w:gridCol w:w="5046"/>
+      </w:tblGrid>
+      <w:tr>
+        <w:tc>
+          <w:tcPr>
+            <w:tcW w:type="dxa" w:w="2041"/>
+            <w:shd w:val="clear" w:fill="D9E2F3"/>
+          </w:tcPr>
+          <w:p>
+            <w:r/>
+            <w:r>
+              <w:rPr>
+                <w:rFonts w:ascii="Noto Sans CJK SC" w:hAnsi="Noto Sans CJK SC" w:eastAsia="Noto Sans CJK SC"/>
+                <w:b/>
+                <w:sz w:val="17"/>
+              </w:rPr>
+              <w:t>层次</w:t>
+            </w:r>
+          </w:p>
+        </w:tc>
+        <w:tc>
+          <w:tcPr>
+            <w:tcW w:type="dxa" w:w="6463"/>
+            <w:shd w:val="clear" w:fill="D9E2F3"/>
+          </w:tcPr>
+          <w:p>
+            <w:r/>
+            <w:r>
+              <w:rPr>
+                <w:rFonts w:ascii="Noto Sans CJK SC" w:hAnsi="Noto Sans CJK SC" w:eastAsia="Noto Sans CJK SC"/>
+                <w:b/>
+                <w:sz w:val="17"/>
+              </w:rPr>
+              <w:t>现在</w:t>
+            </w:r>
+          </w:p>
+        </w:tc>
+        <w:tc>
+          <w:tcPr>
+            <w:tcW w:type="dxa" w:w="6690"/>
+            <w:shd w:val="clear" w:fill="D9E2F3"/>
+          </w:tcPr>
+          <w:p>
+            <w:r/>
+            <w:r>
+              <w:rPr>
+                <w:rFonts w:ascii="Noto Sans CJK SC" w:hAnsi="Noto Sans CJK SC" w:eastAsia="Noto Sans CJK SC"/>
+                <w:b/>
+                <w:sz w:val="17"/>
+              </w:rPr>
+              <w:t>改后</w:t>
+            </w:r>
+          </w:p>
+        </w:tc>
+      </w:tr>
+      <w:tr>
+        <w:tc>
+          <w:tcPr>
+            <w:tcW w:type="dxa" w:w="2041"/>
+          </w:tcPr>
+          <w:p>
+            <w:pPr>
+              <w:spacing w:after="0"/>
+            </w:pPr>
+            <w:r/>
+            <w:r>
+              <w:rPr>
+                <w:rFonts w:ascii="Noto Sans CJK SC" w:hAnsi="Noto Sans CJK SC" w:eastAsia="Noto Sans CJK SC"/>
+                <w:sz w:val="16"/>
+              </w:rPr>
+              <w:t>选手代码</w:t>
+            </w:r>
+          </w:p>
+        </w:tc>
+        <w:tc>
+          <w:tcPr>
+            <w:tcW w:type="dxa" w:w="6463"/>
+          </w:tcPr>
+          <w:p>
+            <w:pPr>
+              <w:spacing w:after="0"/>
+            </w:pPr>
+            <w:r/>
+            <w:r>
+              <w:rPr>
+                <w:rFonts w:ascii="Noto Sans CJK SC" w:hAnsi="Noto Sans CJK SC" w:eastAsia="Noto Sans CJK SC"/>
+                <w:sz w:val="16"/>
+              </w:rPr>
+              <w:t>sdk.takeoff()</w:t>
+            </w:r>
+          </w:p>
+        </w:tc>
+        <w:tc>
+          <w:tcPr>
+            <w:tcW w:type="dxa" w:w="6690"/>
+          </w:tcPr>
+          <w:p>
+            <w:pPr>
+              <w:spacing w:after="0"/>
+            </w:pPr>
+            <w:r/>
+            <w:r>
+              <w:rPr>
+                <w:rFonts w:ascii="Noto Sans CJK SC" w:hAnsi="Noto Sans CJK SC" w:eastAsia="Noto Sans CJK SC"/>
+                <w:sz w:val="16"/>
+              </w:rPr>
+              <w:t>完全不变，签名与语义都一样</w:t>
+            </w:r>
+          </w:p>
+        </w:tc>
+      </w:tr>
+      <w:tr>
+        <w:tc>
+          <w:tcPr>
+            <w:tcW w:type="dxa" w:w="2041"/>
+          </w:tcPr>
+          <w:p>
+            <w:pPr>
+              <w:spacing w:after="0"/>
+            </w:pPr>
+            <w:r/>
+            <w:r>
+              <w:rPr>
+                <w:rFonts w:ascii="Noto Sans CJK SC" w:hAnsi="Noto Sans CJK SC" w:eastAsia="Noto Sans CJK SC"/>
+                <w:sz w:val="16"/>
+              </w:rPr>
+              <w:t>SDK ↔ 机载</w:t>
+            </w:r>
+          </w:p>
+        </w:tc>
+        <w:tc>
+          <w:tcPr>
+            <w:tcW w:type="dxa" w:w="6463"/>
+          </w:tcPr>
+          <w:p>
+            <w:pPr>
+              <w:spacing w:after="0"/>
+            </w:pPr>
+            <w:r/>
+            <w:r>
+              <w:rPr>
+                <w:rFonts w:ascii="Noto Sans CJK SC" w:hAnsi="Noto Sans CJK SC" w:eastAsia="Noto Sans CJK SC"/>
+                <w:sz w:val="16"/>
+              </w:rPr>
+              <w:t>发 takeoff_land{TAKEOFF} 话题，在选手侧轮询 armed 与位置稳定窗口</w:t>
+            </w:r>
+          </w:p>
+        </w:tc>
+        <w:tc>
+          <w:tcPr>
+            <w:tcW w:type="dxa" w:w="6690"/>
+          </w:tcPr>
+          <w:p>
+            <w:pPr>
+              <w:spacing w:after="0"/>
+            </w:pPr>
+            <w:r/>
+            <w:r>
+              <w:rPr>
+                <w:rFonts w:ascii="Noto Sans CJK SC" w:hAnsi="Noto Sans CJK SC" w:eastAsia="Noto Sans CJK SC"/>
+                <w:sz w:val="16"/>
+              </w:rPr>
+              <w:t>变：发 action goal，等 result；判定逻辑下沉到机载</w:t>
+            </w:r>
+          </w:p>
+        </w:tc>
+      </w:tr>
+      <w:tr>
+        <w:tc>
+          <w:tcPr>
+            <w:tcW w:type="dxa" w:w="2041"/>
+          </w:tcPr>
+          <w:p>
+            <w:pPr>
+              <w:spacing w:after="0"/>
+            </w:pPr>
+            <w:r/>
+            <w:r>
+              <w:rPr>
+                <w:rFonts w:ascii="Noto Sans CJK SC" w:hAnsi="Noto Sans CJK SC" w:eastAsia="Noto Sans CJK SC"/>
+                <w:sz w:val="16"/>
+              </w:rPr>
+              <w:t>机载 ↔ 飞控</w:t>
+            </w:r>
+          </w:p>
+        </w:tc>
+        <w:tc>
+          <w:tcPr>
+            <w:tcW w:type="dxa" w:w="6463"/>
+          </w:tcPr>
+          <w:p>
+            <w:pPr>
+              <w:spacing w:after="0"/>
+            </w:pPr>
+            <w:r/>
+            <w:r>
+              <w:rPr>
+                <w:rFonts w:ascii="Noto Sans CJK SC" w:hAnsi="Noto Sans CJK SC" w:eastAsia="Noto Sans CJK SC"/>
+                <w:sz w:val="16"/>
+              </w:rPr>
+              <w:t>pt4ctrl 订阅 takeoff_land，MANUAL_CTRL → AUTO_TAKEOFF</w:t>
+            </w:r>
+          </w:p>
+        </w:tc>
+        <w:tc>
+          <w:tcPr>
+            <w:tcW w:type="dxa" w:w="6690"/>
+          </w:tcPr>
+          <w:p>
+            <w:pPr>
+              <w:spacing w:after="0"/>
+            </w:pPr>
+            <w:r/>
+            <w:r>
+              <w:rPr>
+                <w:rFonts w:ascii="Noto Sans CJK SC" w:hAnsi="Noto Sans CJK SC" w:eastAsia="Noto Sans CJK SC"/>
+                <w:sz w:val="16"/>
+              </w:rPr>
+              <w:t>完全不变，包装节点照样发这条话题</w:t>
+            </w:r>
+          </w:p>
+        </w:tc>
+      </w:tr>
+    </w:tbl>
+    <w:p>
+      <w:pPr>
+        <w:spacing w:after="120"/>
+      </w:pPr>
+    </w:p>
+    <w:tbl>
+      <w:tblPr>
+        <w:tblStyle w:val="TableGrid"/>
+        <w:tblW w:type="auto" w:w="0"/>
+        <w:jc w:val="center"/>
+        <w:tblLook w:firstColumn="1" w:firstRow="1" w:lastColumn="0" w:lastRow="0" w:noHBand="0" w:noVBand="1" w:val="04A0"/>
+      </w:tblPr>
+      <w:tblGrid>
+        <w:gridCol w:w="7569"/>
+        <w:gridCol w:w="7569"/>
+      </w:tblGrid>
+      <w:tr>
+        <w:tc>
+          <w:tcPr>
+            <w:tcW w:type="dxa" w:w="3402"/>
+            <w:shd w:val="clear" w:fill="D9E2F3"/>
+          </w:tcPr>
+          <w:p>
+            <w:r/>
+            <w:r>
+              <w:rPr>
+                <w:rFonts w:ascii="Noto Sans CJK SC" w:hAnsi="Noto Sans CJK SC" w:eastAsia="Noto Sans CJK SC"/>
+                <w:b/>
+                <w:sz w:val="17"/>
+              </w:rPr>
+              <w:t>变化点</w:t>
+            </w:r>
+          </w:p>
+        </w:tc>
+        <w:tc>
+          <w:tcPr>
+            <w:tcW w:type="dxa" w:w="11792"/>
+            <w:shd w:val="clear" w:fill="D9E2F3"/>
+          </w:tcPr>
+          <w:p>
+            <w:r/>
+            <w:r>
+              <w:rPr>
+                <w:rFonts w:ascii="Noto Sans CJK SC" w:hAnsi="Noto Sans CJK SC" w:eastAsia="Noto Sans CJK SC"/>
+                <w:b/>
+                <w:sz w:val="17"/>
+              </w:rPr>
+              <w:t>说明</w:t>
+            </w:r>
+          </w:p>
+        </w:tc>
+      </w:tr>
+      <w:tr>
+        <w:tc>
+          <w:tcPr>
+            <w:tcW w:type="dxa" w:w="3402"/>
+          </w:tcPr>
+          <w:p>
+            <w:pPr>
+              <w:spacing w:after="0"/>
+            </w:pPr>
+            <w:r/>
+            <w:r>
+              <w:rPr>
+                <w:rFonts w:ascii="Noto Sans CJK SC" w:hAnsi="Noto Sans CJK SC" w:eastAsia="Noto Sans CJK SC"/>
+                <w:sz w:val="16"/>
+              </w:rPr>
+              <w:t>takeoff_land 的发布者换人</w:t>
+            </w:r>
+          </w:p>
+        </w:tc>
+        <w:tc>
+          <w:tcPr>
+            <w:tcW w:type="dxa" w:w="11792"/>
+          </w:tcPr>
+          <w:p>
+            <w:pPr>
+              <w:spacing w:after="0"/>
+            </w:pPr>
+            <w:r/>
+            <w:r>
+              <w:rPr>
+                <w:rFonts w:ascii="Noto Sans CJK SC" w:hAnsi="Noto Sans CJK SC" w:eastAsia="Noto Sans CJK SC"/>
+                <w:sz w:val="16"/>
+              </w:rPr>
+              <w:t>由选手容器改为机载 action server，ros2 topic info 看到的 publisher 会变，排查时需注意</w:t>
+            </w:r>
+          </w:p>
+        </w:tc>
+      </w:tr>
+      <w:tr>
+        <w:tc>
+          <w:tcPr>
+            <w:tcW w:type="dxa" w:w="3402"/>
+          </w:tcPr>
+          <w:p>
+            <w:pPr>
+              <w:spacing w:after="0"/>
+            </w:pPr>
+            <w:r/>
+            <w:r>
+              <w:rPr>
+                <w:rFonts w:ascii="Noto Sans CJK SC" w:hAnsi="Noto Sans CJK SC" w:eastAsia="Noto Sans CJK SC"/>
+                <w:sz w:val="16"/>
+              </w:rPr>
+              <w:t>完成判定位置</w:t>
+            </w:r>
+          </w:p>
+        </w:tc>
+        <w:tc>
+          <w:tcPr>
+            <w:tcW w:type="dxa" w:w="11792"/>
+          </w:tcPr>
+          <w:p>
+            <w:pPr>
+              <w:spacing w:after="0"/>
+            </w:pPr>
+            <w:r/>
+            <w:r>
+              <w:rPr>
+                <w:rFonts w:ascii="Noto Sans CJK SC" w:hAnsi="Noto Sans CJK SC" w:eastAsia="Noto Sans CJK SC"/>
+                <w:sz w:val="16"/>
+              </w:rPr>
+              <w:t>从选手侧挪到机载，armed 与里程计都是本地数据，不过链路</w:t>
+            </w:r>
+          </w:p>
+        </w:tc>
+      </w:tr>
+      <w:tr>
+        <w:tc>
+          <w:tcPr>
+            <w:tcW w:type="dxa" w:w="3402"/>
+          </w:tcPr>
+          <w:p>
+            <w:pPr>
+              <w:spacing w:after="0"/>
+            </w:pPr>
+            <w:r/>
+            <w:r>
+              <w:rPr>
+                <w:rFonts w:ascii="Noto Sans CJK SC" w:hAnsi="Noto Sans CJK SC" w:eastAsia="Noto Sans CJK SC"/>
+                <w:sz w:val="16"/>
+              </w:rPr>
+              <w:t>超时语义</w:t>
+            </w:r>
+          </w:p>
+        </w:tc>
+        <w:tc>
+          <w:tcPr>
+            <w:tcW w:type="dxa" w:w="11792"/>
+          </w:tcPr>
+          <w:p>
+            <w:pPr>
+              <w:spacing w:after="0"/>
+            </w:pPr>
+            <w:r/>
+            <w:r>
+              <w:rPr>
+                <w:rFonts w:ascii="Noto Sans CJK SC" w:hAnsi="Noto Sans CJK SC" w:eastAsia="Noto Sans CJK SC"/>
+                <w:sz w:val="16"/>
+              </w:rPr>
+              <w:t>现在 timeout 覆盖"等 armed"+"等位置稳定"两段且都在客户端；改后客户端 timeout 是"等 result 的总时限"，细分判定在机载，失败原因可区分"未解锁"与"爬升不到位"</w:t>
+            </w:r>
+          </w:p>
+        </w:tc>
+      </w:tr>
+      <w:tr>
+        <w:tc>
+          <w:tcPr>
+            <w:tcW w:type="dxa" w:w="3402"/>
+          </w:tcPr>
+          <w:p>
+            <w:pPr>
+              <w:spacing w:after="0"/>
+            </w:pPr>
+            <w:r/>
+            <w:r>
+              <w:rPr>
+                <w:rFonts w:ascii="Noto Sans CJK SC" w:hAnsi="Noto Sans CJK SC" w:eastAsia="Noto Sans CJK SC"/>
+                <w:sz w:val="16"/>
+              </w:rPr>
+              <w:t>rosbag 内容</w:t>
+            </w:r>
+          </w:p>
+        </w:tc>
+        <w:tc>
+          <w:tcPr>
+            <w:tcW w:type="dxa" w:w="11792"/>
+          </w:tcPr>
+          <w:p>
+            <w:pPr>
+              <w:spacing w:after="0"/>
+            </w:pPr>
+            <w:r/>
+            <w:r>
+              <w:rPr>
+                <w:rFonts w:ascii="Noto Sans CJK SC" w:hAnsi="Noto Sans CJK SC" w:eastAsia="Noto Sans CJK SC"/>
+                <w:sz w:val="16"/>
+              </w:rPr>
+              <w:t>多出 action 的 status / feedback 等内部话题，对 E4 复盘有用</w:t>
+            </w:r>
+          </w:p>
+        </w:tc>
+      </w:tr>
+      <w:tr>
+        <w:tc>
+          <w:tcPr>
+            <w:tcW w:type="dxa" w:w="3402"/>
+          </w:tcPr>
+          <w:p>
+            <w:pPr>
+              <w:spacing w:after="0"/>
+            </w:pPr>
+            <w:r/>
+            <w:r>
+              <w:rPr>
+                <w:rFonts w:ascii="Noto Sans CJK SC" w:hAnsi="Noto Sans CJK SC" w:eastAsia="Noto Sans CJK SC"/>
+                <w:sz w:val="16"/>
+              </w:rPr>
+              <w:t>新增能力</w:t>
+            </w:r>
+          </w:p>
+        </w:tc>
+        <w:tc>
+          <w:tcPr>
+            <w:tcW w:type="dxa" w:w="11792"/>
+          </w:tcPr>
+          <w:p>
+            <w:pPr>
+              <w:spacing w:after="0"/>
+            </w:pPr>
+            <w:r/>
+            <w:r>
+              <w:rPr>
+                <w:rFonts w:ascii="Noto Sans CJK SC" w:hAnsi="Noto Sans CJK SC" w:eastAsia="Noto Sans CJK SC"/>
+                <w:sz w:val="16"/>
+              </w:rPr>
+              <w:t>可取消——现在起飞指令发出后收不回来</w:t>
+            </w:r>
+          </w:p>
+        </w:tc>
+      </w:tr>
+    </w:tbl>
+    <w:p>
+      <w:pPr>
+        <w:spacing w:after="120"/>
+      </w:pPr>
+    </w:p>
+    <w:tbl>
+      <w:tblPr>
+        <w:tblStyle w:val="TableGrid"/>
+        <w:tblW w:type="auto" w:w="0"/>
+        <w:jc w:val="center"/>
+        <w:tblLook w:firstColumn="1" w:firstRow="1" w:lastColumn="0" w:lastRow="0" w:noHBand="0" w:noVBand="1" w:val="04A0"/>
+      </w:tblPr>
+      <w:tblGrid>
+        <w:gridCol w:w="15138"/>
+      </w:tblGrid>
+      <w:tr>
+        <w:tc>
+          <w:tcPr>
+            <w:tcW w:type="dxa" w:w="15194"/>
+            <w:shd w:val="clear" w:fill="D9E2F3"/>
+          </w:tcPr>
+          <w:p>
+            <w:r/>
+            <w:r>
+              <w:rPr>
+                <w:rFonts w:ascii="Noto Sans CJK SC" w:hAnsi="Noto Sans CJK SC" w:eastAsia="Noto Sans CJK SC"/>
+                <w:b/>
+                <w:sz w:val="17"/>
+              </w:rPr>
+              <w:t>明确不变的</w:t>
+            </w:r>
+          </w:p>
+        </w:tc>
+      </w:tr>
+      <w:tr>
+        <w:tc>
+          <w:tcPr>
+            <w:tcW w:type="dxa" w:w="15194"/>
+          </w:tcPr>
+          <w:p>
+            <w:pPr>
+              <w:spacing w:after="0"/>
+            </w:pPr>
+            <w:r/>
+            <w:r>
+              <w:rPr>
+                <w:rFonts w:ascii="Noto Sans CJK SC" w:hAnsi="Noto Sans CJK SC" w:eastAsia="Noto Sans CJK SC"/>
+                <w:sz w:val="16"/>
+              </w:rPr>
+              <w:t>选手代码与 mission_program 一行不用改</w:t>
+            </w:r>
+          </w:p>
+        </w:tc>
+      </w:tr>
+      <w:tr>
+        <w:tc>
+          <w:tcPr>
+            <w:tcW w:type="dxa" w:w="15194"/>
+          </w:tcPr>
+          <w:p>
+            <w:pPr>
+              <w:spacing w:after="0"/>
+            </w:pPr>
+            <w:r/>
+            <w:r>
+              <w:rPr>
+                <w:rFonts w:ascii="Noto Sans CJK SC" w:hAnsi="Noto Sans CJK SC" w:eastAsia="Noto Sans CJK SC"/>
+                <w:sz w:val="16"/>
+              </w:rPr>
+              <w:t>GCS 两个起飞按钮都不用改：仿真卡片走后端 /api/sim/{ns}/takeoff（docker exec 连发 3 次 ros2 topic pub），真机面板走前端 rosbridge publishRetried（连发 3 次、间隔 200ms），都仍是直接发话题</w:t>
+            </w:r>
+          </w:p>
+        </w:tc>
+      </w:tr>
+      <w:tr>
+        <w:tc>
+          <w:tcPr>
+            <w:tcW w:type="dxa" w:w="15194"/>
+          </w:tcPr>
+          <w:p>
+            <w:pPr>
+              <w:spacing w:after="0"/>
+            </w:pPr>
+            <w:r/>
+            <w:r>
+              <w:rPr>
+                <w:rFonts w:ascii="Noto Sans CJK SC" w:hAnsi="Noto Sans CJK SC" w:eastAsia="Noto Sans CJK SC"/>
+                <w:sz w:val="16"/>
+              </w:rPr>
+              <w:t>手工调试的 ros2 topic pub /&lt;ns&gt;/takeoff_land 依然有效</w:t>
+            </w:r>
+          </w:p>
+        </w:tc>
+      </w:tr>
+      <w:tr>
+        <w:tc>
+          <w:tcPr>
+            <w:tcW w:type="dxa" w:w="15194"/>
+          </w:tcPr>
+          <w:p>
+            <w:pPr>
+              <w:spacing w:after="0"/>
+            </w:pPr>
+            <w:r/>
+            <w:r>
+              <w:rPr>
+                <w:rFonts w:ascii="Noto Sans CJK SC" w:hAnsi="Noto Sans CJK SC" w:eastAsia="Noto Sans CJK SC"/>
+                <w:sz w:val="16"/>
+              </w:rPr>
+              <w:t>pt4ctrl、takeoff_gate、precision_servo_node 发 LAND 的路径全不受影响</w:t>
+            </w:r>
+          </w:p>
+        </w:tc>
+      </w:tr>
+    </w:tbl>
+    <w:p>
+      <w:pPr>
+        <w:spacing w:after="120"/>
+      </w:pPr>
+    </w:p>
+    <w:p>
+      <w:pPr>
+        <w:spacing w:after="80"/>
+      </w:pPr>
+      <w:r>
+        <w:rPr>
+          <w:rFonts w:ascii="Noto Sans CJK SC" w:hAnsi="Noto Sans CJK SC" w:eastAsia="Noto Sans CJK SC"/>
+          <w:b w:val="0"/>
+          <w:i w:val="0"/>
+          <w:sz w:val="18"/>
+        </w:rPr>
+        <w:t>补充：GCS 容器内 rosbridge 为 2.0.8（镜像内核实），roslibjs 侧对 ROS 2 action 的封装不完整——ActionClient 是 ROS 1 actionlib 时代的设计。真机面板若要改走 action，投入产出比很差。正确做法是让后端（Python，有 rclpy）去调 action，前端仍调后端 HTTP 接口，前端一行不用改。</w:t>
+      </w:r>
+    </w:p>
+    <w:p>
+      <w:pPr>
+        <w:pStyle w:val="Heading2"/>
+      </w:pPr>
+      <w:r>
+        <w:rPr>
+          <w:rFonts w:ascii="Noto Sans CJK SC" w:hAnsi="Noto Sans CJK SC" w:eastAsia="Noto Sans CJK SC"/>
+          <w:sz w:val="22"/>
+        </w:rPr>
+        <w:t>12.4 入口结构：纵向串联，横向双入口</w:t>
+      </w:r>
+    </w:p>
+    <w:p>
+      <w:pPr>
+        <w:spacing w:after="80"/>
+      </w:pPr>
+      <w:r>
+        <w:rPr>
+          <w:rFonts w:ascii="Noto Sans CJK SC" w:hAnsi="Noto Sans CJK SC" w:eastAsia="Noto Sans CJK SC"/>
+          <w:b w:val="0"/>
+          <w:i w:val="0"/>
+          <w:sz w:val="18"/>
+        </w:rPr>
+        <w:t>Action 不是在原通道旁边并一条路，而是走在原通道前面——最终仍落到 takeoff_land，因此飞控侧指令来源始终只有一个，不需要仲裁：</w:t>
+      </w:r>
+    </w:p>
+    <w:p>
+      <w:pPr>
+        <w:spacing w:after="80"/>
+      </w:pPr>
+      <w:r>
+        <w:rPr>
+          <w:rFonts w:ascii="Noto Sans CJK SC" w:hAnsi="Noto Sans CJK SC" w:eastAsia="Noto Sans CJK SC"/>
+          <w:b/>
+          <w:i w:val="0"/>
+          <w:sz w:val="20"/>
+        </w:rPr>
+        <w:t>选手 → action goal → action server（新增层）→ takeoff_land（原通道未变）→ pt4ctrl → 飞控</w:t>
+      </w:r>
+    </w:p>
+    <w:tbl>
+      <w:tblPr>
+        <w:tblStyle w:val="TableGrid"/>
+        <w:tblW w:type="auto" w:w="0"/>
+        <w:jc w:val="center"/>
+        <w:tblLook w:firstColumn="1" w:firstRow="1" w:lastColumn="0" w:lastRow="0" w:noHBand="0" w:noVBand="1" w:val="04A0"/>
+      </w:tblPr>
+      <w:tblGrid>
+        <w:gridCol w:w="5046"/>
+        <w:gridCol w:w="5046"/>
+        <w:gridCol w:w="5046"/>
+      </w:tblGrid>
+      <w:tr>
+        <w:tc>
+          <w:tcPr>
+            <w:tcW w:type="dxa" w:w="2268"/>
+            <w:shd w:val="clear" w:fill="D9E2F3"/>
+          </w:tcPr>
+          <w:p>
+            <w:r/>
+            <w:r>
+              <w:rPr>
+                <w:rFonts w:ascii="Noto Sans CJK SC" w:hAnsi="Noto Sans CJK SC" w:eastAsia="Noto Sans CJK SC"/>
+                <w:b/>
+                <w:sz w:val="17"/>
+              </w:rPr>
+              <w:t>入口</w:t>
+            </w:r>
+          </w:p>
+        </w:tc>
+        <w:tc>
+          <w:tcPr>
+            <w:tcW w:type="dxa" w:w="5329"/>
+            <w:shd w:val="clear" w:fill="D9E2F3"/>
+          </w:tcPr>
+          <w:p>
+            <w:r/>
+            <w:r>
+              <w:rPr>
+                <w:rFonts w:ascii="Noto Sans CJK SC" w:hAnsi="Noto Sans CJK SC" w:eastAsia="Noto Sans CJK SC"/>
+                <w:b/>
+                <w:sz w:val="17"/>
+              </w:rPr>
+              <w:t>谁使用</w:t>
+            </w:r>
+          </w:p>
+        </w:tc>
+        <w:tc>
+          <w:tcPr>
+            <w:tcW w:type="dxa" w:w="7597"/>
+            <w:shd w:val="clear" w:fill="D9E2F3"/>
+          </w:tcPr>
+          <w:p>
+            <w:r/>
+            <w:r>
+              <w:rPr>
+                <w:rFonts w:ascii="Noto Sans CJK SC" w:hAnsi="Noto Sans CJK SC" w:eastAsia="Noto Sans CJK SC"/>
+                <w:b/>
+                <w:sz w:val="17"/>
+              </w:rPr>
+              <w:t>改后</w:t>
+            </w:r>
+          </w:p>
+        </w:tc>
+      </w:tr>
+      <w:tr>
+        <w:tc>
+          <w:tcPr>
+            <w:tcW w:type="dxa" w:w="2268"/>
+          </w:tcPr>
+          <w:p>
+            <w:pPr>
+              <w:spacing w:after="0"/>
+            </w:pPr>
+            <w:r/>
+            <w:r>
+              <w:rPr>
+                <w:rFonts w:ascii="Noto Sans CJK SC" w:hAnsi="Noto Sans CJK SC" w:eastAsia="Noto Sans CJK SC"/>
+                <w:sz w:val="16"/>
+              </w:rPr>
+              <w:t>action</w:t>
+            </w:r>
+          </w:p>
+        </w:tc>
+        <w:tc>
+          <w:tcPr>
+            <w:tcW w:type="dxa" w:w="5329"/>
+          </w:tcPr>
+          <w:p>
+            <w:pPr>
+              <w:spacing w:after="0"/>
+            </w:pPr>
+            <w:r/>
+            <w:r>
+              <w:rPr>
+                <w:rFonts w:ascii="Noto Sans CJK SC" w:hAnsi="Noto Sans CJK SC" w:eastAsia="Noto Sans CJK SC"/>
+                <w:sz w:val="16"/>
+              </w:rPr>
+              <w:t>SDK / 选手程序</w:t>
+            </w:r>
+          </w:p>
+        </w:tc>
+        <w:tc>
+          <w:tcPr>
+            <w:tcW w:type="dxa" w:w="7597"/>
+          </w:tcPr>
+          <w:p>
+            <w:pPr>
+              <w:spacing w:after="0"/>
+            </w:pPr>
+            <w:r/>
+            <w:r>
+              <w:rPr>
+                <w:rFonts w:ascii="Noto Sans CJK SC" w:hAnsi="Noto Sans CJK SC" w:eastAsia="Noto Sans CJK SC"/>
+                <w:sz w:val="16"/>
+              </w:rPr>
+              <w:t>新增；SDK 改走这条，不再直接发话题</w:t>
+            </w:r>
+          </w:p>
+        </w:tc>
+      </w:tr>
+      <w:tr>
+        <w:tc>
+          <w:tcPr>
+            <w:tcW w:type="dxa" w:w="2268"/>
+          </w:tcPr>
+          <w:p>
+            <w:pPr>
+              <w:spacing w:after="0"/>
+            </w:pPr>
+            <w:r/>
+            <w:r>
+              <w:rPr>
+                <w:rFonts w:ascii="Noto Sans CJK SC" w:hAnsi="Noto Sans CJK SC" w:eastAsia="Noto Sans CJK SC"/>
+                <w:sz w:val="16"/>
+              </w:rPr>
+              <w:t>topic</w:t>
+            </w:r>
+          </w:p>
+        </w:tc>
+        <w:tc>
+          <w:tcPr>
+            <w:tcW w:type="dxa" w:w="5329"/>
+          </w:tcPr>
+          <w:p>
+            <w:pPr>
+              <w:spacing w:after="0"/>
+            </w:pPr>
+            <w:r/>
+            <w:r>
+              <w:rPr>
+                <w:rFonts w:ascii="Noto Sans CJK SC" w:hAnsi="Noto Sans CJK SC" w:eastAsia="Noto Sans CJK SC"/>
+                <w:sz w:val="16"/>
+              </w:rPr>
+              <w:t>GCS 两个按钮、手工 ros2 topic pub</w:t>
+            </w:r>
+          </w:p>
+        </w:tc>
+        <w:tc>
+          <w:tcPr>
+            <w:tcW w:type="dxa" w:w="7597"/>
+          </w:tcPr>
+          <w:p>
+            <w:pPr>
+              <w:spacing w:after="0"/>
+            </w:pPr>
+            <w:r/>
+            <w:r>
+              <w:rPr>
+                <w:rFonts w:ascii="Noto Sans CJK SC" w:hAnsi="Noto Sans CJK SC" w:eastAsia="Noto Sans CJK SC"/>
+                <w:sz w:val="16"/>
+              </w:rPr>
+              <w:t>保留不变，作为应急与调试入口</w:t>
+            </w:r>
+          </w:p>
+        </w:tc>
+      </w:tr>
+    </w:tbl>
+    <w:p>
+      <w:pPr>
+        <w:spacing w:after="120"/>
+      </w:pPr>
+    </w:p>
+    <w:tbl>
+      <w:tblPr>
+        <w:tblStyle w:val="TableGrid"/>
+        <w:tblW w:type="auto" w:w="0"/>
+        <w:jc w:val="center"/>
+        <w:tblLook w:firstColumn="1" w:firstRow="1" w:lastColumn="0" w:lastRow="0" w:noHBand="0" w:noVBand="1" w:val="04A0"/>
+      </w:tblPr>
+      <w:tblGrid>
+        <w:gridCol w:w="7569"/>
+        <w:gridCol w:w="7569"/>
+      </w:tblGrid>
+      <w:tr>
+        <w:tc>
+          <w:tcPr>
+            <w:tcW w:type="dxa" w:w="3628"/>
+            <w:shd w:val="clear" w:fill="D9E2F3"/>
+          </w:tcPr>
+          <w:p>
+            <w:r/>
+            <w:r>
+              <w:rPr>
+                <w:rFonts w:ascii="Noto Sans CJK SC" w:hAnsi="Noto Sans CJK SC" w:eastAsia="Noto Sans CJK SC"/>
+                <w:b/>
+                <w:sz w:val="17"/>
+              </w:rPr>
+              <w:t>由此产生的三点影响</w:t>
+            </w:r>
+          </w:p>
+        </w:tc>
+        <w:tc>
+          <w:tcPr>
+            <w:tcW w:type="dxa" w:w="11565"/>
+            <w:shd w:val="clear" w:fill="D9E2F3"/>
+          </w:tcPr>
+          <w:p>
+            <w:r/>
+            <w:r>
+              <w:rPr>
+                <w:rFonts w:ascii="Noto Sans CJK SC" w:hAnsi="Noto Sans CJK SC" w:eastAsia="Noto Sans CJK SC"/>
+                <w:b/>
+                <w:sz w:val="17"/>
+              </w:rPr>
+              <w:t>说明</w:t>
+            </w:r>
+          </w:p>
+        </w:tc>
+      </w:tr>
+      <w:tr>
+        <w:tc>
+          <w:tcPr>
+            <w:tcW w:type="dxa" w:w="3628"/>
+          </w:tcPr>
+          <w:p>
+            <w:pPr>
+              <w:spacing w:after="0"/>
+            </w:pPr>
+            <w:r/>
+            <w:r>
+              <w:rPr>
+                <w:rFonts w:ascii="Noto Sans CJK SC" w:hAnsi="Noto Sans CJK SC" w:eastAsia="Noto Sans CJK SC"/>
+                <w:sz w:val="16"/>
+              </w:rPr>
+              <w:t>action server 是单点，但不致命</w:t>
+            </w:r>
+          </w:p>
+        </w:tc>
+        <w:tc>
+          <w:tcPr>
+            <w:tcW w:type="dxa" w:w="11565"/>
+          </w:tcPr>
+          <w:p>
+            <w:pPr>
+              <w:spacing w:after="0"/>
+            </w:pPr>
+            <w:r/>
+            <w:r>
+              <w:rPr>
+                <w:rFonts w:ascii="Noto Sans CJK SC" w:hAnsi="Noto Sans CJK SC" w:eastAsia="Noto Sans CJK SC"/>
+                <w:sz w:val="16"/>
+              </w:rPr>
+              <w:t>它挂了选手程序起飞失败，但 GCS 入口仍可用，飞机仍能起飞——这正是保留底层入口的价值</w:t>
+            </w:r>
+          </w:p>
+        </w:tc>
+      </w:tr>
+      <w:tr>
+        <w:tc>
+          <w:tcPr>
+            <w:tcW w:type="dxa" w:w="3628"/>
+          </w:tcPr>
+          <w:p>
+            <w:pPr>
+              <w:spacing w:after="0"/>
+            </w:pPr>
+            <w:r/>
+            <w:r>
+              <w:rPr>
+                <w:rFonts w:ascii="Noto Sans CJK SC" w:hAnsi="Noto Sans CJK SC" w:eastAsia="Noto Sans CJK SC"/>
+                <w:sz w:val="16"/>
+              </w:rPr>
+              <w:t>action 无法独占起飞权</w:t>
+            </w:r>
+          </w:p>
+        </w:tc>
+        <w:tc>
+          <w:tcPr>
+            <w:tcW w:type="dxa" w:w="11565"/>
+          </w:tcPr>
+          <w:p>
+            <w:pPr>
+              <w:spacing w:after="0"/>
+            </w:pPr>
+            <w:r/>
+            <w:r>
+              <w:rPr>
+                <w:rFonts w:ascii="Noto Sans CJK SC" w:hAnsi="Noto Sans CJK SC" w:eastAsia="Noto Sans CJK SC"/>
+                <w:sz w:val="16"/>
+              </w:rPr>
+              <w:t>拦不住别人直接发 takeoff_land。要独占须改 pt4ctrl 只认 server 的指令（动 vendor C++，不建议）。server 只能观察并记录外部触发</w:t>
+            </w:r>
+          </w:p>
+        </w:tc>
+      </w:tr>
+      <w:tr>
+        <w:tc>
+          <w:tcPr>
+            <w:tcW w:type="dxa" w:w="3628"/>
+          </w:tcPr>
+          <w:p>
+            <w:pPr>
+              <w:spacing w:after="0"/>
+            </w:pPr>
+            <w:r/>
+            <w:r>
+              <w:rPr>
+                <w:rFonts w:ascii="Noto Sans CJK SC" w:hAnsi="Noto Sans CJK SC" w:eastAsia="Noto Sans CJK SC"/>
+                <w:sz w:val="16"/>
+              </w:rPr>
+              <w:t>多写者问题变得可见</w:t>
+            </w:r>
+          </w:p>
+        </w:tc>
+        <w:tc>
+          <w:tcPr>
+            <w:tcW w:type="dxa" w:w="11565"/>
+          </w:tcPr>
+          <w:p>
+            <w:pPr>
+              <w:spacing w:after="0"/>
+            </w:pPr>
+            <w:r/>
+            <w:r>
+              <w:rPr>
+                <w:rFonts w:ascii="Noto Sans CJK SC" w:hAnsi="Noto Sans CJK SC" w:eastAsia="Noto Sans CJK SC"/>
+                <w:sz w:val="16"/>
+              </w:rPr>
+              <w:t>现有三处都在发 takeoff_land：SDK、GCS 后端、GCS 前端，互不知情。建议 server 也订阅该话题，发现非自己发出的 TAKEOFF 就在结果里标注"期间检测到外部触发"，至少可追溯</w:t>
+            </w:r>
+          </w:p>
+        </w:tc>
+      </w:tr>
+      <w:tr>
+        <w:tc>
+          <w:tcPr>
+            <w:tcW w:type="dxa" w:w="3628"/>
+          </w:tcPr>
+          <w:p>
+            <w:pPr>
+              <w:spacing w:after="0"/>
+            </w:pPr>
+            <w:r/>
+            <w:r>
+              <w:rPr>
+                <w:rFonts w:ascii="Noto Sans CJK SC" w:hAnsi="Noto Sans CJK SC" w:eastAsia="Noto Sans CJK SC"/>
+                <w:sz w:val="16"/>
+              </w:rPr>
+              <w:t>与 do_action 改造性质不同</w:t>
+            </w:r>
+          </w:p>
+        </w:tc>
+        <w:tc>
+          <w:tcPr>
+            <w:tcW w:type="dxa" w:w="11565"/>
+          </w:tcPr>
+          <w:p>
+            <w:pPr>
+              <w:spacing w:after="0"/>
+            </w:pPr>
+            <w:r/>
+            <w:r>
+              <w:rPr>
+                <w:rFonts w:ascii="Noto Sans CJK SC" w:hAnsi="Noto Sans CJK SC" w:eastAsia="Noto Sans CJK SC"/>
+                <w:sz w:val="16"/>
+              </w:rPr>
+              <w:t>do_action 是在同一条通道上加字段（goal_id），通道未变；起飞是在原通道上加一层。前者改动更轻</w:t>
+            </w:r>
+          </w:p>
+        </w:tc>
+      </w:tr>
+    </w:tbl>
+    <w:p>
+      <w:pPr>
+        <w:spacing w:after="120"/>
+      </w:pPr>
+    </w:p>
+    <w:p>
+      <w:pPr>
+        <w:pStyle w:val="Heading2"/>
+      </w:pPr>
+      <w:r>
+        <w:rPr>
+          <w:rFonts w:ascii="Noto Sans CJK SC" w:hAnsi="Noto Sans CJK SC" w:eastAsia="Noto Sans CJK SC"/>
+          <w:sz w:val="22"/>
+        </w:rPr>
+        <w:t>12.5 已落地：do_action 的 goal_id 改造（2026-09-20）</w:t>
+      </w:r>
+    </w:p>
+    <w:tbl>
+      <w:tblPr>
+        <w:tblStyle w:val="TableGrid"/>
+        <w:tblW w:type="auto" w:w="0"/>
+        <w:jc w:val="center"/>
+        <w:tblLook w:firstColumn="1" w:firstRow="1" w:lastColumn="0" w:lastRow="0" w:noHBand="0" w:noVBand="1" w:val="04A0"/>
+      </w:tblPr>
+      <w:tblGrid>
+        <w:gridCol w:w="7569"/>
+        <w:gridCol w:w="7569"/>
+      </w:tblGrid>
+      <w:tr>
+        <w:tc>
+          <w:tcPr>
+            <w:tcW w:type="dxa" w:w="1928"/>
+            <w:shd w:val="clear" w:fill="D9E2F3"/>
+          </w:tcPr>
+          <w:p>
+            <w:r/>
+            <w:r>
+              <w:rPr>
+                <w:rFonts w:ascii="Noto Sans CJK SC" w:hAnsi="Noto Sans CJK SC" w:eastAsia="Noto Sans CJK SC"/>
+                <w:b/>
+                <w:sz w:val="17"/>
+              </w:rPr>
+              <w:t>项</w:t>
+            </w:r>
+          </w:p>
+        </w:tc>
+        <w:tc>
+          <w:tcPr>
+            <w:tcW w:type="dxa" w:w="13266"/>
+            <w:shd w:val="clear" w:fill="D9E2F3"/>
+          </w:tcPr>
+          <w:p>
+            <w:r/>
+            <w:r>
+              <w:rPr>
+                <w:rFonts w:ascii="Noto Sans CJK SC" w:hAnsi="Noto Sans CJK SC" w:eastAsia="Noto Sans CJK SC"/>
+                <w:b/>
+                <w:sz w:val="17"/>
+              </w:rPr>
+              <w:t>内容</w:t>
+            </w:r>
+          </w:p>
+        </w:tc>
+      </w:tr>
+      <w:tr>
+        <w:tc>
+          <w:tcPr>
+            <w:tcW w:type="dxa" w:w="1928"/>
+          </w:tcPr>
+          <w:p>
+            <w:pPr>
+              <w:spacing w:after="0"/>
+            </w:pPr>
+            <w:r/>
+            <w:r>
+              <w:rPr>
+                <w:rFonts w:ascii="Noto Sans CJK SC" w:hAnsi="Noto Sans CJK SC" w:eastAsia="Noto Sans CJK SC"/>
+                <w:sz w:val="16"/>
+              </w:rPr>
+              <w:t>动机</w:t>
+            </w:r>
+          </w:p>
+        </w:tc>
+        <w:tc>
+          <w:tcPr>
+            <w:tcW w:type="dxa" w:w="13266"/>
+          </w:tcPr>
+          <w:p>
+            <w:pPr>
+              <w:spacing w:after="0"/>
+            </w:pPr>
+            <w:r/>
+            <w:r>
+              <w:rPr>
+                <w:rFonts w:ascii="Noto Sans CJK SC" w:hAnsi="Noto Sans CJK SC" w:eastAsia="Noto Sans CJK SC"/>
+                <w:sz w:val="16"/>
+              </w:rPr>
+              <w:t>① 参数重复设成同一值会被当成两次独立触发，grab_supply 可能真的执行两次，而 SDK 为防 DDS 发现没跟上本就有连发防护，两者冲突；② done:&lt;name&gt; 无标识，分不清是本次完成还是上次遗留</w:t>
+            </w:r>
+          </w:p>
+        </w:tc>
+      </w:tr>
+      <w:tr>
+        <w:tc>
+          <w:tcPr>
+            <w:tcW w:type="dxa" w:w="1928"/>
+          </w:tcPr>
+          <w:p>
+            <w:pPr>
+              <w:spacing w:after="0"/>
+            </w:pPr>
+            <w:r/>
+            <w:r>
+              <w:rPr>
+                <w:rFonts w:ascii="Noto Sans CJK SC" w:hAnsi="Noto Sans CJK SC" w:eastAsia="Noto Sans CJK SC"/>
+                <w:sz w:val="16"/>
+              </w:rPr>
+              <w:t>机载侧</w:t>
+            </w:r>
+          </w:p>
+        </w:tc>
+        <w:tc>
+          <w:tcPr>
+            <w:tcW w:type="dxa" w:w="13266"/>
+          </w:tcPr>
+          <w:p>
+            <w:pPr>
+              <w:spacing w:after="0"/>
+            </w:pPr>
+            <w:r/>
+            <w:r>
+              <w:rPr>
+                <w:rFonts w:ascii="Noto Sans CJK SC" w:hAnsi="Noto Sans CJK SC" w:eastAsia="Noto Sans CJK SC"/>
+                <w:sz w:val="16"/>
+              </w:rPr>
+              <w:t>新增 action_goal_id 参数；状态格式扩展为 &lt;kind&gt;:&lt;name&gt;:&lt;goal_id&gt;；同一 goal_id 执行中→重播 running，已完成→重播该次 done（有界 FIFO 存最近 32 个）；busy → rejected:...:busy；未知动作 → rejected:...:unknown_action</w:t>
+            </w:r>
+          </w:p>
+        </w:tc>
+      </w:tr>
+      <w:tr>
+        <w:tc>
+          <w:tcPr>
+            <w:tcW w:type="dxa" w:w="1928"/>
+          </w:tcPr>
+          <w:p>
+            <w:pPr>
+              <w:spacing w:after="0"/>
+            </w:pPr>
+            <w:r/>
+            <w:r>
+              <w:rPr>
+                <w:rFonts w:ascii="Noto Sans CJK SC" w:hAnsi="Noto Sans CJK SC" w:eastAsia="Noto Sans CJK SC"/>
+                <w:sz w:val="16"/>
+              </w:rPr>
+              <w:t>SDK 侧</w:t>
+            </w:r>
+          </w:p>
+        </w:tc>
+        <w:tc>
+          <w:tcPr>
+            <w:tcW w:type="dxa" w:w="13266"/>
+          </w:tcPr>
+          <w:p>
+            <w:pPr>
+              <w:spacing w:after="0"/>
+            </w:pPr>
+            <w:r/>
+            <w:r>
+              <w:rPr>
+                <w:rFonts w:ascii="Noto Sans CJK SC" w:hAnsi="Noto Sans CJK SC" w:eastAsia="Noto Sans CJK SC"/>
+                <w:sz w:val="16"/>
+              </w:rPr>
+              <w:t>每次调用生成 &lt;namespace&gt;-&lt;name&gt;-&lt;序号&gt;，与 action_name 同批下发；完成判据兼容带/不带 goal_id 两种格式；收到 rejected 立刻抛 ActionFailedError，不再干等到超时</w:t>
+            </w:r>
+          </w:p>
+        </w:tc>
+      </w:tr>
+      <w:tr>
+        <w:tc>
+          <w:tcPr>
+            <w:tcW w:type="dxa" w:w="1928"/>
+          </w:tcPr>
+          <w:p>
+            <w:pPr>
+              <w:spacing w:after="0"/>
+            </w:pPr>
+            <w:r/>
+            <w:r>
+              <w:rPr>
+                <w:rFonts w:ascii="Noto Sans CJK SC" w:hAnsi="Noto Sans CJK SC" w:eastAsia="Noto Sans CJK SC"/>
+                <w:sz w:val="16"/>
+              </w:rPr>
+              <w:t>实现要点</w:t>
+            </w:r>
+          </w:p>
+        </w:tc>
+        <w:tc>
+          <w:tcPr>
+            <w:tcW w:type="dxa" w:w="13266"/>
+          </w:tcPr>
+          <w:p>
+            <w:pPr>
+              <w:spacing w:after="0"/>
+            </w:pPr>
+            <w:r/>
+            <w:r>
+              <w:rPr>
+                <w:rFonts w:ascii="Noto Sans CJK SC" w:hAnsi="Noto Sans CJK SC" w:eastAsia="Noto Sans CJK SC"/>
+                <w:sz w:val="16"/>
+              </w:rPr>
+              <w:t>参数回调是"设置前"的校验回调，goal_id 必须从传入的 params 批次里取；用 self.get_parameter() 拿到的是旧值</w:t>
+            </w:r>
+          </w:p>
+        </w:tc>
+      </w:tr>
+      <w:tr>
+        <w:tc>
+          <w:tcPr>
+            <w:tcW w:type="dxa" w:w="1928"/>
+          </w:tcPr>
+          <w:p>
+            <w:pPr>
+              <w:spacing w:after="0"/>
+            </w:pPr>
+            <w:r/>
+            <w:r>
+              <w:rPr>
+                <w:rFonts w:ascii="Noto Sans CJK SC" w:hAnsi="Noto Sans CJK SC" w:eastAsia="Noto Sans CJK SC"/>
+                <w:sz w:val="16"/>
+              </w:rPr>
+              <w:t>兼容性</w:t>
+            </w:r>
+          </w:p>
+        </w:tc>
+        <w:tc>
+          <w:tcPr>
+            <w:tcW w:type="dxa" w:w="13266"/>
+          </w:tcPr>
+          <w:p>
+            <w:pPr>
+              <w:spacing w:after="0"/>
+            </w:pPr>
+            <w:r/>
+            <w:r>
+              <w:rPr>
+                <w:rFonts w:ascii="Noto Sans CJK SC" w:hAnsi="Noto Sans CJK SC" w:eastAsia="Noto Sans CJK SC"/>
+                <w:sz w:val="16"/>
+              </w:rPr>
+              <w:t>goal_id 为空时格式与行为跟改造前完全一致，因此两个镜像可分开重建</w:t>
+            </w:r>
+          </w:p>
+        </w:tc>
+      </w:tr>
+      <w:tr>
+        <w:tc>
+          <w:tcPr>
+            <w:tcW w:type="dxa" w:w="1928"/>
+          </w:tcPr>
+          <w:p>
+            <w:pPr>
+              <w:spacing w:after="0"/>
+            </w:pPr>
+            <w:r/>
+            <w:r>
+              <w:rPr>
+                <w:rFonts w:ascii="Noto Sans CJK SC" w:hAnsi="Noto Sans CJK SC" w:eastAsia="Noto Sans CJK SC"/>
+                <w:sz w:val="16"/>
+              </w:rPr>
+              <w:t>验证</w:t>
+            </w:r>
+          </w:p>
+        </w:tc>
+        <w:tc>
+          <w:tcPr>
+            <w:tcW w:type="dxa" w:w="13266"/>
+          </w:tcPr>
+          <w:p>
+            <w:pPr>
+              <w:spacing w:after="0"/>
+            </w:pPr>
+            <w:r/>
+            <w:r>
+              <w:rPr>
+                <w:rFonts w:ascii="Noto Sans CJK SC" w:hAnsi="Noto Sans CJK SC" w:eastAsia="Noto Sans CJK SC"/>
+                <w:sz w:val="16"/>
+              </w:rPr>
+              <w:t>test_actuator_goal_id.py：用桩件替掉 rclpy，不依赖 ROS 运行时，9 项断言覆盖重复下发、完成后重播、busy 拒绝、未知动作、老调用方兼容</w:t>
+            </w:r>
+          </w:p>
+        </w:tc>
+      </w:tr>
+      <w:tr>
+        <w:tc>
+          <w:tcPr>
+            <w:tcW w:type="dxa" w:w="1928"/>
+          </w:tcPr>
+          <w:p>
+            <w:pPr>
+              <w:spacing w:after="0"/>
+            </w:pPr>
+            <w:r/>
+            <w:r>
+              <w:rPr>
+                <w:rFonts w:ascii="Noto Sans CJK SC" w:hAnsi="Noto Sans CJK SC" w:eastAsia="Noto Sans CJK SC"/>
+                <w:sz w:val="16"/>
+              </w:rPr>
+              <w:t>生效条件</w:t>
+            </w:r>
+          </w:p>
+        </w:tc>
+        <w:tc>
+          <w:tcPr>
+            <w:tcW w:type="dxa" w:w="13266"/>
+          </w:tcPr>
+          <w:p>
+            <w:pPr>
+              <w:spacing w:after="0"/>
+            </w:pPr>
+            <w:r/>
+            <w:r>
+              <w:rPr>
+                <w:rFonts w:ascii="Noto Sans CJK SC" w:hAnsi="Noto Sans CJK SC" w:eastAsia="Noto Sans CJK SC"/>
+                <w:sz w:val="16"/>
+              </w:rPr>
+              <w:t>flight-stack 与 contestant-sdk 两个镜像都需重新 build</w:t>
+            </w:r>
+          </w:p>
+        </w:tc>
+      </w:tr>
+      <w:tr>
+        <w:tc>
+          <w:tcPr>
+            <w:tcW w:type="dxa" w:w="1928"/>
+          </w:tcPr>
+          <w:p>
+            <w:pPr>
+              <w:spacing w:after="0"/>
+            </w:pPr>
+            <w:r/>
+            <w:r>
+              <w:rPr>
+                <w:rFonts w:ascii="Noto Sans CJK SC" w:hAnsi="Noto Sans CJK SC" w:eastAsia="Noto Sans CJK SC"/>
+                <w:sz w:val="16"/>
+              </w:rPr>
+              <w:t>仍未解决</w:t>
+            </w:r>
+          </w:p>
+        </w:tc>
+        <w:tc>
+          <w:tcPr>
+            <w:tcW w:type="dxa" w:w="13266"/>
+          </w:tcPr>
+          <w:p>
+            <w:pPr>
+              <w:spacing w:after="0"/>
+            </w:pPr>
+            <w:r/>
+            <w:r>
+              <w:rPr>
+                <w:rFonts w:ascii="Noto Sans CJK SC" w:hAnsi="Noto Sans CJK SC" w:eastAsia="Noto Sans CJK SC"/>
+                <w:sz w:val="16"/>
+              </w:rPr>
+              <w:t>RC 通道 / PWM / 保持时长仍为占位值（通道 9、PWM 2000、1 秒），等硬件接线确认</w:t>
+            </w:r>
+          </w:p>
+        </w:tc>
+      </w:tr>
+    </w:tbl>
+    <w:p>
+      <w:pPr>
+        <w:spacing w:after="120"/>
+      </w:pPr>
+    </w:p>
+    <w:p>
+      <w:pPr>
+        <w:pStyle w:val="Heading2"/>
+      </w:pPr>
+      <w:r>
+        <w:rPr>
+          <w:rFonts w:ascii="Noto Sans CJK SC" w:hAnsi="Noto Sans CJK SC" w:eastAsia="Noto Sans CJK SC"/>
+          <w:sz w:val="22"/>
+        </w:rPr>
+        <w:t>12.6 推进顺序建议</w:t>
+      </w:r>
+    </w:p>
+    <w:tbl>
+      <w:tblPr>
+        <w:tblStyle w:val="TableGrid"/>
+        <w:tblW w:type="auto" w:w="0"/>
+        <w:jc w:val="center"/>
+        <w:tblLook w:firstColumn="1" w:firstRow="1" w:lastColumn="0" w:lastRow="0" w:noHBand="0" w:noVBand="1" w:val="04A0"/>
+      </w:tblPr>
+      <w:tblGrid>
+        <w:gridCol w:w="5046"/>
+        <w:gridCol w:w="5046"/>
+        <w:gridCol w:w="5046"/>
+      </w:tblGrid>
+      <w:tr>
+        <w:tc>
+          <w:tcPr>
+            <w:tcW w:type="dxa" w:w="2041"/>
+            <w:shd w:val="clear" w:fill="D9E2F3"/>
+          </w:tcPr>
+          <w:p>
+            <w:r/>
+            <w:r>
+              <w:rPr>
+                <w:rFonts w:ascii="Noto Sans CJK SC" w:hAnsi="Noto Sans CJK SC" w:eastAsia="Noto Sans CJK SC"/>
+                <w:b/>
+                <w:sz w:val="17"/>
+              </w:rPr>
+              <w:t>阶段</w:t>
+            </w:r>
+          </w:p>
+        </w:tc>
+        <w:tc>
+          <w:tcPr>
+            <w:tcW w:type="dxa" w:w="5329"/>
+            <w:shd w:val="clear" w:fill="D9E2F3"/>
+          </w:tcPr>
+          <w:p>
+            <w:r/>
+            <w:r>
+              <w:rPr>
+                <w:rFonts w:ascii="Noto Sans CJK SC" w:hAnsi="Noto Sans CJK SC" w:eastAsia="Noto Sans CJK SC"/>
+                <w:b/>
+                <w:sz w:val="17"/>
+              </w:rPr>
+              <w:t>做什么</w:t>
+            </w:r>
+          </w:p>
+        </w:tc>
+        <w:tc>
+          <w:tcPr>
+            <w:tcW w:type="dxa" w:w="7824"/>
+            <w:shd w:val="clear" w:fill="D9E2F3"/>
+          </w:tcPr>
+          <w:p>
+            <w:r/>
+            <w:r>
+              <w:rPr>
+                <w:rFonts w:ascii="Noto Sans CJK SC" w:hAnsi="Noto Sans CJK SC" w:eastAsia="Noto Sans CJK SC"/>
+                <w:b/>
+                <w:sz w:val="17"/>
+              </w:rPr>
+              <w:t>理由</w:t>
+            </w:r>
+          </w:p>
+        </w:tc>
+      </w:tr>
+      <w:tr>
+        <w:tc>
+          <w:tcPr>
+            <w:tcW w:type="dxa" w:w="2041"/>
+          </w:tcPr>
+          <w:p>
+            <w:pPr>
+              <w:spacing w:after="0"/>
+            </w:pPr>
+            <w:r/>
+            <w:r>
+              <w:rPr>
+                <w:rFonts w:ascii="Noto Sans CJK SC" w:hAnsi="Noto Sans CJK SC" w:eastAsia="Noto Sans CJK SC"/>
+                <w:sz w:val="16"/>
+              </w:rPr>
+              <w:t>已完成</w:t>
+            </w:r>
+          </w:p>
+        </w:tc>
+        <w:tc>
+          <w:tcPr>
+            <w:tcW w:type="dxa" w:w="5329"/>
+          </w:tcPr>
+          <w:p>
+            <w:pPr>
+              <w:spacing w:after="0"/>
+            </w:pPr>
+            <w:r/>
+            <w:r>
+              <w:rPr>
+                <w:rFonts w:ascii="Noto Sans CJK SC" w:hAnsi="Noto Sans CJK SC" w:eastAsia="Noto Sans CJK SC"/>
+                <w:sz w:val="16"/>
+              </w:rPr>
+              <w:t>do_action 补 goal_id 与结果关联</w:t>
+            </w:r>
+          </w:p>
+        </w:tc>
+        <w:tc>
+          <w:tcPr>
+            <w:tcW w:type="dxa" w:w="7824"/>
+          </w:tcPr>
+          <w:p>
+            <w:pPr>
+              <w:spacing w:after="0"/>
+            </w:pPr>
+            <w:r/>
+            <w:r>
+              <w:rPr>
+                <w:rFonts w:ascii="Noto Sans CJK SC" w:hAnsi="Noto Sans CJK SC" w:eastAsia="Noto Sans CJK SC"/>
+                <w:sz w:val="16"/>
+              </w:rPr>
+              <w:t>改动最轻（同通道加字段），且该能力因硬件映射未定本就要再动</w:t>
+            </w:r>
+          </w:p>
+        </w:tc>
+      </w:tr>
+      <w:tr>
+        <w:tc>
+          <w:tcPr>
+            <w:tcW w:type="dxa" w:w="2041"/>
+          </w:tcPr>
+          <w:p>
+            <w:pPr>
+              <w:spacing w:after="0"/>
+            </w:pPr>
+            <w:r/>
+            <w:r>
+              <w:rPr>
+                <w:rFonts w:ascii="Noto Sans CJK SC" w:hAnsi="Noto Sans CJK SC" w:eastAsia="Noto Sans CJK SC"/>
+                <w:sz w:val="16"/>
+              </w:rPr>
+              <w:t>E 阶段之后</w:t>
+            </w:r>
+          </w:p>
+        </w:tc>
+        <w:tc>
+          <w:tcPr>
+            <w:tcW w:type="dxa" w:w="5329"/>
+          </w:tcPr>
+          <w:p>
+            <w:pPr>
+              <w:spacing w:after="0"/>
+            </w:pPr>
+            <w:r/>
+            <w:r>
+              <w:rPr>
+                <w:rFonts w:ascii="Noto Sans CJK SC" w:hAnsi="Noto Sans CJK SC" w:eastAsia="Noto Sans CJK SC"/>
+                <w:sz w:val="16"/>
+              </w:rPr>
+              <w:t>在 do_action 上试点完整 Action</w:t>
+            </w:r>
+          </w:p>
+        </w:tc>
+        <w:tc>
+          <w:tcPr>
+            <w:tcW w:type="dxa" w:w="7824"/>
+          </w:tcPr>
+          <w:p>
+            <w:pPr>
+              <w:spacing w:after="0"/>
+            </w:pPr>
+            <w:r/>
+            <w:r>
+              <w:rPr>
+                <w:rFonts w:ascii="Noto Sans CJK SC" w:hAnsi="Noto Sans CJK SC" w:eastAsia="Noto Sans CJK SC"/>
+                <w:sz w:val="16"/>
+              </w:rPr>
+              <w:t>用一次必要的改动同时验证新机制</w:t>
+            </w:r>
+          </w:p>
+        </w:tc>
+      </w:tr>
+      <w:tr>
+        <w:tc>
+          <w:tcPr>
+            <w:tcW w:type="dxa" w:w="2041"/>
+          </w:tcPr>
+          <w:p>
+            <w:pPr>
+              <w:spacing w:after="0"/>
+            </w:pPr>
+            <w:r/>
+            <w:r>
+              <w:rPr>
+                <w:rFonts w:ascii="Noto Sans CJK SC" w:hAnsi="Noto Sans CJK SC" w:eastAsia="Noto Sans CJK SC"/>
+                <w:sz w:val="16"/>
+              </w:rPr>
+              <w:t>赛后</w:t>
+            </w:r>
+          </w:p>
+        </w:tc>
+        <w:tc>
+          <w:tcPr>
+            <w:tcW w:type="dxa" w:w="5329"/>
+          </w:tcPr>
+          <w:p>
+            <w:pPr>
+              <w:spacing w:after="0"/>
+            </w:pPr>
+            <w:r/>
+            <w:r>
+              <w:rPr>
+                <w:rFonts w:ascii="Noto Sans CJK SC" w:hAnsi="Noto Sans CJK SC" w:eastAsia="Noto Sans CJK SC"/>
+                <w:sz w:val="16"/>
+              </w:rPr>
+              <w:t>推广到 goto、编队跟随，最后是起飞</w:t>
+            </w:r>
+          </w:p>
+        </w:tc>
+        <w:tc>
+          <w:tcPr>
+            <w:tcW w:type="dxa" w:w="7824"/>
+          </w:tcPr>
+          <w:p>
+            <w:pPr>
+              <w:spacing w:after="0"/>
+            </w:pPr>
+            <w:r/>
+            <w:r>
+              <w:rPr>
+                <w:rFonts w:ascii="Noto Sans CJK SC" w:hAnsi="Noto Sans CJK SC" w:eastAsia="Noto Sans CJK SC"/>
+                <w:sz w:val="16"/>
+              </w:rPr>
+              <w:t>起飞是所有测试的入口，D3 尚未验收通过，此时换机制会让"失败是新机制还是任务逻辑"难以区分</w:t>
+            </w:r>
+          </w:p>
+        </w:tc>
+      </w:tr>
+      <w:tr>
+        <w:tc>
+          <w:tcPr>
+            <w:tcW w:type="dxa" w:w="2041"/>
+          </w:tcPr>
+          <w:p>
+            <w:pPr>
+              <w:spacing w:after="0"/>
+            </w:pPr>
+            <w:r/>
+            <w:r>
+              <w:rPr>
+                <w:rFonts w:ascii="Noto Sans CJK SC" w:hAnsi="Noto Sans CJK SC" w:eastAsia="Noto Sans CJK SC"/>
+                <w:sz w:val="16"/>
+              </w:rPr>
+              <w:t>可选的零风险先行步</w:t>
+            </w:r>
+          </w:p>
+        </w:tc>
+        <w:tc>
+          <w:tcPr>
+            <w:tcW w:type="dxa" w:w="5329"/>
+          </w:tcPr>
+          <w:p>
+            <w:pPr>
+              <w:spacing w:after="0"/>
+            </w:pPr>
+            <w:r/>
+            <w:r>
+              <w:rPr>
+                <w:rFonts w:ascii="Noto Sans CJK SC" w:hAnsi="Noto Sans CJK SC" w:eastAsia="Noto Sans CJK SC"/>
+                <w:sz w:val="16"/>
+              </w:rPr>
+              <w:t>只加 takeoff action server，SDK 与 GCS 都先不切换</w:t>
+            </w:r>
+          </w:p>
+        </w:tc>
+        <w:tc>
+          <w:tcPr>
+            <w:tcW w:type="dxa" w:w="7824"/>
+          </w:tcPr>
+          <w:p>
+            <w:pPr>
+              <w:spacing w:after="0"/>
+            </w:pPr>
+            <w:r/>
+            <w:r>
+              <w:rPr>
+                <w:rFonts w:ascii="Noto Sans CJK SC" w:hAnsi="Noto Sans CJK SC" w:eastAsia="Noto Sans CJK SC"/>
+                <w:sz w:val="16"/>
+              </w:rPr>
+              <w:t>server 跑起来但无人使用，先验证它判定起飞完成的准确性与现有客户端判定是否一致；不影响任何现有路径，可随时回退</w:t>
             </w:r>
           </w:p>
         </w:tc>

</xml_diff>

<commit_message>
docs: add chapters 13-15 (mechanism scoping, remaining task timing, placement methodology)
文档由 17 页增至 23 页，新增三章：

- 十三、链路 A 上哪些能力该用 Action：提出"确认的三种强度"（收到了 /
  生效了 / 做完了），指出对瞬时操作三者是同一件事、一次 service 往返即
  可覆盖，只有三者分离时才需要 Action。据此把链路 A 能力分四类：6 个
  指挥飞行能力用 Action，瞬时状态变更用 service/参数，读取用订阅，航点
  生成是纯本地计算。附"不能全上 Action"的端点数量测算，以及
  set_camera_view 这个反向例子（判据是"失败了要不要处置"而非"有没有
  过程"）

- 十四、其余任务的时序分析：补齐 D5/D6/收尾的双机时序。D5 是单向通知 +
  双机并发（RECON 广播完坐标立刻回自己的搜索流程，不等 SUPPLY）；D6 是
  三次握手严格串行，t2 处 RECON 阻塞等 supply_ready（代码核实为
  inbox.wait_for 带超时），是整个任务里唯一一处等待队友的地方；附并发与
  等待关系总览，以及每条消息丢失的后果

- 十五、方法论：从时序推导代码归属。对每条回路问三个问题（周期/延迟
  预算、数据量、断链是否必须继续），其中第三条最具决定性——控制回路断链
  必须继续，任务决策断链可以悬停等待。把时序里的 11 条回路逐条过一遍给
  出归属，并指出三处边界模糊：takeoff 完成判定仍在客户端、编队完成判定
  是"近似判定"、pillar_candidates 的"死代码"说法应修正。最后给出推论：
  接口边界应当落在回路之外

顺带修掉一处渲染瑕疵：正文里残留的 markdown ** 强调标记会被 docx 原样
显示，已在生成器里统一清理。

Co-Authored-By: Claude Opus 5 <noreply@anthropic.com>
</commit_message>
<xml_diff>
--- a/模块运行位置与消息流转设计表.docx
+++ b/模块运行位置与消息流转设计表.docx
@@ -20823,6 +20823,4812 @@
       <w:pPr>
         <w:spacing w:after="120"/>
       </w:pPr>
+    </w:p>
+    <w:p>
+      <w:r>
+        <w:br w:type="page"/>
+      </w:r>
+    </w:p>
+    <w:p>
+      <w:pPr>
+        <w:pStyle w:val="Heading1"/>
+      </w:pPr>
+      <w:r>
+        <w:rPr>
+          <w:rFonts w:ascii="Noto Sans CJK SC" w:hAnsi="Noto Sans CJK SC" w:eastAsia="Noto Sans CJK SC"/>
+          <w:sz w:val="28"/>
+        </w:rPr>
+        <w:t>十三、链路 A 上哪些能力该用 Action：确认强度分类法</w:t>
+      </w:r>
+    </w:p>
+    <w:p>
+      <w:pPr>
+        <w:spacing w:after="80"/>
+      </w:pPr>
+      <w:r>
+        <w:rPr>
+          <w:rFonts w:ascii="Noto Sans CJK SC" w:hAnsi="Noto Sans CJK SC" w:eastAsia="Noto Sans CJK SC"/>
+          <w:b w:val="0"/>
+          <w:i w:val="0"/>
+          <w:sz w:val="18"/>
+        </w:rPr>
+        <w:t>常见误区是"既然要确定执行，就都该用 Action"。但"要确定执行"与"必须用 Action"不是一回事——确认有三种强度。</w:t>
+      </w:r>
+    </w:p>
+    <w:p>
+      <w:pPr>
+        <w:pStyle w:val="Heading2"/>
+      </w:pPr>
+      <w:r>
+        <w:rPr>
+          <w:rFonts w:ascii="Noto Sans CJK SC" w:hAnsi="Noto Sans CJK SC" w:eastAsia="Noto Sans CJK SC"/>
+          <w:sz w:val="22"/>
+        </w:rPr>
+        <w:t>13.1 确认的三种强度</w:t>
+      </w:r>
+    </w:p>
+    <w:tbl>
+      <w:tblPr>
+        <w:tblStyle w:val="TableGrid"/>
+        <w:tblW w:type="auto" w:w="0"/>
+        <w:jc w:val="center"/>
+        <w:tblLook w:firstColumn="1" w:firstRow="1" w:lastColumn="0" w:lastRow="0" w:noHBand="0" w:noVBand="1" w:val="04A0"/>
+      </w:tblPr>
+      <w:tblGrid>
+        <w:gridCol w:w="3784"/>
+        <w:gridCol w:w="3784"/>
+        <w:gridCol w:w="3784"/>
+        <w:gridCol w:w="3784"/>
+      </w:tblGrid>
+      <w:tr>
+        <w:tc>
+          <w:tcPr>
+            <w:tcW w:type="dxa" w:w="1701"/>
+            <w:shd w:val="clear" w:fill="D9E2F3"/>
+          </w:tcPr>
+          <w:p>
+            <w:r/>
+            <w:r>
+              <w:rPr>
+                <w:rFonts w:ascii="Noto Sans CJK SC" w:hAnsi="Noto Sans CJK SC" w:eastAsia="Noto Sans CJK SC"/>
+                <w:b/>
+                <w:sz w:val="17"/>
+              </w:rPr>
+              <w:t>强度</w:t>
+            </w:r>
+          </w:p>
+        </w:tc>
+        <w:tc>
+          <w:tcPr>
+            <w:tcW w:type="dxa" w:w="3402"/>
+            <w:shd w:val="clear" w:fill="D9E2F3"/>
+          </w:tcPr>
+          <w:p>
+            <w:r/>
+            <w:r>
+              <w:rPr>
+                <w:rFonts w:ascii="Noto Sans CJK SC" w:hAnsi="Noto Sans CJK SC" w:eastAsia="Noto Sans CJK SC"/>
+                <w:b/>
+                <w:sz w:val="17"/>
+              </w:rPr>
+              <w:t>含义</w:t>
+            </w:r>
+          </w:p>
+        </w:tc>
+        <w:tc>
+          <w:tcPr>
+            <w:tcW w:type="dxa" w:w="4195"/>
+            <w:shd w:val="clear" w:fill="D9E2F3"/>
+          </w:tcPr>
+          <w:p>
+            <w:r/>
+            <w:r>
+              <w:rPr>
+                <w:rFonts w:ascii="Noto Sans CJK SC" w:hAnsi="Noto Sans CJK SC" w:eastAsia="Noto Sans CJK SC"/>
+                <w:b/>
+                <w:sz w:val="17"/>
+              </w:rPr>
+              <w:t>够用的机制</w:t>
+            </w:r>
+          </w:p>
+        </w:tc>
+        <w:tc>
+          <w:tcPr>
+            <w:tcW w:type="dxa" w:w="5896"/>
+            <w:shd w:val="clear" w:fill="D9E2F3"/>
+          </w:tcPr>
+          <w:p>
+            <w:r/>
+            <w:r>
+              <w:rPr>
+                <w:rFonts w:ascii="Noto Sans CJK SC" w:hAnsi="Noto Sans CJK SC" w:eastAsia="Noto Sans CJK SC"/>
+                <w:b/>
+                <w:sz w:val="17"/>
+              </w:rPr>
+              <w:t>本项目例子</w:t>
+            </w:r>
+          </w:p>
+        </w:tc>
+      </w:tr>
+      <w:tr>
+        <w:tc>
+          <w:tcPr>
+            <w:tcW w:type="dxa" w:w="1701"/>
+          </w:tcPr>
+          <w:p>
+            <w:pPr>
+              <w:spacing w:after="0"/>
+            </w:pPr>
+            <w:r/>
+            <w:r>
+              <w:rPr>
+                <w:rFonts w:ascii="Noto Sans CJK SC" w:hAnsi="Noto Sans CJK SC" w:eastAsia="Noto Sans CJK SC"/>
+                <w:sz w:val="16"/>
+              </w:rPr>
+              <w:t>收到了</w:t>
+            </w:r>
+          </w:p>
+        </w:tc>
+        <w:tc>
+          <w:tcPr>
+            <w:tcW w:type="dxa" w:w="3402"/>
+          </w:tcPr>
+          <w:p>
+            <w:pPr>
+              <w:spacing w:after="0"/>
+            </w:pPr>
+            <w:r/>
+            <w:r>
+              <w:rPr>
+                <w:rFonts w:ascii="Noto Sans CJK SC" w:hAnsi="Noto Sans CJK SC" w:eastAsia="Noto Sans CJK SC"/>
+                <w:sz w:val="16"/>
+              </w:rPr>
+              <w:t>对方拿到指令了</w:t>
+            </w:r>
+          </w:p>
+        </w:tc>
+        <w:tc>
+          <w:tcPr>
+            <w:tcW w:type="dxa" w:w="4195"/>
+          </w:tcPr>
+          <w:p>
+            <w:pPr>
+              <w:spacing w:after="0"/>
+            </w:pPr>
+            <w:r/>
+            <w:r>
+              <w:rPr>
+                <w:rFonts w:ascii="Noto Sans CJK SC" w:hAnsi="Noto Sans CJK SC" w:eastAsia="Noto Sans CJK SC"/>
+                <w:sz w:val="16"/>
+              </w:rPr>
+              <w:t>service 一次往返</w:t>
+            </w:r>
+          </w:p>
+        </w:tc>
+        <w:tc>
+          <w:tcPr>
+            <w:tcW w:type="dxa" w:w="5896"/>
+          </w:tcPr>
+          <w:p>
+            <w:pPr>
+              <w:spacing w:after="0"/>
+            </w:pPr>
+            <w:r/>
+            <w:r>
+              <w:rPr>
+                <w:rFonts w:ascii="Noto Sans CJK SC" w:hAnsi="Noto Sans CJK SC" w:eastAsia="Noto Sans CJK SC"/>
+                <w:sz w:val="16"/>
+              </w:rPr>
+              <w:t>reset_aim（Trigger service）</w:t>
+            </w:r>
+          </w:p>
+        </w:tc>
+      </w:tr>
+      <w:tr>
+        <w:tc>
+          <w:tcPr>
+            <w:tcW w:type="dxa" w:w="1701"/>
+          </w:tcPr>
+          <w:p>
+            <w:pPr>
+              <w:spacing w:after="0"/>
+            </w:pPr>
+            <w:r/>
+            <w:r>
+              <w:rPr>
+                <w:rFonts w:ascii="Noto Sans CJK SC" w:hAnsi="Noto Sans CJK SC" w:eastAsia="Noto Sans CJK SC"/>
+                <w:sz w:val="16"/>
+              </w:rPr>
+              <w:t>生效了</w:t>
+            </w:r>
+          </w:p>
+        </w:tc>
+        <w:tc>
+          <w:tcPr>
+            <w:tcW w:type="dxa" w:w="3402"/>
+          </w:tcPr>
+          <w:p>
+            <w:pPr>
+              <w:spacing w:after="0"/>
+            </w:pPr>
+            <w:r/>
+            <w:r>
+              <w:rPr>
+                <w:rFonts w:ascii="Noto Sans CJK SC" w:hAnsi="Noto Sans CJK SC" w:eastAsia="Noto Sans CJK SC"/>
+                <w:sz w:val="16"/>
+              </w:rPr>
+              <w:t>状态真的变了，可读回验证</w:t>
+            </w:r>
+          </w:p>
+        </w:tc>
+        <w:tc>
+          <w:tcPr>
+            <w:tcW w:type="dxa" w:w="4195"/>
+          </w:tcPr>
+          <w:p>
+            <w:pPr>
+              <w:spacing w:after="0"/>
+            </w:pPr>
+            <w:r/>
+            <w:r>
+              <w:rPr>
+                <w:rFonts w:ascii="Noto Sans CJK SC" w:hAnsi="Noto Sans CJK SC" w:eastAsia="Noto Sans CJK SC"/>
+                <w:sz w:val="16"/>
+              </w:rPr>
+              <w:t>service / 参数 + 状态话题读回</w:t>
+            </w:r>
+          </w:p>
+        </w:tc>
+        <w:tc>
+          <w:tcPr>
+            <w:tcW w:type="dxa" w:w="5896"/>
+          </w:tcPr>
+          <w:p>
+            <w:pPr>
+              <w:spacing w:after="0"/>
+            </w:pPr>
+            <w:r/>
+            <w:r>
+              <w:rPr>
+                <w:rFonts w:ascii="Noto Sans CJK SC" w:hAnsi="Noto Sans CJK SC" w:eastAsia="Noto Sans CJK SC"/>
+                <w:sz w:val="16"/>
+              </w:rPr>
+              <w:t>relay_mode 切换、set_yaw_mode_*</w:t>
+            </w:r>
+          </w:p>
+        </w:tc>
+      </w:tr>
+      <w:tr>
+        <w:tc>
+          <w:tcPr>
+            <w:tcW w:type="dxa" w:w="1701"/>
+          </w:tcPr>
+          <w:p>
+            <w:pPr>
+              <w:spacing w:after="0"/>
+            </w:pPr>
+            <w:r/>
+            <w:r>
+              <w:rPr>
+                <w:rFonts w:ascii="Noto Sans CJK SC" w:hAnsi="Noto Sans CJK SC" w:eastAsia="Noto Sans CJK SC"/>
+                <w:sz w:val="16"/>
+              </w:rPr>
+              <w:t>做完了</w:t>
+            </w:r>
+          </w:p>
+        </w:tc>
+        <w:tc>
+          <w:tcPr>
+            <w:tcW w:type="dxa" w:w="3402"/>
+          </w:tcPr>
+          <w:p>
+            <w:pPr>
+              <w:spacing w:after="0"/>
+            </w:pPr>
+            <w:r/>
+            <w:r>
+              <w:rPr>
+                <w:rFonts w:ascii="Noto Sans CJK SC" w:hAnsi="Noto Sans CJK SC" w:eastAsia="Noto Sans CJK SC"/>
+                <w:sz w:val="16"/>
+              </w:rPr>
+              <w:t>一个有过程的动作执行完毕</w:t>
+            </w:r>
+          </w:p>
+        </w:tc>
+        <w:tc>
+          <w:tcPr>
+            <w:tcW w:type="dxa" w:w="4195"/>
+          </w:tcPr>
+          <w:p>
+            <w:pPr>
+              <w:spacing w:after="0"/>
+            </w:pPr>
+            <w:r/>
+            <w:r>
+              <w:rPr>
+                <w:rFonts w:ascii="Noto Sans CJK SC" w:hAnsi="Noto Sans CJK SC" w:eastAsia="Noto Sans CJK SC"/>
+                <w:sz w:val="16"/>
+              </w:rPr>
+              <w:t>只有 Action 能干净表达</w:t>
+            </w:r>
+          </w:p>
+        </w:tc>
+        <w:tc>
+          <w:tcPr>
+            <w:tcW w:type="dxa" w:w="5896"/>
+          </w:tcPr>
+          <w:p>
+            <w:pPr>
+              <w:spacing w:after="0"/>
+            </w:pPr>
+            <w:r/>
+            <w:r>
+              <w:rPr>
+                <w:rFonts w:ascii="Noto Sans CJK SC" w:hAnsi="Noto Sans CJK SC" w:eastAsia="Noto Sans CJK SC"/>
+                <w:sz w:val="16"/>
+              </w:rPr>
+              <w:t>takeoff、goto、do_action</w:t>
+            </w:r>
+          </w:p>
+        </w:tc>
+      </w:tr>
+    </w:tbl>
+    <w:p>
+      <w:pPr>
+        <w:spacing w:after="120"/>
+      </w:pPr>
+    </w:p>
+    <w:p>
+      <w:pPr>
+        <w:spacing w:after="80"/>
+      </w:pPr>
+      <w:r>
+        <w:rPr>
+          <w:rFonts w:ascii="Noto Sans CJK SC" w:hAnsi="Noto Sans CJK SC" w:eastAsia="Noto Sans CJK SC"/>
+          <w:b w:val="0"/>
+          <w:i w:val="0"/>
+          <w:sz w:val="18"/>
+        </w:rPr>
+        <w:t>关键：对瞬时操作，这三者是同一件事——参数设进去就是生效了就是做完了，一次 service 往返全覆盖，上 Action 纯属浪费。只有当三者分离（发出去了但还没做完、中途可能失败、可能要叫停）时，才需要 Action。</w:t>
+      </w:r>
+    </w:p>
+    <w:p>
+      <w:pPr>
+        <w:pStyle w:val="Heading2"/>
+      </w:pPr>
+      <w:r>
+        <w:rPr>
+          <w:rFonts w:ascii="Noto Sans CJK SC" w:hAnsi="Noto Sans CJK SC" w:eastAsia="Noto Sans CJK SC"/>
+          <w:sz w:val="22"/>
+        </w:rPr>
+        <w:t>13.2 链路 A 能力四分类</w:t>
+      </w:r>
+    </w:p>
+    <w:tbl>
+      <w:tblPr>
+        <w:tblStyle w:val="TableGrid"/>
+        <w:tblW w:type="auto" w:w="0"/>
+        <w:jc w:val="center"/>
+        <w:tblLook w:firstColumn="1" w:firstRow="1" w:lastColumn="0" w:lastRow="0" w:noHBand="0" w:noVBand="1" w:val="04A0"/>
+      </w:tblPr>
+      <w:tblGrid>
+        <w:gridCol w:w="3784"/>
+        <w:gridCol w:w="3784"/>
+        <w:gridCol w:w="3784"/>
+        <w:gridCol w:w="3784"/>
+      </w:tblGrid>
+      <w:tr>
+        <w:tc>
+          <w:tcPr>
+            <w:tcW w:type="dxa" w:w="1814"/>
+            <w:shd w:val="clear" w:fill="D9E2F3"/>
+          </w:tcPr>
+          <w:p>
+            <w:r/>
+            <w:r>
+              <w:rPr>
+                <w:rFonts w:ascii="Noto Sans CJK SC" w:hAnsi="Noto Sans CJK SC" w:eastAsia="Noto Sans CJK SC"/>
+                <w:b/>
+                <w:sz w:val="17"/>
+              </w:rPr>
+              <w:t>类别</w:t>
+            </w:r>
+          </w:p>
+        </w:tc>
+        <w:tc>
+          <w:tcPr>
+            <w:tcW w:type="dxa" w:w="3628"/>
+            <w:shd w:val="clear" w:fill="D9E2F3"/>
+          </w:tcPr>
+          <w:p>
+            <w:r/>
+            <w:r>
+              <w:rPr>
+                <w:rFonts w:ascii="Noto Sans CJK SC" w:hAnsi="Noto Sans CJK SC" w:eastAsia="Noto Sans CJK SC"/>
+                <w:b/>
+                <w:sz w:val="17"/>
+              </w:rPr>
+              <w:t>判据</w:t>
+            </w:r>
+          </w:p>
+        </w:tc>
+        <w:tc>
+          <w:tcPr>
+            <w:tcW w:type="dxa" w:w="3061"/>
+            <w:shd w:val="clear" w:fill="D9E2F3"/>
+          </w:tcPr>
+          <w:p>
+            <w:r/>
+            <w:r>
+              <w:rPr>
+                <w:rFonts w:ascii="Noto Sans CJK SC" w:hAnsi="Noto Sans CJK SC" w:eastAsia="Noto Sans CJK SC"/>
+                <w:b/>
+                <w:sz w:val="17"/>
+              </w:rPr>
+              <w:t>机制</w:t>
+            </w:r>
+          </w:p>
+        </w:tc>
+        <w:tc>
+          <w:tcPr>
+            <w:tcW w:type="dxa" w:w="6690"/>
+            <w:shd w:val="clear" w:fill="D9E2F3"/>
+          </w:tcPr>
+          <w:p>
+            <w:r/>
+            <w:r>
+              <w:rPr>
+                <w:rFonts w:ascii="Noto Sans CJK SC" w:hAnsi="Noto Sans CJK SC" w:eastAsia="Noto Sans CJK SC"/>
+                <w:b/>
+                <w:sz w:val="17"/>
+              </w:rPr>
+              <w:t>本项目的方法</w:t>
+            </w:r>
+          </w:p>
+        </w:tc>
+      </w:tr>
+      <w:tr>
+        <w:tc>
+          <w:tcPr>
+            <w:tcW w:type="dxa" w:w="1814"/>
+          </w:tcPr>
+          <w:p>
+            <w:pPr>
+              <w:spacing w:after="0"/>
+            </w:pPr>
+            <w:r/>
+            <w:r>
+              <w:rPr>
+                <w:rFonts w:ascii="Noto Sans CJK SC" w:hAnsi="Noto Sans CJK SC" w:eastAsia="Noto Sans CJK SC"/>
+                <w:sz w:val="16"/>
+              </w:rPr>
+              <w:t>① 指挥飞行</w:t>
+            </w:r>
+          </w:p>
+        </w:tc>
+        <w:tc>
+          <w:tcPr>
+            <w:tcW w:type="dxa" w:w="3628"/>
+          </w:tcPr>
+          <w:p>
+            <w:pPr>
+              <w:spacing w:after="0"/>
+            </w:pPr>
+            <w:r/>
+            <w:r>
+              <w:rPr>
+                <w:rFonts w:ascii="Noto Sans CJK SC" w:hAnsi="Noto Sans CJK SC" w:eastAsia="Noto Sans CJK SC"/>
+                <w:sz w:val="16"/>
+              </w:rPr>
+              <w:t>耗时数秒至数十秒，可能失败，有真实取消需求</w:t>
+            </w:r>
+          </w:p>
+        </w:tc>
+        <w:tc>
+          <w:tcPr>
+            <w:tcW w:type="dxa" w:w="3061"/>
+          </w:tcPr>
+          <w:p>
+            <w:pPr>
+              <w:spacing w:after="0"/>
+            </w:pPr>
+            <w:r/>
+            <w:r>
+              <w:rPr>
+                <w:rFonts w:ascii="Noto Sans CJK SC" w:hAnsi="Noto Sans CJK SC" w:eastAsia="Noto Sans CJK SC"/>
+                <w:sz w:val="16"/>
+              </w:rPr>
+              <w:t>Action（建议）</w:t>
+            </w:r>
+          </w:p>
+        </w:tc>
+        <w:tc>
+          <w:tcPr>
+            <w:tcW w:type="dxa" w:w="6690"/>
+          </w:tcPr>
+          <w:p>
+            <w:pPr>
+              <w:spacing w:after="0"/>
+            </w:pPr>
+            <w:r/>
+            <w:r>
+              <w:rPr>
+                <w:rFonts w:ascii="Noto Sans CJK SC" w:hAnsi="Noto Sans CJK SC" w:eastAsia="Noto Sans CJK SC"/>
+                <w:sz w:val="16"/>
+              </w:rPr>
+              <w:t>takeoff、land、goto、编队跟随、center_on_target / precision_land、do_action（共 6 个）</w:t>
+            </w:r>
+          </w:p>
+        </w:tc>
+      </w:tr>
+      <w:tr>
+        <w:tc>
+          <w:tcPr>
+            <w:tcW w:type="dxa" w:w="1814"/>
+          </w:tcPr>
+          <w:p>
+            <w:pPr>
+              <w:spacing w:after="0"/>
+            </w:pPr>
+            <w:r/>
+            <w:r>
+              <w:rPr>
+                <w:rFonts w:ascii="Noto Sans CJK SC" w:hAnsi="Noto Sans CJK SC" w:eastAsia="Noto Sans CJK SC"/>
+                <w:sz w:val="16"/>
+              </w:rPr>
+              <w:t>② 瞬时状态变更</w:t>
+            </w:r>
+          </w:p>
+        </w:tc>
+        <w:tc>
+          <w:tcPr>
+            <w:tcW w:type="dxa" w:w="3628"/>
+          </w:tcPr>
+          <w:p>
+            <w:pPr>
+              <w:spacing w:after="0"/>
+            </w:pPr>
+            <w:r/>
+            <w:r>
+              <w:rPr>
+                <w:rFonts w:ascii="Noto Sans CJK SC" w:hAnsi="Noto Sans CJK SC" w:eastAsia="Noto Sans CJK SC"/>
+                <w:sz w:val="16"/>
+              </w:rPr>
+              <w:t>设完即生效，无"执行中"状态，无取消需求</w:t>
+            </w:r>
+          </w:p>
+        </w:tc>
+        <w:tc>
+          <w:tcPr>
+            <w:tcW w:type="dxa" w:w="3061"/>
+          </w:tcPr>
+          <w:p>
+            <w:pPr>
+              <w:spacing w:after="0"/>
+            </w:pPr>
+            <w:r/>
+            <w:r>
+              <w:rPr>
+                <w:rFonts w:ascii="Noto Sans CJK SC" w:hAnsi="Noto Sans CJK SC" w:eastAsia="Noto Sans CJK SC"/>
+                <w:sz w:val="16"/>
+              </w:rPr>
+              <w:t>service 或参数（维持现状）</w:t>
+            </w:r>
+          </w:p>
+        </w:tc>
+        <w:tc>
+          <w:tcPr>
+            <w:tcW w:type="dxa" w:w="6690"/>
+          </w:tcPr>
+          <w:p>
+            <w:pPr>
+              <w:spacing w:after="0"/>
+            </w:pPr>
+            <w:r/>
+            <w:r>
+              <w:rPr>
+                <w:rFonts w:ascii="Noto Sans CJK SC" w:hAnsi="Noto Sans CJK SC" w:eastAsia="Noto Sans CJK SC"/>
+                <w:sz w:val="16"/>
+              </w:rPr>
+              <w:t>reset_aim、set_yaw_mode_velocity / constant / point、set_camera_view、relay_mode 切换、set_actuator</w:t>
+            </w:r>
+          </w:p>
+        </w:tc>
+      </w:tr>
+      <w:tr>
+        <w:tc>
+          <w:tcPr>
+            <w:tcW w:type="dxa" w:w="1814"/>
+          </w:tcPr>
+          <w:p>
+            <w:pPr>
+              <w:spacing w:after="0"/>
+            </w:pPr>
+            <w:r/>
+            <w:r>
+              <w:rPr>
+                <w:rFonts w:ascii="Noto Sans CJK SC" w:hAnsi="Noto Sans CJK SC" w:eastAsia="Noto Sans CJK SC"/>
+                <w:sz w:val="16"/>
+              </w:rPr>
+              <w:t>③ 读取</w:t>
+            </w:r>
+          </w:p>
+        </w:tc>
+        <w:tc>
+          <w:tcPr>
+            <w:tcW w:type="dxa" w:w="3628"/>
+          </w:tcPr>
+          <w:p>
+            <w:pPr>
+              <w:spacing w:after="0"/>
+            </w:pPr>
+            <w:r/>
+            <w:r>
+              <w:rPr>
+                <w:rFonts w:ascii="Noto Sans CJK SC" w:hAnsi="Noto Sans CJK SC" w:eastAsia="Noto Sans CJK SC"/>
+                <w:sz w:val="16"/>
+              </w:rPr>
+              <w:t>取最新值</w:t>
+            </w:r>
+          </w:p>
+        </w:tc>
+        <w:tc>
+          <w:tcPr>
+            <w:tcW w:type="dxa" w:w="3061"/>
+          </w:tcPr>
+          <w:p>
+            <w:pPr>
+              <w:spacing w:after="0"/>
+            </w:pPr>
+            <w:r/>
+            <w:r>
+              <w:rPr>
+                <w:rFonts w:ascii="Noto Sans CJK SC" w:hAnsi="Noto Sans CJK SC" w:eastAsia="Noto Sans CJK SC"/>
+                <w:sz w:val="16"/>
+              </w:rPr>
+              <w:t>订阅取最新值（维持现状）</w:t>
+            </w:r>
+          </w:p>
+        </w:tc>
+        <w:tc>
+          <w:tcPr>
+            <w:tcW w:type="dxa" w:w="6690"/>
+          </w:tcPr>
+          <w:p>
+            <w:pPr>
+              <w:spacing w:after="0"/>
+            </w:pPr>
+            <w:r/>
+            <w:r>
+              <w:rPr>
+                <w:rFonts w:ascii="Noto Sans CJK SC" w:hAnsi="Noto Sans CJK SC" w:eastAsia="Noto Sans CJK SC"/>
+                <w:sz w:val="16"/>
+              </w:rPr>
+              <w:t>get_local_position、get_current_yaw、read_fire_pillar_staging_pose / aim_pose、wait_for_detection、get_mission_state</w:t>
+            </w:r>
+          </w:p>
+        </w:tc>
+      </w:tr>
+      <w:tr>
+        <w:tc>
+          <w:tcPr>
+            <w:tcW w:type="dxa" w:w="1814"/>
+          </w:tcPr>
+          <w:p>
+            <w:pPr>
+              <w:spacing w:after="0"/>
+            </w:pPr>
+            <w:r/>
+            <w:r>
+              <w:rPr>
+                <w:rFonts w:ascii="Noto Sans CJK SC" w:hAnsi="Noto Sans CJK SC" w:eastAsia="Noto Sans CJK SC"/>
+                <w:sz w:val="16"/>
+              </w:rPr>
+              <w:t>④ 纯本地计算</w:t>
+            </w:r>
+          </w:p>
+        </w:tc>
+        <w:tc>
+          <w:tcPr>
+            <w:tcW w:type="dxa" w:w="3628"/>
+          </w:tcPr>
+          <w:p>
+            <w:pPr>
+              <w:spacing w:after="0"/>
+            </w:pPr>
+            <w:r/>
+            <w:r>
+              <w:rPr>
+                <w:rFonts w:ascii="Noto Sans CJK SC" w:hAnsi="Noto Sans CJK SC" w:eastAsia="Noto Sans CJK SC"/>
+                <w:sz w:val="16"/>
+              </w:rPr>
+              <w:t>不产生通信</w:t>
+            </w:r>
+          </w:p>
+        </w:tc>
+        <w:tc>
+          <w:tcPr>
+            <w:tcW w:type="dxa" w:w="3061"/>
+          </w:tcPr>
+          <w:p>
+            <w:pPr>
+              <w:spacing w:after="0"/>
+            </w:pPr>
+            <w:r/>
+            <w:r>
+              <w:rPr>
+                <w:rFonts w:ascii="Noto Sans CJK SC" w:hAnsi="Noto Sans CJK SC" w:eastAsia="Noto Sans CJK SC"/>
+                <w:sz w:val="16"/>
+              </w:rPr>
+              <w:t>无（纯函数）</w:t>
+            </w:r>
+          </w:p>
+        </w:tc>
+        <w:tc>
+          <w:tcPr>
+            <w:tcW w:type="dxa" w:w="6690"/>
+          </w:tcPr>
+          <w:p>
+            <w:pPr>
+              <w:spacing w:after="0"/>
+            </w:pPr>
+            <w:r/>
+            <w:r>
+              <w:rPr>
+                <w:rFonts w:ascii="Noto Sans CJK SC" w:hAnsi="Noto Sans CJK SC" w:eastAsia="Noto Sans CJK SC"/>
+                <w:sz w:val="16"/>
+              </w:rPr>
+              <w:t>generate_orbit_waypoints、generate_ground_scan_waypoints</w:t>
+            </w:r>
+          </w:p>
+        </w:tc>
+      </w:tr>
+    </w:tbl>
+    <w:p>
+      <w:pPr>
+        <w:spacing w:after="120"/>
+      </w:pPr>
+    </w:p>
+    <w:p>
+      <w:pPr>
+        <w:spacing w:after="80"/>
+      </w:pPr>
+      <w:r>
+        <w:rPr>
+          <w:rFonts w:ascii="Noto Sans CJK SC" w:hAnsi="Noto Sans CJK SC" w:eastAsia="Noto Sans CJK SC"/>
+          <w:b w:val="0"/>
+          <w:i w:val="0"/>
+          <w:sz w:val="18"/>
+        </w:rPr>
+        <w:t>set_actuator 是"service 就够了"的好例子：走 MAV_CMD_DO_SET_ACTUATOR + command_long 服务，PX4 回 MAV_RESULT 即确认，且输出值会保持到下次设置，本来就不需要持续回路——这跟 do_action 走 RC override 必须机载 ≥10Hz 持续发布，是两条不同性质的路线，不要混用。</w:t>
+      </w:r>
+    </w:p>
+    <w:p>
+      <w:pPr>
+        <w:pStyle w:val="Heading2"/>
+      </w:pPr>
+      <w:r>
+        <w:rPr>
+          <w:rFonts w:ascii="Noto Sans CJK SC" w:hAnsi="Noto Sans CJK SC" w:eastAsia="Noto Sans CJK SC"/>
+          <w:sz w:val="22"/>
+        </w:rPr>
+        <w:t>13.3 为什么不能全上 Action</w:t>
+      </w:r>
+    </w:p>
+    <w:tbl>
+      <w:tblPr>
+        <w:tblStyle w:val="TableGrid"/>
+        <w:tblW w:type="auto" w:w="0"/>
+        <w:jc w:val="center"/>
+        <w:tblLook w:firstColumn="1" w:firstRow="1" w:lastColumn="0" w:lastRow="0" w:noHBand="0" w:noVBand="1" w:val="04A0"/>
+      </w:tblPr>
+      <w:tblGrid>
+        <w:gridCol w:w="7569"/>
+        <w:gridCol w:w="7569"/>
+      </w:tblGrid>
+      <w:tr>
+        <w:tc>
+          <w:tcPr>
+            <w:tcW w:type="dxa" w:w="2268"/>
+            <w:shd w:val="clear" w:fill="D9E2F3"/>
+          </w:tcPr>
+          <w:p>
+            <w:r/>
+            <w:r>
+              <w:rPr>
+                <w:rFonts w:ascii="Noto Sans CJK SC" w:hAnsi="Noto Sans CJK SC" w:eastAsia="Noto Sans CJK SC"/>
+                <w:b/>
+                <w:sz w:val="17"/>
+              </w:rPr>
+              <w:t>考量</w:t>
+            </w:r>
+          </w:p>
+        </w:tc>
+        <w:tc>
+          <w:tcPr>
+            <w:tcW w:type="dxa" w:w="12926"/>
+            <w:shd w:val="clear" w:fill="D9E2F3"/>
+          </w:tcPr>
+          <w:p>
+            <w:r/>
+            <w:r>
+              <w:rPr>
+                <w:rFonts w:ascii="Noto Sans CJK SC" w:hAnsi="Noto Sans CJK SC" w:eastAsia="Noto Sans CJK SC"/>
+                <w:b/>
+                <w:sz w:val="17"/>
+              </w:rPr>
+              <w:t>说明</w:t>
+            </w:r>
+          </w:p>
+        </w:tc>
+      </w:tr>
+      <w:tr>
+        <w:tc>
+          <w:tcPr>
+            <w:tcW w:type="dxa" w:w="2268"/>
+          </w:tcPr>
+          <w:p>
+            <w:pPr>
+              <w:spacing w:after="0"/>
+            </w:pPr>
+            <w:r/>
+            <w:r>
+              <w:rPr>
+                <w:rFonts w:ascii="Noto Sans CJK SC" w:hAnsi="Noto Sans CJK SC" w:eastAsia="Noto Sans CJK SC"/>
+                <w:sz w:val="16"/>
+              </w:rPr>
+              <w:t>端点数量</w:t>
+            </w:r>
+          </w:p>
+        </w:tc>
+        <w:tc>
+          <w:tcPr>
+            <w:tcW w:type="dxa" w:w="12926"/>
+          </w:tcPr>
+          <w:p>
+            <w:pPr>
+              <w:spacing w:after="0"/>
+            </w:pPr>
+            <w:r/>
+            <w:r>
+              <w:rPr>
+                <w:rFonts w:ascii="Noto Sans CJK SC" w:hAnsi="Noto Sans CJK SC" w:eastAsia="Noto Sans CJK SC"/>
+                <w:sz w:val="16"/>
+              </w:rPr>
+              <w:t>SDK 对外 30 多个方法；每个 Action 建 3 service + 2 topic，全上即 150 多个 DDS 端点</w:t>
+            </w:r>
+          </w:p>
+        </w:tc>
+      </w:tr>
+      <w:tr>
+        <w:tc>
+          <w:tcPr>
+            <w:tcW w:type="dxa" w:w="2268"/>
+          </w:tcPr>
+          <w:p>
+            <w:pPr>
+              <w:spacing w:after="0"/>
+            </w:pPr>
+            <w:r/>
+            <w:r>
+              <w:rPr>
+                <w:rFonts w:ascii="Noto Sans CJK SC" w:hAnsi="Noto Sans CJK SC" w:eastAsia="Noto Sans CJK SC"/>
+                <w:sz w:val="16"/>
+              </w:rPr>
+              <w:t>发现负载</w:t>
+            </w:r>
+          </w:p>
+        </w:tc>
+        <w:tc>
+          <w:tcPr>
+            <w:tcW w:type="dxa" w:w="12926"/>
+          </w:tcPr>
+          <w:p>
+            <w:pPr>
+              <w:spacing w:after="0"/>
+            </w:pPr>
+            <w:r/>
+            <w:r>
+              <w:rPr>
+                <w:rFonts w:ascii="Noto Sans CJK SC" w:hAnsi="Noto Sans CJK SC" w:eastAsia="Noto Sans CJK SC"/>
+                <w:sz w:val="16"/>
+              </w:rPr>
+              <w:t>端点数量直接影响发现负载与断连后的恢复速度；本项目 WiFi 已记录过丢包与延迟剧烈抖动（2026-09-18 排查两天的根因）</w:t>
+            </w:r>
+          </w:p>
+        </w:tc>
+      </w:tr>
+      <w:tr>
+        <w:tc>
+          <w:tcPr>
+            <w:tcW w:type="dxa" w:w="2268"/>
+          </w:tcPr>
+          <w:p>
+            <w:pPr>
+              <w:spacing w:after="0"/>
+            </w:pPr>
+            <w:r/>
+            <w:r>
+              <w:rPr>
+                <w:rFonts w:ascii="Noto Sans CJK SC" w:hAnsi="Noto Sans CJK SC" w:eastAsia="Noto Sans CJK SC"/>
+                <w:sz w:val="16"/>
+              </w:rPr>
+              <w:t>结论</w:t>
+            </w:r>
+          </w:p>
+        </w:tc>
+        <w:tc>
+          <w:tcPr>
+            <w:tcW w:type="dxa" w:w="12926"/>
+          </w:tcPr>
+          <w:p>
+            <w:pPr>
+              <w:spacing w:after="0"/>
+            </w:pPr>
+            <w:r/>
+            <w:r>
+              <w:rPr>
+                <w:rFonts w:ascii="Noto Sans CJK SC" w:hAnsi="Noto Sans CJK SC" w:eastAsia="Noto Sans CJK SC"/>
+                <w:sz w:val="16"/>
+              </w:rPr>
+              <w:t>把 Action 用在刀刃上（那 6 个指挥类能力），比全面铺开更稳</w:t>
+            </w:r>
+          </w:p>
+        </w:tc>
+      </w:tr>
+    </w:tbl>
+    <w:p>
+      <w:pPr>
+        <w:spacing w:after="120"/>
+      </w:pPr>
+    </w:p>
+    <w:p>
+      <w:pPr>
+        <w:pStyle w:val="Heading2"/>
+      </w:pPr>
+      <w:r>
+        <w:rPr>
+          <w:rFonts w:ascii="Noto Sans CJK SC" w:hAnsi="Noto Sans CJK SC" w:eastAsia="Noto Sans CJK SC"/>
+          <w:sz w:val="22"/>
+        </w:rPr>
+        <w:t>13.4 一个反向例子：set_camera_view 不值得上 Action</w:t>
+      </w:r>
+    </w:p>
+    <w:p>
+      <w:pPr>
+        <w:spacing w:after="80"/>
+      </w:pPr>
+      <w:r>
+        <w:rPr>
+          <w:rFonts w:ascii="Noto Sans CJK SC" w:hAnsi="Noto Sans CJK SC" w:eastAsia="Noto Sans CJK SC"/>
+          <w:b w:val="0"/>
+          <w:i w:val="0"/>
+          <w:sz w:val="18"/>
+        </w:rPr>
+        <w:t>切视角其实是有过程的（关节转动需要时间），理论上可以做成 Action。但：切换失败任务也不会错，下一帧图像自然反映结果，也没人会想取消一次切视角。判断标准不是"有没有过程"，而是"失败了要不要处置"——要处置才需要知道结果，才需要 Action。</w:t>
+      </w:r>
+    </w:p>
+    <w:p>
+      <w:r>
+        <w:br w:type="page"/>
+      </w:r>
+    </w:p>
+    <w:p>
+      <w:pPr>
+        <w:pStyle w:val="Heading1"/>
+      </w:pPr>
+      <w:r>
+        <w:rPr>
+          <w:rFonts w:ascii="Noto Sans CJK SC" w:hAnsi="Noto Sans CJK SC" w:eastAsia="Noto Sans CJK SC"/>
+          <w:sz w:val="28"/>
+        </w:rPr>
+        <w:t>十四、其余任务的时序分析（D5 / D6 / 收尾）</w:t>
+      </w:r>
+    </w:p>
+    <w:p>
+      <w:pPr>
+        <w:spacing w:after="80"/>
+      </w:pPr>
+      <w:r>
+        <w:rPr>
+          <w:rFonts w:ascii="Noto Sans CJK SC" w:hAnsi="Noto Sans CJK SC" w:eastAsia="Noto Sans CJK SC"/>
+          <w:b w:val="0"/>
+          <w:i w:val="0"/>
+          <w:sz w:val="18"/>
+        </w:rPr>
+        <w:t>第十章已给出编队飞行（D3）的时序。本章补齐其余任务，重点是双机之间的并发与等待关系——这决定了哪些环节可以并行、哪些必须串行握手，也决定了哪些超时会真正卡住整个任务。</w:t>
+      </w:r>
+    </w:p>
+    <w:p>
+      <w:pPr>
+        <w:pStyle w:val="Heading2"/>
+      </w:pPr>
+      <w:r>
+        <w:rPr>
+          <w:rFonts w:ascii="Noto Sans CJK SC" w:hAnsi="Noto Sans CJK SC" w:eastAsia="Noto Sans CJK SC"/>
+          <w:sz w:val="22"/>
+        </w:rPr>
+        <w:t>14.1 D5 地面火情：双机并发，单向通知</w:t>
+      </w:r>
+    </w:p>
+    <w:tbl>
+      <w:tblPr>
+        <w:tblStyle w:val="TableGrid"/>
+        <w:tblW w:type="auto" w:w="0"/>
+        <w:jc w:val="center"/>
+        <w:tblLook w:firstColumn="1" w:firstRow="1" w:lastColumn="0" w:lastRow="0" w:noHBand="0" w:noVBand="1" w:val="04A0"/>
+      </w:tblPr>
+      <w:tblGrid>
+        <w:gridCol w:w="3784"/>
+        <w:gridCol w:w="3784"/>
+        <w:gridCol w:w="3784"/>
+        <w:gridCol w:w="3784"/>
+      </w:tblGrid>
+      <w:tr>
+        <w:tc>
+          <w:tcPr>
+            <w:tcW w:type="dxa" w:w="1134"/>
+            <w:shd w:val="clear" w:fill="D9E2F3"/>
+          </w:tcPr>
+          <w:p>
+            <w:r/>
+            <w:r>
+              <w:rPr>
+                <w:rFonts w:ascii="Noto Sans CJK SC" w:hAnsi="Noto Sans CJK SC" w:eastAsia="Noto Sans CJK SC"/>
+                <w:b/>
+                <w:sz w:val="17"/>
+              </w:rPr>
+              <w:t>时刻</w:t>
+            </w:r>
+          </w:p>
+        </w:tc>
+        <w:tc>
+          <w:tcPr>
+            <w:tcW w:type="dxa" w:w="4535"/>
+            <w:shd w:val="clear" w:fill="D9E2F3"/>
+          </w:tcPr>
+          <w:p>
+            <w:r/>
+            <w:r>
+              <w:rPr>
+                <w:rFonts w:ascii="Noto Sans CJK SC" w:hAnsi="Noto Sans CJK SC" w:eastAsia="Noto Sans CJK SC"/>
+                <w:b/>
+                <w:sz w:val="17"/>
+              </w:rPr>
+              <w:t>RECON</w:t>
+            </w:r>
+          </w:p>
+        </w:tc>
+        <w:tc>
+          <w:tcPr>
+            <w:tcW w:type="dxa" w:w="4762"/>
+            <w:shd w:val="clear" w:fill="D9E2F3"/>
+          </w:tcPr>
+          <w:p>
+            <w:r/>
+            <w:r>
+              <w:rPr>
+                <w:rFonts w:ascii="Noto Sans CJK SC" w:hAnsi="Noto Sans CJK SC" w:eastAsia="Noto Sans CJK SC"/>
+                <w:b/>
+                <w:sz w:val="17"/>
+              </w:rPr>
+              <w:t>SUPPLY</w:t>
+            </w:r>
+          </w:p>
+        </w:tc>
+        <w:tc>
+          <w:tcPr>
+            <w:tcW w:type="dxa" w:w="4762"/>
+            <w:shd w:val="clear" w:fill="D9E2F3"/>
+          </w:tcPr>
+          <w:p>
+            <w:r/>
+            <w:r>
+              <w:rPr>
+                <w:rFonts w:ascii="Noto Sans CJK SC" w:hAnsi="Noto Sans CJK SC" w:eastAsia="Noto Sans CJK SC"/>
+                <w:b/>
+                <w:sz w:val="17"/>
+              </w:rPr>
+              <w:t>跨机事件</w:t>
+            </w:r>
+          </w:p>
+        </w:tc>
+      </w:tr>
+      <w:tr>
+        <w:tc>
+          <w:tcPr>
+            <w:tcW w:type="dxa" w:w="1134"/>
+          </w:tcPr>
+          <w:p>
+            <w:pPr>
+              <w:spacing w:after="0"/>
+            </w:pPr>
+            <w:r/>
+            <w:r>
+              <w:rPr>
+                <w:rFonts w:ascii="Noto Sans CJK SC" w:hAnsi="Noto Sans CJK SC" w:eastAsia="Noto Sans CJK SC"/>
+                <w:sz w:val="16"/>
+              </w:rPr>
+              <w:t>t0</w:t>
+            </w:r>
+          </w:p>
+        </w:tc>
+        <w:tc>
+          <w:tcPr>
+            <w:tcW w:type="dxa" w:w="4535"/>
+          </w:tcPr>
+          <w:p>
+            <w:pPr>
+              <w:spacing w:after="0"/>
+            </w:pPr>
+            <w:r/>
+            <w:r>
+              <w:rPr>
+                <w:rFonts w:ascii="Noto Sans CJK SC" w:hAnsi="Noto Sans CJK SC" w:eastAsia="Noto Sans CJK SC"/>
+                <w:sz w:val="16"/>
+              </w:rPr>
+              <w:t>搜索航线中命中 apriltag:2</w:t>
+            </w:r>
+          </w:p>
+        </w:tc>
+        <w:tc>
+          <w:tcPr>
+            <w:tcW w:type="dxa" w:w="4762"/>
+          </w:tcPr>
+          <w:p>
+            <w:pPr>
+              <w:spacing w:after="0"/>
+            </w:pPr>
+            <w:r/>
+            <w:r>
+              <w:rPr>
+                <w:rFonts w:ascii="Noto Sans CJK SC" w:hAnsi="Noto Sans CJK SC" w:eastAsia="Noto Sans CJK SC"/>
+                <w:sz w:val="16"/>
+              </w:rPr>
+              <w:t>STANDBY 待命（已降落）</w:t>
+            </w:r>
+          </w:p>
+        </w:tc>
+        <w:tc>
+          <w:tcPr>
+            <w:tcW w:type="dxa" w:w="4762"/>
+          </w:tcPr>
+          <w:p>
+            <w:pPr>
+              <w:spacing w:after="0"/>
+            </w:pPr>
+            <w:r/>
+            <w:r>
+              <w:rPr>
+                <w:rFonts w:ascii="Noto Sans CJK SC" w:hAnsi="Noto Sans CJK SC" w:eastAsia="Noto Sans CJK SC"/>
+                <w:sz w:val="16"/>
+              </w:rPr>
+              <w:t>—</w:t>
+            </w:r>
+          </w:p>
+        </w:tc>
+      </w:tr>
+      <w:tr>
+        <w:tc>
+          <w:tcPr>
+            <w:tcW w:type="dxa" w:w="1134"/>
+          </w:tcPr>
+          <w:p>
+            <w:pPr>
+              <w:spacing w:after="0"/>
+            </w:pPr>
+            <w:r/>
+            <w:r>
+              <w:rPr>
+                <w:rFonts w:ascii="Noto Sans CJK SC" w:hAnsi="Noto Sans CJK SC" w:eastAsia="Noto Sans CJK SC"/>
+                <w:sz w:val="16"/>
+              </w:rPr>
+              <w:t>t1</w:t>
+            </w:r>
+          </w:p>
+        </w:tc>
+        <w:tc>
+          <w:tcPr>
+            <w:tcW w:type="dxa" w:w="4535"/>
+          </w:tcPr>
+          <w:p>
+            <w:pPr>
+              <w:spacing w:after="0"/>
+            </w:pPr>
+            <w:r/>
+            <w:r>
+              <w:rPr>
+                <w:rFonts w:ascii="Noto Sans CJK SC" w:hAnsi="Noto Sans CJK SC" w:eastAsia="Noto Sans CJK SC"/>
+                <w:sz w:val="16"/>
+              </w:rPr>
+              <w:t>cancel 当前导航 → center_on_target 居中（机载伺服闭环）</w:t>
+            </w:r>
+          </w:p>
+        </w:tc>
+        <w:tc>
+          <w:tcPr>
+            <w:tcW w:type="dxa" w:w="4762"/>
+          </w:tcPr>
+          <w:p>
+            <w:pPr>
+              <w:spacing w:after="0"/>
+            </w:pPr>
+            <w:r/>
+            <w:r>
+              <w:rPr>
+                <w:rFonts w:ascii="Noto Sans CJK SC" w:hAnsi="Noto Sans CJK SC" w:eastAsia="Noto Sans CJK SC"/>
+                <w:sz w:val="16"/>
+              </w:rPr>
+              <w:t>—</w:t>
+            </w:r>
+          </w:p>
+        </w:tc>
+        <w:tc>
+          <w:tcPr>
+            <w:tcW w:type="dxa" w:w="4762"/>
+          </w:tcPr>
+          <w:p>
+            <w:pPr>
+              <w:spacing w:after="0"/>
+            </w:pPr>
+            <w:r/>
+            <w:r>
+              <w:rPr>
+                <w:rFonts w:ascii="Noto Sans CJK SC" w:hAnsi="Noto Sans CJK SC" w:eastAsia="Noto Sans CJK SC"/>
+                <w:sz w:val="16"/>
+              </w:rPr>
+              <w:t>—</w:t>
+            </w:r>
+          </w:p>
+        </w:tc>
+      </w:tr>
+      <w:tr>
+        <w:tc>
+          <w:tcPr>
+            <w:tcW w:type="dxa" w:w="1134"/>
+          </w:tcPr>
+          <w:p>
+            <w:pPr>
+              <w:spacing w:after="0"/>
+            </w:pPr>
+            <w:r/>
+            <w:r>
+              <w:rPr>
+                <w:rFonts w:ascii="Noto Sans CJK SC" w:hAnsi="Noto Sans CJK SC" w:eastAsia="Noto Sans CJK SC"/>
+                <w:sz w:val="16"/>
+              </w:rPr>
+              <w:t>t2</w:t>
+            </w:r>
+          </w:p>
+        </w:tc>
+        <w:tc>
+          <w:tcPr>
+            <w:tcW w:type="dxa" w:w="4535"/>
+          </w:tcPr>
+          <w:p>
+            <w:pPr>
+              <w:spacing w:after="0"/>
+            </w:pPr>
+            <w:r/>
+            <w:r>
+              <w:rPr>
+                <w:rFonts w:ascii="Noto Sans CJK SC" w:hAnsi="Noto Sans CJK SC" w:eastAsia="Noto Sans CJK SC"/>
+                <w:sz w:val="16"/>
+              </w:rPr>
+              <w:t>收敛后读自身坐标 → 换算世界坐标 → 广播</w:t>
+            </w:r>
+          </w:p>
+        </w:tc>
+        <w:tc>
+          <w:tcPr>
+            <w:tcW w:type="dxa" w:w="4762"/>
+          </w:tcPr>
+          <w:p>
+            <w:pPr>
+              <w:spacing w:after="0"/>
+            </w:pPr>
+            <w:r/>
+            <w:r>
+              <w:rPr>
+                <w:rFonts w:ascii="Noto Sans CJK SC" w:hAnsi="Noto Sans CJK SC" w:eastAsia="Noto Sans CJK SC"/>
+                <w:sz w:val="16"/>
+              </w:rPr>
+              <w:t>—</w:t>
+            </w:r>
+          </w:p>
+        </w:tc>
+        <w:tc>
+          <w:tcPr>
+            <w:tcW w:type="dxa" w:w="4762"/>
+          </w:tcPr>
+          <w:p>
+            <w:pPr>
+              <w:spacing w:after="0"/>
+            </w:pPr>
+            <w:r/>
+            <w:r>
+              <w:rPr>
+                <w:rFonts w:ascii="Noto Sans CJK SC" w:hAnsi="Noto Sans CJK SC" w:eastAsia="Noto Sans CJK SC"/>
+                <w:sz w:val="16"/>
+              </w:rPr>
+              <w:t>ground_fire_found(x, y) → 第 7 点，必需</w:t>
+            </w:r>
+          </w:p>
+        </w:tc>
+      </w:tr>
+      <w:tr>
+        <w:tc>
+          <w:tcPr>
+            <w:tcW w:type="dxa" w:w="1134"/>
+          </w:tcPr>
+          <w:p>
+            <w:pPr>
+              <w:spacing w:after="0"/>
+            </w:pPr>
+            <w:r/>
+            <w:r>
+              <w:rPr>
+                <w:rFonts w:ascii="Noto Sans CJK SC" w:hAnsi="Noto Sans CJK SC" w:eastAsia="Noto Sans CJK SC"/>
+                <w:sz w:val="16"/>
+              </w:rPr>
+              <w:t>t3</w:t>
+            </w:r>
+          </w:p>
+        </w:tc>
+        <w:tc>
+          <w:tcPr>
+            <w:tcW w:type="dxa" w:w="4535"/>
+          </w:tcPr>
+          <w:p>
+            <w:pPr>
+              <w:spacing w:after="0"/>
+            </w:pPr>
+            <w:r/>
+            <w:r>
+              <w:rPr>
+                <w:rFonts w:ascii="Noto Sans CJK SC" w:hAnsi="Noto Sans CJK SC" w:eastAsia="Noto Sans CJK SC"/>
+                <w:sz w:val="16"/>
+              </w:rPr>
+              <w:t>立即恢复剩余搜索航段，不等 SUPPLY</w:t>
+            </w:r>
+          </w:p>
+        </w:tc>
+        <w:tc>
+          <w:tcPr>
+            <w:tcW w:type="dxa" w:w="4762"/>
+          </w:tcPr>
+          <w:p>
+            <w:pPr>
+              <w:spacing w:after="0"/>
+            </w:pPr>
+            <w:r/>
+            <w:r>
+              <w:rPr>
+                <w:rFonts w:ascii="Noto Sans CJK SC" w:hAnsi="Noto Sans CJK SC" w:eastAsia="Noto Sans CJK SC"/>
+                <w:sz w:val="16"/>
+              </w:rPr>
+              <w:t>起飞 → goto 物资点</w:t>
+            </w:r>
+          </w:p>
+        </w:tc>
+        <w:tc>
+          <w:tcPr>
+            <w:tcW w:type="dxa" w:w="4762"/>
+          </w:tcPr>
+          <w:p>
+            <w:pPr>
+              <w:spacing w:after="0"/>
+            </w:pPr>
+            <w:r/>
+            <w:r>
+              <w:rPr>
+                <w:rFonts w:ascii="Noto Sans CJK SC" w:hAnsi="Noto Sans CJK SC" w:eastAsia="Noto Sans CJK SC"/>
+                <w:sz w:val="16"/>
+              </w:rPr>
+              <w:t>—</w:t>
+            </w:r>
+          </w:p>
+        </w:tc>
+      </w:tr>
+      <w:tr>
+        <w:tc>
+          <w:tcPr>
+            <w:tcW w:type="dxa" w:w="1134"/>
+          </w:tcPr>
+          <w:p>
+            <w:pPr>
+              <w:spacing w:after="0"/>
+            </w:pPr>
+            <w:r/>
+            <w:r>
+              <w:rPr>
+                <w:rFonts w:ascii="Noto Sans CJK SC" w:hAnsi="Noto Sans CJK SC" w:eastAsia="Noto Sans CJK SC"/>
+                <w:sz w:val="16"/>
+              </w:rPr>
+              <w:t>t4</w:t>
+            </w:r>
+          </w:p>
+        </w:tc>
+        <w:tc>
+          <w:tcPr>
+            <w:tcW w:type="dxa" w:w="4535"/>
+          </w:tcPr>
+          <w:p>
+            <w:pPr>
+              <w:spacing w:after="0"/>
+            </w:pPr>
+            <w:r/>
+            <w:r>
+              <w:rPr>
+                <w:rFonts w:ascii="Noto Sans CJK SC" w:hAnsi="Noto Sans CJK SC" w:eastAsia="Noto Sans CJK SC"/>
+                <w:sz w:val="16"/>
+              </w:rPr>
+              <w:t>继续立柱绕飞搜索</w:t>
+            </w:r>
+          </w:p>
+        </w:tc>
+        <w:tc>
+          <w:tcPr>
+            <w:tcW w:type="dxa" w:w="4762"/>
+          </w:tcPr>
+          <w:p>
+            <w:pPr>
+              <w:spacing w:after="0"/>
+            </w:pPr>
+            <w:r/>
+            <w:r>
+              <w:rPr>
+                <w:rFonts w:ascii="Noto Sans CJK SC" w:hAnsi="Noto Sans CJK SC" w:eastAsia="Noto Sans CJK SC"/>
+                <w:sz w:val="16"/>
+              </w:rPr>
+              <w:t>precision_land_and_confirm(apriltag:0) → do_action(grab_supply)</w:t>
+            </w:r>
+          </w:p>
+        </w:tc>
+        <w:tc>
+          <w:tcPr>
+            <w:tcW w:type="dxa" w:w="4762"/>
+          </w:tcPr>
+          <w:p>
+            <w:pPr>
+              <w:spacing w:after="0"/>
+            </w:pPr>
+            <w:r/>
+            <w:r>
+              <w:rPr>
+                <w:rFonts w:ascii="Noto Sans CJK SC" w:hAnsi="Noto Sans CJK SC" w:eastAsia="Noto Sans CJK SC"/>
+                <w:sz w:val="16"/>
+              </w:rPr>
+              <w:t>supply_grabbed（第 8 点，纯通知）</w:t>
+            </w:r>
+          </w:p>
+        </w:tc>
+      </w:tr>
+      <w:tr>
+        <w:tc>
+          <w:tcPr>
+            <w:tcW w:type="dxa" w:w="1134"/>
+          </w:tcPr>
+          <w:p>
+            <w:pPr>
+              <w:spacing w:after="0"/>
+            </w:pPr>
+            <w:r/>
+            <w:r>
+              <w:rPr>
+                <w:rFonts w:ascii="Noto Sans CJK SC" w:hAnsi="Noto Sans CJK SC" w:eastAsia="Noto Sans CJK SC"/>
+                <w:sz w:val="16"/>
+              </w:rPr>
+              <w:t>t5</w:t>
+            </w:r>
+          </w:p>
+        </w:tc>
+        <w:tc>
+          <w:tcPr>
+            <w:tcW w:type="dxa" w:w="4535"/>
+          </w:tcPr>
+          <w:p>
+            <w:pPr>
+              <w:spacing w:after="0"/>
+            </w:pPr>
+            <w:r/>
+            <w:r>
+              <w:rPr>
+                <w:rFonts w:ascii="Noto Sans CJK SC" w:hAnsi="Noto Sans CJK SC" w:eastAsia="Noto Sans CJK SC"/>
+                <w:sz w:val="16"/>
+              </w:rPr>
+              <w:t>（并发进行中）</w:t>
+            </w:r>
+          </w:p>
+        </w:tc>
+        <w:tc>
+          <w:tcPr>
+            <w:tcW w:type="dxa" w:w="4762"/>
+          </w:tcPr>
+          <w:p>
+            <w:pPr>
+              <w:spacing w:after="0"/>
+            </w:pPr>
+            <w:r/>
+            <w:r>
+              <w:rPr>
+                <w:rFonts w:ascii="Noto Sans CJK SC" w:hAnsi="Noto Sans CJK SC" w:eastAsia="Noto Sans CJK SC"/>
+                <w:sz w:val="16"/>
+              </w:rPr>
+              <w:t>takeoff → goto 火情点 → do_action(drop_supply)</w:t>
+            </w:r>
+          </w:p>
+        </w:tc>
+        <w:tc>
+          <w:tcPr>
+            <w:tcW w:type="dxa" w:w="4762"/>
+          </w:tcPr>
+          <w:p>
+            <w:pPr>
+              <w:spacing w:after="0"/>
+            </w:pPr>
+            <w:r/>
+            <w:r>
+              <w:rPr>
+                <w:rFonts w:ascii="Noto Sans CJK SC" w:hAnsi="Noto Sans CJK SC" w:eastAsia="Noto Sans CJK SC"/>
+                <w:sz w:val="16"/>
+              </w:rPr>
+              <w:t>supply_dropped（第 9 点，纯通知）</w:t>
+            </w:r>
+          </w:p>
+        </w:tc>
+      </w:tr>
+      <w:tr>
+        <w:tc>
+          <w:tcPr>
+            <w:tcW w:type="dxa" w:w="1134"/>
+          </w:tcPr>
+          <w:p>
+            <w:pPr>
+              <w:spacing w:after="0"/>
+            </w:pPr>
+            <w:r/>
+            <w:r>
+              <w:rPr>
+                <w:rFonts w:ascii="Noto Sans CJK SC" w:hAnsi="Noto Sans CJK SC" w:eastAsia="Noto Sans CJK SC"/>
+                <w:sz w:val="16"/>
+              </w:rPr>
+              <w:t>t6</w:t>
+            </w:r>
+          </w:p>
+        </w:tc>
+        <w:tc>
+          <w:tcPr>
+            <w:tcW w:type="dxa" w:w="4535"/>
+          </w:tcPr>
+          <w:p>
+            <w:pPr>
+              <w:spacing w:after="0"/>
+            </w:pPr>
+            <w:r/>
+            <w:r>
+              <w:rPr>
+                <w:rFonts w:ascii="Noto Sans CJK SC" w:hAnsi="Noto Sans CJK SC" w:eastAsia="Noto Sans CJK SC"/>
+                <w:sz w:val="16"/>
+              </w:rPr>
+              <w:t>（并发进行中）</w:t>
+            </w:r>
+          </w:p>
+        </w:tc>
+        <w:tc>
+          <w:tcPr>
+            <w:tcW w:type="dxa" w:w="4762"/>
+          </w:tcPr>
+          <w:p>
+            <w:pPr>
+              <w:spacing w:after="0"/>
+            </w:pPr>
+            <w:r/>
+            <w:r>
+              <w:rPr>
+                <w:rFonts w:ascii="Noto Sans CJK SC" w:hAnsi="Noto Sans CJK SC" w:eastAsia="Noto Sans CJK SC"/>
+                <w:sz w:val="16"/>
+              </w:rPr>
+              <w:t>回 STANDBY 继续等待（不降落）</w:t>
+            </w:r>
+          </w:p>
+        </w:tc>
+        <w:tc>
+          <w:tcPr>
+            <w:tcW w:type="dxa" w:w="4762"/>
+          </w:tcPr>
+          <w:p>
+            <w:pPr>
+              <w:spacing w:after="0"/>
+            </w:pPr>
+            <w:r/>
+            <w:r>
+              <w:rPr>
+                <w:rFonts w:ascii="Noto Sans CJK SC" w:hAnsi="Noto Sans CJK SC" w:eastAsia="Noto Sans CJK SC"/>
+                <w:sz w:val="16"/>
+              </w:rPr>
+              <w:t>—</w:t>
+            </w:r>
+          </w:p>
+        </w:tc>
+      </w:tr>
+    </w:tbl>
+    <w:p>
+      <w:pPr>
+        <w:spacing w:after="120"/>
+      </w:pPr>
+    </w:p>
+    <w:p>
+      <w:pPr>
+        <w:spacing w:after="80"/>
+      </w:pPr>
+      <w:r>
+        <w:rPr>
+          <w:rFonts w:ascii="Noto Sans CJK SC" w:hAnsi="Noto Sans CJK SC" w:eastAsia="Noto Sans CJK SC"/>
+          <w:b w:val="0"/>
+          <w:i w:val="0"/>
+          <w:sz w:val="18"/>
+        </w:rPr>
+        <w:t>时序特征：这是一次单向通知 + 双机并发。RECON 广播完坐标立刻回到自己的搜索流程，不阻塞等待 SUPPLY 完成投送。因此 SUPPLY 这条链路（起飞→精降→抓取→复飞→投放）耗时多久都不影响 RECON 的进度。E6 实测该链路精降加抓取约 68.69 秒。</w:t>
+      </w:r>
+    </w:p>
+    <w:p>
+      <w:pPr>
+        <w:pStyle w:val="Heading2"/>
+      </w:pPr>
+      <w:r>
+        <w:rPr>
+          <w:rFonts w:ascii="Noto Sans CJK SC" w:hAnsi="Noto Sans CJK SC" w:eastAsia="Noto Sans CJK SC"/>
+          <w:sz w:val="22"/>
+        </w:rPr>
+        <w:t>14.2 D6 高层火情：三次握手，严格串行</w:t>
+      </w:r>
+    </w:p>
+    <w:tbl>
+      <w:tblPr>
+        <w:tblStyle w:val="TableGrid"/>
+        <w:tblW w:type="auto" w:w="0"/>
+        <w:jc w:val="center"/>
+        <w:tblLook w:firstColumn="1" w:firstRow="1" w:lastColumn="0" w:lastRow="0" w:noHBand="0" w:noVBand="1" w:val="04A0"/>
+      </w:tblPr>
+      <w:tblGrid>
+        <w:gridCol w:w="3784"/>
+        <w:gridCol w:w="3784"/>
+        <w:gridCol w:w="3784"/>
+        <w:gridCol w:w="3784"/>
+      </w:tblGrid>
+      <w:tr>
+        <w:tc>
+          <w:tcPr>
+            <w:tcW w:type="dxa" w:w="1134"/>
+            <w:shd w:val="clear" w:fill="D9E2F3"/>
+          </w:tcPr>
+          <w:p>
+            <w:r/>
+            <w:r>
+              <w:rPr>
+                <w:rFonts w:ascii="Noto Sans CJK SC" w:hAnsi="Noto Sans CJK SC" w:eastAsia="Noto Sans CJK SC"/>
+                <w:b/>
+                <w:sz w:val="17"/>
+              </w:rPr>
+              <w:t>时刻</w:t>
+            </w:r>
+          </w:p>
+        </w:tc>
+        <w:tc>
+          <w:tcPr>
+            <w:tcW w:type="dxa" w:w="4762"/>
+            <w:shd w:val="clear" w:fill="D9E2F3"/>
+          </w:tcPr>
+          <w:p>
+            <w:r/>
+            <w:r>
+              <w:rPr>
+                <w:rFonts w:ascii="Noto Sans CJK SC" w:hAnsi="Noto Sans CJK SC" w:eastAsia="Noto Sans CJK SC"/>
+                <w:b/>
+                <w:sz w:val="17"/>
+              </w:rPr>
+              <w:t>RECON</w:t>
+            </w:r>
+          </w:p>
+        </w:tc>
+        <w:tc>
+          <w:tcPr>
+            <w:tcW w:type="dxa" w:w="4309"/>
+            <w:shd w:val="clear" w:fill="D9E2F3"/>
+          </w:tcPr>
+          <w:p>
+            <w:r/>
+            <w:r>
+              <w:rPr>
+                <w:rFonts w:ascii="Noto Sans CJK SC" w:hAnsi="Noto Sans CJK SC" w:eastAsia="Noto Sans CJK SC"/>
+                <w:b/>
+                <w:sz w:val="17"/>
+              </w:rPr>
+              <w:t>SUPPLY</w:t>
+            </w:r>
+          </w:p>
+        </w:tc>
+        <w:tc>
+          <w:tcPr>
+            <w:tcW w:type="dxa" w:w="4989"/>
+            <w:shd w:val="clear" w:fill="D9E2F3"/>
+          </w:tcPr>
+          <w:p>
+            <w:r/>
+            <w:r>
+              <w:rPr>
+                <w:rFonts w:ascii="Noto Sans CJK SC" w:hAnsi="Noto Sans CJK SC" w:eastAsia="Noto Sans CJK SC"/>
+                <w:b/>
+                <w:sz w:val="17"/>
+              </w:rPr>
+              <w:t>跨机事件</w:t>
+            </w:r>
+          </w:p>
+        </w:tc>
+      </w:tr>
+      <w:tr>
+        <w:tc>
+          <w:tcPr>
+            <w:tcW w:type="dxa" w:w="1134"/>
+          </w:tcPr>
+          <w:p>
+            <w:pPr>
+              <w:spacing w:after="0"/>
+            </w:pPr>
+            <w:r/>
+            <w:r>
+              <w:rPr>
+                <w:rFonts w:ascii="Noto Sans CJK SC" w:hAnsi="Noto Sans CJK SC" w:eastAsia="Noto Sans CJK SC"/>
+                <w:sz w:val="16"/>
+              </w:rPr>
+              <w:t>t0</w:t>
+            </w:r>
+          </w:p>
+        </w:tc>
+        <w:tc>
+          <w:tcPr>
+            <w:tcW w:type="dxa" w:w="4762"/>
+          </w:tcPr>
+          <w:p>
+            <w:pPr>
+              <w:spacing w:after="0"/>
+            </w:pPr>
+            <w:r/>
+            <w:r>
+              <w:rPr>
+                <w:rFonts w:ascii="Noto Sans CJK SC" w:hAnsi="Noto Sans CJK SC" w:eastAsia="Noto Sans CJK SC"/>
+                <w:sz w:val="16"/>
+              </w:rPr>
+              <w:t>绕飞中命中 apriltag:1 → 机载 fire_pillar_aim_node 自动锁定接管</w:t>
+            </w:r>
+          </w:p>
+        </w:tc>
+        <w:tc>
+          <w:tcPr>
+            <w:tcW w:type="dxa" w:w="4309"/>
+          </w:tcPr>
+          <w:p>
+            <w:pPr>
+              <w:spacing w:after="0"/>
+            </w:pPr>
+            <w:r/>
+            <w:r>
+              <w:rPr>
+                <w:rFonts w:ascii="Noto Sans CJK SC" w:hAnsi="Noto Sans CJK SC" w:eastAsia="Noto Sans CJK SC"/>
+                <w:sz w:val="16"/>
+              </w:rPr>
+              <w:t>STANDBY 或仍在处理地面火情</w:t>
+            </w:r>
+          </w:p>
+        </w:tc>
+        <w:tc>
+          <w:tcPr>
+            <w:tcW w:type="dxa" w:w="4989"/>
+          </w:tcPr>
+          <w:p>
+            <w:pPr>
+              <w:spacing w:after="0"/>
+            </w:pPr>
+            <w:r/>
+            <w:r>
+              <w:rPr>
+                <w:rFonts w:ascii="Noto Sans CJK SC" w:hAnsi="Noto Sans CJK SC" w:eastAsia="Noto Sans CJK SC"/>
+                <w:sz w:val="16"/>
+              </w:rPr>
+              <w:t>hr_fire_detected（第 12 点，纯通知）</w:t>
+            </w:r>
+          </w:p>
+        </w:tc>
+      </w:tr>
+      <w:tr>
+        <w:tc>
+          <w:tcPr>
+            <w:tcW w:type="dxa" w:w="1134"/>
+          </w:tcPr>
+          <w:p>
+            <w:pPr>
+              <w:spacing w:after="0"/>
+            </w:pPr>
+            <w:r/>
+            <w:r>
+              <w:rPr>
+                <w:rFonts w:ascii="Noto Sans CJK SC" w:hAnsi="Noto Sans CJK SC" w:eastAsia="Noto Sans CJK SC"/>
+                <w:sz w:val="16"/>
+              </w:rPr>
+              <w:t>t1</w:t>
+            </w:r>
+          </w:p>
+        </w:tc>
+        <w:tc>
+          <w:tcPr>
+            <w:tcW w:type="dxa" w:w="4762"/>
+          </w:tcPr>
+          <w:p>
+            <w:pPr>
+              <w:spacing w:after="0"/>
+            </w:pPr>
+            <w:r/>
+            <w:r>
+              <w:rPr>
+                <w:rFonts w:ascii="Noto Sans CJK SC" w:hAnsi="Noto Sans CJK SC" w:eastAsia="Noto Sans CJK SC"/>
+                <w:sz w:val="16"/>
+              </w:rPr>
+              <w:t>cancel_goto 避免抢控制权 → 读 fire_pillar_staging_pose → 换算世界坐标</w:t>
+            </w:r>
+          </w:p>
+        </w:tc>
+        <w:tc>
+          <w:tcPr>
+            <w:tcW w:type="dxa" w:w="4309"/>
+          </w:tcPr>
+          <w:p>
+            <w:pPr>
+              <w:spacing w:after="0"/>
+            </w:pPr>
+            <w:r/>
+            <w:r>
+              <w:rPr>
+                <w:rFonts w:ascii="Noto Sans CJK SC" w:hAnsi="Noto Sans CJK SC" w:eastAsia="Noto Sans CJK SC"/>
+                <w:sz w:val="16"/>
+              </w:rPr>
+              <w:t>—</w:t>
+            </w:r>
+          </w:p>
+        </w:tc>
+        <w:tc>
+          <w:tcPr>
+            <w:tcW w:type="dxa" w:w="4989"/>
+          </w:tcPr>
+          <w:p>
+            <w:pPr>
+              <w:spacing w:after="0"/>
+            </w:pPr>
+            <w:r/>
+            <w:r>
+              <w:rPr>
+                <w:rFonts w:ascii="Noto Sans CJK SC" w:hAnsi="Noto Sans CJK SC" w:eastAsia="Noto Sans CJK SC"/>
+                <w:sz w:val="16"/>
+              </w:rPr>
+              <w:t>hr_fire_locked(staging_x/y/yaw) → 第 13 点，必需</w:t>
+            </w:r>
+          </w:p>
+        </w:tc>
+      </w:tr>
+      <w:tr>
+        <w:tc>
+          <w:tcPr>
+            <w:tcW w:type="dxa" w:w="1134"/>
+          </w:tcPr>
+          <w:p>
+            <w:pPr>
+              <w:spacing w:after="0"/>
+            </w:pPr>
+            <w:r/>
+            <w:r>
+              <w:rPr>
+                <w:rFonts w:ascii="Noto Sans CJK SC" w:hAnsi="Noto Sans CJK SC" w:eastAsia="Noto Sans CJK SC"/>
+                <w:sz w:val="16"/>
+              </w:rPr>
+              <w:t>t2</w:t>
+            </w:r>
+          </w:p>
+        </w:tc>
+        <w:tc>
+          <w:tcPr>
+            <w:tcW w:type="dxa" w:w="4762"/>
+          </w:tcPr>
+          <w:p>
+            <w:pPr>
+              <w:spacing w:after="0"/>
+            </w:pPr>
+            <w:r/>
+            <w:r>
+              <w:rPr>
+                <w:rFonts w:ascii="Noto Sans CJK SC" w:hAnsi="Noto Sans CJK SC" w:eastAsia="Noto Sans CJK SC"/>
+                <w:sz w:val="16"/>
+              </w:rPr>
+              <w:t>阻塞等待 SUPPLY_READY（代码核实：inbox.wait_for，带超时）</w:t>
+            </w:r>
+          </w:p>
+        </w:tc>
+        <w:tc>
+          <w:tcPr>
+            <w:tcW w:type="dxa" w:w="4309"/>
+          </w:tcPr>
+          <w:p>
+            <w:pPr>
+              <w:spacing w:after="0"/>
+            </w:pPr>
+            <w:r/>
+            <w:r>
+              <w:rPr>
+                <w:rFonts w:ascii="Noto Sans CJK SC" w:hAnsi="Noto Sans CJK SC" w:eastAsia="Noto Sans CJK SC"/>
+                <w:sz w:val="16"/>
+              </w:rPr>
+              <w:t>goto 等待点</w:t>
+            </w:r>
+          </w:p>
+        </w:tc>
+        <w:tc>
+          <w:tcPr>
+            <w:tcW w:type="dxa" w:w="4989"/>
+          </w:tcPr>
+          <w:p>
+            <w:pPr>
+              <w:spacing w:after="0"/>
+            </w:pPr>
+            <w:r/>
+            <w:r>
+              <w:rPr>
+                <w:rFonts w:ascii="Noto Sans CJK SC" w:hAnsi="Noto Sans CJK SC" w:eastAsia="Noto Sans CJK SC"/>
+                <w:sz w:val="16"/>
+              </w:rPr>
+              <w:t>—</w:t>
+            </w:r>
+          </w:p>
+        </w:tc>
+      </w:tr>
+      <w:tr>
+        <w:tc>
+          <w:tcPr>
+            <w:tcW w:type="dxa" w:w="1134"/>
+          </w:tcPr>
+          <w:p>
+            <w:pPr>
+              <w:spacing w:after="0"/>
+            </w:pPr>
+            <w:r/>
+            <w:r>
+              <w:rPr>
+                <w:rFonts w:ascii="Noto Sans CJK SC" w:hAnsi="Noto Sans CJK SC" w:eastAsia="Noto Sans CJK SC"/>
+                <w:sz w:val="16"/>
+              </w:rPr>
+              <w:t>t3</w:t>
+            </w:r>
+          </w:p>
+        </w:tc>
+        <w:tc>
+          <w:tcPr>
+            <w:tcW w:type="dxa" w:w="4762"/>
+          </w:tcPr>
+          <w:p>
+            <w:pPr>
+              <w:spacing w:after="0"/>
+            </w:pPr>
+            <w:r/>
+            <w:r>
+              <w:rPr>
+                <w:rFonts w:ascii="Noto Sans CJK SC" w:hAnsi="Noto Sans CJK SC" w:eastAsia="Noto Sans CJK SC"/>
+                <w:sz w:val="16"/>
+              </w:rPr>
+              <w:t>（等待中）</w:t>
+            </w:r>
+          </w:p>
+        </w:tc>
+        <w:tc>
+          <w:tcPr>
+            <w:tcW w:type="dxa" w:w="4309"/>
+          </w:tcPr>
+          <w:p>
+            <w:pPr>
+              <w:spacing w:after="0"/>
+            </w:pPr>
+            <w:r/>
+            <w:r>
+              <w:rPr>
+                <w:rFonts w:ascii="Noto Sans CJK SC" w:hAnsi="Noto Sans CJK SC" w:eastAsia="Noto Sans CJK SC"/>
+                <w:sz w:val="16"/>
+              </w:rPr>
+              <w:t>抵达等待点后广播</w:t>
+            </w:r>
+          </w:p>
+        </w:tc>
+        <w:tc>
+          <w:tcPr>
+            <w:tcW w:type="dxa" w:w="4989"/>
+          </w:tcPr>
+          <w:p>
+            <w:pPr>
+              <w:spacing w:after="0"/>
+            </w:pPr>
+            <w:r/>
+            <w:r>
+              <w:rPr>
+                <w:rFonts w:ascii="Noto Sans CJK SC" w:hAnsi="Noto Sans CJK SC" w:eastAsia="Noto Sans CJK SC"/>
+                <w:sz w:val="16"/>
+              </w:rPr>
+              <w:t>supply_ready → 第 14 点，必需</w:t>
+            </w:r>
+          </w:p>
+        </w:tc>
+      </w:tr>
+      <w:tr>
+        <w:tc>
+          <w:tcPr>
+            <w:tcW w:type="dxa" w:w="1134"/>
+          </w:tcPr>
+          <w:p>
+            <w:pPr>
+              <w:spacing w:after="0"/>
+            </w:pPr>
+            <w:r/>
+            <w:r>
+              <w:rPr>
+                <w:rFonts w:ascii="Noto Sans CJK SC" w:hAnsi="Noto Sans CJK SC" w:eastAsia="Noto Sans CJK SC"/>
+                <w:sz w:val="16"/>
+              </w:rPr>
+              <w:t>t4</w:t>
+            </w:r>
+          </w:p>
+        </w:tc>
+        <w:tc>
+          <w:tcPr>
+            <w:tcW w:type="dxa" w:w="4762"/>
+          </w:tcPr>
+          <w:p>
+            <w:pPr>
+              <w:spacing w:after="0"/>
+            </w:pPr>
+            <w:r/>
+            <w:r>
+              <w:rPr>
+                <w:rFonts w:ascii="Noto Sans CJK SC" w:hAnsi="Noto Sans CJK SC" w:eastAsia="Noto Sans CJK SC"/>
+                <w:sz w:val="16"/>
+              </w:rPr>
+              <w:t>收到后 do_action(horizontal_launch) → 读 fire_pillar_aim_pose → 广播</w:t>
+            </w:r>
+          </w:p>
+        </w:tc>
+        <w:tc>
+          <w:tcPr>
+            <w:tcW w:type="dxa" w:w="4309"/>
+          </w:tcPr>
+          <w:p>
+            <w:pPr>
+              <w:spacing w:after="0"/>
+            </w:pPr>
+            <w:r/>
+            <w:r>
+              <w:rPr>
+                <w:rFonts w:ascii="Noto Sans CJK SC" w:hAnsi="Noto Sans CJK SC" w:eastAsia="Noto Sans CJK SC"/>
+                <w:sz w:val="16"/>
+              </w:rPr>
+              <w:t>—</w:t>
+            </w:r>
+          </w:p>
+        </w:tc>
+        <w:tc>
+          <w:tcPr>
+            <w:tcW w:type="dxa" w:w="4989"/>
+          </w:tcPr>
+          <w:p>
+            <w:pPr>
+              <w:spacing w:after="0"/>
+            </w:pPr>
+            <w:r/>
+            <w:r>
+              <w:rPr>
+                <w:rFonts w:ascii="Noto Sans CJK SC" w:hAnsi="Noto Sans CJK SC" w:eastAsia="Noto Sans CJK SC"/>
+                <w:sz w:val="16"/>
+              </w:rPr>
+              <w:t>recon_launch_done(aim_x/y/yaw) → 第 15 点，必需</w:t>
+            </w:r>
+          </w:p>
+        </w:tc>
+      </w:tr>
+      <w:tr>
+        <w:tc>
+          <w:tcPr>
+            <w:tcW w:type="dxa" w:w="1134"/>
+          </w:tcPr>
+          <w:p>
+            <w:pPr>
+              <w:spacing w:after="0"/>
+            </w:pPr>
+            <w:r/>
+            <w:r>
+              <w:rPr>
+                <w:rFonts w:ascii="Noto Sans CJK SC" w:hAnsi="Noto Sans CJK SC" w:eastAsia="Noto Sans CJK SC"/>
+                <w:sz w:val="16"/>
+              </w:rPr>
+              <w:t>t5</w:t>
+            </w:r>
+          </w:p>
+        </w:tc>
+        <w:tc>
+          <w:tcPr>
+            <w:tcW w:type="dxa" w:w="4762"/>
+          </w:tcPr>
+          <w:p>
+            <w:pPr>
+              <w:spacing w:after="0"/>
+            </w:pPr>
+            <w:r/>
+            <w:r>
+              <w:rPr>
+                <w:rFonts w:ascii="Noto Sans CJK SC" w:hAnsi="Noto Sans CJK SC" w:eastAsia="Noto Sans CJK SC"/>
+                <w:sz w:val="16"/>
+              </w:rPr>
+              <w:t>reset_aim 解除锁定，交还控制权</w:t>
+            </w:r>
+          </w:p>
+        </w:tc>
+        <w:tc>
+          <w:tcPr>
+            <w:tcW w:type="dxa" w:w="4309"/>
+          </w:tcPr>
+          <w:p>
+            <w:pPr>
+              <w:spacing w:after="0"/>
+            </w:pPr>
+            <w:r/>
+            <w:r>
+              <w:rPr>
+                <w:rFonts w:ascii="Noto Sans CJK SC" w:hAnsi="Noto Sans CJK SC" w:eastAsia="Noto Sans CJK SC"/>
+                <w:sz w:val="16"/>
+              </w:rPr>
+              <w:t>goto 瞄准点 → do_action(horizontal_launch)</w:t>
+            </w:r>
+          </w:p>
+        </w:tc>
+        <w:tc>
+          <w:tcPr>
+            <w:tcW w:type="dxa" w:w="4989"/>
+          </w:tcPr>
+          <w:p>
+            <w:pPr>
+              <w:spacing w:after="0"/>
+            </w:pPr>
+            <w:r/>
+            <w:r>
+              <w:rPr>
+                <w:rFonts w:ascii="Noto Sans CJK SC" w:hAnsi="Noto Sans CJK SC" w:eastAsia="Noto Sans CJK SC"/>
+                <w:sz w:val="16"/>
+              </w:rPr>
+              <w:t>supply_arrived_at_aim_point / supply_launch_done（第 17/18 点，纯通知）</w:t>
+            </w:r>
+          </w:p>
+        </w:tc>
+      </w:tr>
+      <w:tr>
+        <w:tc>
+          <w:tcPr>
+            <w:tcW w:type="dxa" w:w="1134"/>
+          </w:tcPr>
+          <w:p>
+            <w:pPr>
+              <w:spacing w:after="0"/>
+            </w:pPr>
+            <w:r/>
+            <w:r>
+              <w:rPr>
+                <w:rFonts w:ascii="Noto Sans CJK SC" w:hAnsi="Noto Sans CJK SC" w:eastAsia="Noto Sans CJK SC"/>
+                <w:sz w:val="16"/>
+              </w:rPr>
+              <w:t>t6</w:t>
+            </w:r>
+          </w:p>
+        </w:tc>
+        <w:tc>
+          <w:tcPr>
+            <w:tcW w:type="dxa" w:w="4762"/>
+          </w:tcPr>
+          <w:p>
+            <w:pPr>
+              <w:spacing w:after="0"/>
+            </w:pPr>
+            <w:r/>
+            <w:r>
+              <w:rPr>
+                <w:rFonts w:ascii="Noto Sans CJK SC" w:hAnsi="Noto Sans CJK SC" w:eastAsia="Noto Sans CJK SC"/>
+                <w:sz w:val="16"/>
+              </w:rPr>
+              <w:t>返航降落（若两标志位均成立）</w:t>
+            </w:r>
+          </w:p>
+        </w:tc>
+        <w:tc>
+          <w:tcPr>
+            <w:tcW w:type="dxa" w:w="4309"/>
+          </w:tcPr>
+          <w:p>
+            <w:pPr>
+              <w:spacing w:after="0"/>
+            </w:pPr>
+            <w:r/>
+            <w:r>
+              <w:rPr>
+                <w:rFonts w:ascii="Noto Sans CJK SC" w:hAnsi="Noto Sans CJK SC" w:eastAsia="Noto Sans CJK SC"/>
+                <w:sz w:val="16"/>
+              </w:rPr>
+              <w:t>回 STANDBY 或返航降落</w:t>
+            </w:r>
+          </w:p>
+        </w:tc>
+        <w:tc>
+          <w:tcPr>
+            <w:tcW w:type="dxa" w:w="4989"/>
+          </w:tcPr>
+          <w:p>
+            <w:pPr>
+              <w:spacing w:after="0"/>
+            </w:pPr>
+            <w:r/>
+            <w:r>
+              <w:rPr>
+                <w:rFonts w:ascii="Noto Sans CJK SC" w:hAnsi="Noto Sans CJK SC" w:eastAsia="Noto Sans CJK SC"/>
+                <w:sz w:val="16"/>
+              </w:rPr>
+              <w:t>—</w:t>
+            </w:r>
+          </w:p>
+        </w:tc>
+      </w:tr>
+    </w:tbl>
+    <w:p>
+      <w:pPr>
+        <w:spacing w:after="120"/>
+      </w:pPr>
+    </w:p>
+    <w:p>
+      <w:pPr>
+        <w:spacing w:after="80"/>
+      </w:pPr>
+      <w:r>
+        <w:rPr>
+          <w:rFonts w:ascii="Noto Sans CJK SC" w:hAnsi="Noto Sans CJK SC" w:eastAsia="Noto Sans CJK SC"/>
+          <w:b w:val="0"/>
+          <w:i w:val="0"/>
+          <w:sz w:val="18"/>
+        </w:rPr>
+        <w:t>时序特征：t2 是整个任务里唯一一处 RECON 阻塞等待队友的地方，也是最脆弱的一环——若 SUPPLY 因任何原因没能抵达等待点并发出 supply_ready，RECON 会一直等到超时。这也是跨机事件 7/13/14/15 被方案 547 列为"必需"的原因：它们承载的是任务推进的因果，丢一条任务就卡住。</w:t>
+      </w:r>
+    </w:p>
+    <w:p>
+      <w:pPr>
+        <w:pStyle w:val="Heading2"/>
+      </w:pPr>
+      <w:r>
+        <w:rPr>
+          <w:rFonts w:ascii="Noto Sans CJK SC" w:hAnsi="Noto Sans CJK SC" w:eastAsia="Noto Sans CJK SC"/>
+          <w:sz w:val="22"/>
+        </w:rPr>
+        <w:t>14.3 收尾时序与一处缺口</w:t>
+      </w:r>
+    </w:p>
+    <w:tbl>
+      <w:tblPr>
+        <w:tblStyle w:val="TableGrid"/>
+        <w:tblW w:type="auto" w:w="0"/>
+        <w:jc w:val="center"/>
+        <w:tblLook w:firstColumn="1" w:firstRow="1" w:lastColumn="0" w:lastRow="0" w:noHBand="0" w:noVBand="1" w:val="04A0"/>
+      </w:tblPr>
+      <w:tblGrid>
+        <w:gridCol w:w="5046"/>
+        <w:gridCol w:w="5046"/>
+        <w:gridCol w:w="5046"/>
+      </w:tblGrid>
+      <w:tr>
+        <w:tc>
+          <w:tcPr>
+            <w:tcW w:type="dxa" w:w="3969"/>
+            <w:shd w:val="clear" w:fill="D9E2F3"/>
+          </w:tcPr>
+          <w:p>
+            <w:r/>
+            <w:r>
+              <w:rPr>
+                <w:rFonts w:ascii="Noto Sans CJK SC" w:hAnsi="Noto Sans CJK SC" w:eastAsia="Noto Sans CJK SC"/>
+                <w:b/>
+                <w:sz w:val="17"/>
+              </w:rPr>
+              <w:t>条件</w:t>
+            </w:r>
+          </w:p>
+        </w:tc>
+        <w:tc>
+          <w:tcPr>
+            <w:tcW w:type="dxa" w:w="5896"/>
+            <w:shd w:val="clear" w:fill="D9E2F3"/>
+          </w:tcPr>
+          <w:p>
+            <w:r/>
+            <w:r>
+              <w:rPr>
+                <w:rFonts w:ascii="Noto Sans CJK SC" w:hAnsi="Noto Sans CJK SC" w:eastAsia="Noto Sans CJK SC"/>
+                <w:b/>
+                <w:sz w:val="17"/>
+              </w:rPr>
+              <w:t>RECON</w:t>
+            </w:r>
+          </w:p>
+        </w:tc>
+        <w:tc>
+          <w:tcPr>
+            <w:tcW w:type="dxa" w:w="5329"/>
+            <w:shd w:val="clear" w:fill="D9E2F3"/>
+          </w:tcPr>
+          <w:p>
+            <w:r/>
+            <w:r>
+              <w:rPr>
+                <w:rFonts w:ascii="Noto Sans CJK SC" w:hAnsi="Noto Sans CJK SC" w:eastAsia="Noto Sans CJK SC"/>
+                <w:b/>
+                <w:sz w:val="17"/>
+              </w:rPr>
+              <w:t>SUPPLY</w:t>
+            </w:r>
+          </w:p>
+        </w:tc>
+      </w:tr>
+      <w:tr>
+        <w:tc>
+          <w:tcPr>
+            <w:tcW w:type="dxa" w:w="3969"/>
+          </w:tcPr>
+          <w:p>
+            <w:pPr>
+              <w:spacing w:after="0"/>
+            </w:pPr>
+            <w:r/>
+            <w:r>
+              <w:rPr>
+                <w:rFonts w:ascii="Noto Sans CJK SC" w:hAnsi="Noto Sans CJK SC" w:eastAsia="Noto Sans CJK SC"/>
+                <w:sz w:val="16"/>
+              </w:rPr>
+              <w:t>ground_fire_done 且 hr_fire_done 均成立</w:t>
+            </w:r>
+          </w:p>
+        </w:tc>
+        <w:tc>
+          <w:tcPr>
+            <w:tcW w:type="dxa" w:w="5896"/>
+          </w:tcPr>
+          <w:p>
+            <w:pPr>
+              <w:spacing w:after="0"/>
+            </w:pPr>
+            <w:r/>
+            <w:r>
+              <w:rPr>
+                <w:rFonts w:ascii="Noto Sans CJK SC" w:hAnsi="Noto Sans CJK SC" w:eastAsia="Noto Sans CJK SC"/>
+                <w:sz w:val="16"/>
+              </w:rPr>
+              <w:t>返航起降点 → land → done:recon_landed（第 16 点）→ done:mission_complete（第 20 点）</w:t>
+            </w:r>
+          </w:p>
+        </w:tc>
+        <w:tc>
+          <w:tcPr>
+            <w:tcW w:type="dxa" w:w="5329"/>
+          </w:tcPr>
+          <w:p>
+            <w:pPr>
+              <w:spacing w:after="0"/>
+            </w:pPr>
+            <w:r/>
+            <w:r>
+              <w:rPr>
+                <w:rFonts w:ascii="Noto Sans CJK SC" w:hAnsi="Noto Sans CJK SC" w:eastAsia="Noto Sans CJK SC"/>
+                <w:sz w:val="16"/>
+              </w:rPr>
+              <w:t>统一在 STANDBY 循环末尾 goto 自己起降点 → land → done:supply_landed（第 19 点）</w:t>
+            </w:r>
+          </w:p>
+        </w:tc>
+      </w:tr>
+    </w:tbl>
+    <w:p>
+      <w:pPr>
+        <w:spacing w:after="120"/>
+      </w:pPr>
+    </w:p>
+    <w:tbl>
+      <w:tblPr>
+        <w:tblStyle w:val="TableGrid"/>
+        <w:tblW w:type="auto" w:w="0"/>
+        <w:jc w:val="center"/>
+        <w:tblLook w:firstColumn="1" w:firstRow="1" w:lastColumn="0" w:lastRow="0" w:noHBand="0" w:noVBand="1" w:val="04A0"/>
+      </w:tblPr>
+      <w:tblGrid>
+        <w:gridCol w:w="5046"/>
+        <w:gridCol w:w="5046"/>
+        <w:gridCol w:w="5046"/>
+      </w:tblGrid>
+      <w:tr>
+        <w:tc>
+          <w:tcPr>
+            <w:tcW w:type="dxa" w:w="3175"/>
+            <w:shd w:val="clear" w:fill="D9E2F3"/>
+          </w:tcPr>
+          <w:p>
+            <w:r/>
+            <w:r>
+              <w:rPr>
+                <w:rFonts w:ascii="Noto Sans CJK SC" w:hAnsi="Noto Sans CJK SC" w:eastAsia="Noto Sans CJK SC"/>
+                <w:b/>
+                <w:sz w:val="17"/>
+              </w:rPr>
+              <w:t>缺口</w:t>
+            </w:r>
+          </w:p>
+        </w:tc>
+        <w:tc>
+          <w:tcPr>
+            <w:tcW w:type="dxa" w:w="7937"/>
+            <w:shd w:val="clear" w:fill="D9E2F3"/>
+          </w:tcPr>
+          <w:p>
+            <w:r/>
+            <w:r>
+              <w:rPr>
+                <w:rFonts w:ascii="Noto Sans CJK SC" w:hAnsi="Noto Sans CJK SC" w:eastAsia="Noto Sans CJK SC"/>
+                <w:b/>
+                <w:sz w:val="17"/>
+              </w:rPr>
+              <w:t>说明</w:t>
+            </w:r>
+          </w:p>
+        </w:tc>
+        <w:tc>
+          <w:tcPr>
+            <w:tcW w:type="dxa" w:w="4082"/>
+            <w:shd w:val="clear" w:fill="D9E2F3"/>
+          </w:tcPr>
+          <w:p>
+            <w:r/>
+            <w:r>
+              <w:rPr>
+                <w:rFonts w:ascii="Noto Sans CJK SC" w:hAnsi="Noto Sans CJK SC" w:eastAsia="Noto Sans CJK SC"/>
+                <w:b/>
+                <w:sz w:val="17"/>
+              </w:rPr>
+              <w:t>影响</w:t>
+            </w:r>
+          </w:p>
+        </w:tc>
+      </w:tr>
+      <w:tr>
+        <w:tc>
+          <w:tcPr>
+            <w:tcW w:type="dxa" w:w="3175"/>
+          </w:tcPr>
+          <w:p>
+            <w:pPr>
+              <w:spacing w:after="0"/>
+            </w:pPr>
+            <w:r/>
+            <w:r>
+              <w:rPr>
+                <w:rFonts w:ascii="Noto Sans CJK SC" w:hAnsi="Noto Sans CJK SC" w:eastAsia="Noto Sans CJK SC"/>
+                <w:sz w:val="16"/>
+              </w:rPr>
+              <w:t>缺一个"两火情均完成"的跨机同步事件</w:t>
+            </w:r>
+          </w:p>
+        </w:tc>
+        <w:tc>
+          <w:tcPr>
+            <w:tcW w:type="dxa" w:w="7937"/>
+          </w:tcPr>
+          <w:p>
+            <w:pPr>
+              <w:spacing w:after="0"/>
+            </w:pPr>
+            <w:r/>
+            <w:r>
+              <w:rPr>
+                <w:rFonts w:ascii="Noto Sans CJK SC" w:hAnsi="Noto Sans CJK SC" w:eastAsia="Noto Sans CJK SC"/>
+                <w:sz w:val="16"/>
+              </w:rPr>
+              <w:t>方案 511 订正为"两子流程各自完成后都不立即降落，回 STANDBY 继续等，两个标志位都成立后 SUPPLY 才统一降落一次"，并指出"需要一个额外的跨机同步事件让 SUPPLY 知道两个都做完了"；但 4.1 词汇表（方案 440–443）与 20 点表（方案 532–545）都没有这条，代码中也没有</w:t>
+            </w:r>
+          </w:p>
+        </w:tc>
+        <w:tc>
+          <w:tcPr>
+            <w:tcW w:type="dxa" w:w="4082"/>
+          </w:tcPr>
+          <w:p>
+            <w:pPr>
+              <w:spacing w:after="0"/>
+            </w:pPr>
+            <w:r/>
+            <w:r>
+              <w:rPr>
+                <w:rFonts w:ascii="Noto Sans CJK SC" w:hAnsi="Noto Sans CJK SC" w:eastAsia="Noto Sans CJK SC"/>
+                <w:sz w:val="16"/>
+              </w:rPr>
+              <w:t>两个火情标志位都汇聚在 RECON 侧，SUPPLY 无从得知；直接影响 E4 双机收尾同步。建议在 mission_vocab.py 增补一个常量，由 RECON 在两标志位成立时发出</w:t>
+            </w:r>
+          </w:p>
+        </w:tc>
+      </w:tr>
+    </w:tbl>
+    <w:p>
+      <w:pPr>
+        <w:spacing w:after="120"/>
+      </w:pPr>
+    </w:p>
+    <w:p>
+      <w:pPr>
+        <w:pStyle w:val="Heading2"/>
+      </w:pPr>
+      <w:r>
+        <w:rPr>
+          <w:rFonts w:ascii="Noto Sans CJK SC" w:hAnsi="Noto Sans CJK SC" w:eastAsia="Noto Sans CJK SC"/>
+          <w:sz w:val="22"/>
+        </w:rPr>
+        <w:t>14.4 并发与等待关系总览</w:t>
+      </w:r>
+    </w:p>
+    <w:tbl>
+      <w:tblPr>
+        <w:tblStyle w:val="TableGrid"/>
+        <w:tblW w:type="auto" w:w="0"/>
+        <w:jc w:val="center"/>
+        <w:tblLook w:firstColumn="1" w:firstRow="1" w:lastColumn="0" w:lastRow="0" w:noHBand="0" w:noVBand="1" w:val="04A0"/>
+      </w:tblPr>
+      <w:tblGrid>
+        <w:gridCol w:w="3784"/>
+        <w:gridCol w:w="3784"/>
+        <w:gridCol w:w="3784"/>
+        <w:gridCol w:w="3784"/>
+      </w:tblGrid>
+      <w:tr>
+        <w:tc>
+          <w:tcPr>
+            <w:tcW w:type="dxa" w:w="2041"/>
+            <w:shd w:val="clear" w:fill="D9E2F3"/>
+          </w:tcPr>
+          <w:p>
+            <w:r/>
+            <w:r>
+              <w:rPr>
+                <w:rFonts w:ascii="Noto Sans CJK SC" w:hAnsi="Noto Sans CJK SC" w:eastAsia="Noto Sans CJK SC"/>
+                <w:b/>
+                <w:sz w:val="17"/>
+              </w:rPr>
+              <w:t>阶段</w:t>
+            </w:r>
+          </w:p>
+        </w:tc>
+        <w:tc>
+          <w:tcPr>
+            <w:tcW w:type="dxa" w:w="4535"/>
+            <w:shd w:val="clear" w:fill="D9E2F3"/>
+          </w:tcPr>
+          <w:p>
+            <w:r/>
+            <w:r>
+              <w:rPr>
+                <w:rFonts w:ascii="Noto Sans CJK SC" w:hAnsi="Noto Sans CJK SC" w:eastAsia="Noto Sans CJK SC"/>
+                <w:b/>
+                <w:sz w:val="17"/>
+              </w:rPr>
+              <w:t>双机关系</w:t>
+            </w:r>
+          </w:p>
+        </w:tc>
+        <w:tc>
+          <w:tcPr>
+            <w:tcW w:type="dxa" w:w="3628"/>
+            <w:shd w:val="clear" w:fill="D9E2F3"/>
+          </w:tcPr>
+          <w:p>
+            <w:r/>
+            <w:r>
+              <w:rPr>
+                <w:rFonts w:ascii="Noto Sans CJK SC" w:hAnsi="Noto Sans CJK SC" w:eastAsia="Noto Sans CJK SC"/>
+                <w:b/>
+                <w:sz w:val="17"/>
+              </w:rPr>
+              <w:t>阻塞点</w:t>
+            </w:r>
+          </w:p>
+        </w:tc>
+        <w:tc>
+          <w:tcPr>
+            <w:tcW w:type="dxa" w:w="5102"/>
+            <w:shd w:val="clear" w:fill="D9E2F3"/>
+          </w:tcPr>
+          <w:p>
+            <w:r/>
+            <w:r>
+              <w:rPr>
+                <w:rFonts w:ascii="Noto Sans CJK SC" w:hAnsi="Noto Sans CJK SC" w:eastAsia="Noto Sans CJK SC"/>
+                <w:b/>
+                <w:sz w:val="17"/>
+              </w:rPr>
+              <w:t>若消息丢失的后果</w:t>
+            </w:r>
+          </w:p>
+        </w:tc>
+      </w:tr>
+      <w:tr>
+        <w:tc>
+          <w:tcPr>
+            <w:tcW w:type="dxa" w:w="2041"/>
+          </w:tcPr>
+          <w:p>
+            <w:pPr>
+              <w:spacing w:after="0"/>
+            </w:pPr>
+            <w:r/>
+            <w:r>
+              <w:rPr>
+                <w:rFonts w:ascii="Noto Sans CJK SC" w:hAnsi="Noto Sans CJK SC" w:eastAsia="Noto Sans CJK SC"/>
+                <w:sz w:val="16"/>
+              </w:rPr>
+              <w:t>D3 航线编队</w:t>
+            </w:r>
+          </w:p>
+        </w:tc>
+        <w:tc>
+          <w:tcPr>
+            <w:tcW w:type="dxa" w:w="4535"/>
+          </w:tcPr>
+          <w:p>
+            <w:pPr>
+              <w:spacing w:after="0"/>
+            </w:pPr>
+            <w:r/>
+            <w:r>
+              <w:rPr>
+                <w:rFonts w:ascii="Noto Sans CJK SC" w:hAnsi="Noto Sans CJK SC" w:eastAsia="Noto Sans CJK SC"/>
+                <w:sz w:val="16"/>
+              </w:rPr>
+              <w:t>并发：长机飞航线，跟随者实时跟踪</w:t>
+            </w:r>
+          </w:p>
+        </w:tc>
+        <w:tc>
+          <w:tcPr>
+            <w:tcW w:type="dxa" w:w="3628"/>
+          </w:tcPr>
+          <w:p>
+            <w:pPr>
+              <w:spacing w:after="0"/>
+            </w:pPr>
+            <w:r/>
+            <w:r>
+              <w:rPr>
+                <w:rFonts w:ascii="Noto Sans CJK SC" w:hAnsi="Noto Sans CJK SC" w:eastAsia="Noto Sans CJK SC"/>
+                <w:sz w:val="16"/>
+              </w:rPr>
+              <w:t>无（跟随是机载闭环）</w:t>
+            </w:r>
+          </w:p>
+        </w:tc>
+        <w:tc>
+          <w:tcPr>
+            <w:tcW w:type="dxa" w:w="5102"/>
+          </w:tcPr>
+          <w:p>
+            <w:pPr>
+              <w:spacing w:after="0"/>
+            </w:pPr>
+            <w:r/>
+            <w:r>
+              <w:rPr>
+                <w:rFonts w:ascii="Noto Sans CJK SC" w:hAnsi="Noto Sans CJK SC" w:eastAsia="Noto Sans CJK SC"/>
+                <w:sz w:val="16"/>
+              </w:rPr>
+              <w:t>编队质量下降，但任务不卡</w:t>
+            </w:r>
+          </w:p>
+        </w:tc>
+      </w:tr>
+      <w:tr>
+        <w:tc>
+          <w:tcPr>
+            <w:tcW w:type="dxa" w:w="2041"/>
+          </w:tcPr>
+          <w:p>
+            <w:pPr>
+              <w:spacing w:after="0"/>
+            </w:pPr>
+            <w:r/>
+            <w:r>
+              <w:rPr>
+                <w:rFonts w:ascii="Noto Sans CJK SC" w:hAnsi="Noto Sans CJK SC" w:eastAsia="Noto Sans CJK SC"/>
+                <w:sz w:val="16"/>
+              </w:rPr>
+              <w:t>D5 地面火情</w:t>
+            </w:r>
+          </w:p>
+        </w:tc>
+        <w:tc>
+          <w:tcPr>
+            <w:tcW w:type="dxa" w:w="4535"/>
+          </w:tcPr>
+          <w:p>
+            <w:pPr>
+              <w:spacing w:after="0"/>
+            </w:pPr>
+            <w:r/>
+            <w:r>
+              <w:rPr>
+                <w:rFonts w:ascii="Noto Sans CJK SC" w:hAnsi="Noto Sans CJK SC" w:eastAsia="Noto Sans CJK SC"/>
+                <w:sz w:val="16"/>
+              </w:rPr>
+              <w:t>并发：RECON 继续搜索，SUPPLY 独立完成投送链路</w:t>
+            </w:r>
+          </w:p>
+        </w:tc>
+        <w:tc>
+          <w:tcPr>
+            <w:tcW w:type="dxa" w:w="3628"/>
+          </w:tcPr>
+          <w:p>
+            <w:pPr>
+              <w:spacing w:after="0"/>
+            </w:pPr>
+            <w:r/>
+            <w:r>
+              <w:rPr>
+                <w:rFonts w:ascii="Noto Sans CJK SC" w:hAnsi="Noto Sans CJK SC" w:eastAsia="Noto Sans CJK SC"/>
+                <w:sz w:val="16"/>
+              </w:rPr>
+              <w:t>无</w:t>
+            </w:r>
+          </w:p>
+        </w:tc>
+        <w:tc>
+          <w:tcPr>
+            <w:tcW w:type="dxa" w:w="5102"/>
+          </w:tcPr>
+          <w:p>
+            <w:pPr>
+              <w:spacing w:after="0"/>
+            </w:pPr>
+            <w:r/>
+            <w:r>
+              <w:rPr>
+                <w:rFonts w:ascii="Noto Sans CJK SC" w:hAnsi="Noto Sans CJK SC" w:eastAsia="Noto Sans CJK SC"/>
+                <w:sz w:val="16"/>
+              </w:rPr>
+              <w:t>第 7 点丢 → SUPPLY 永远不知道火情坐标，地面火情任务失败</w:t>
+            </w:r>
+          </w:p>
+        </w:tc>
+      </w:tr>
+      <w:tr>
+        <w:tc>
+          <w:tcPr>
+            <w:tcW w:type="dxa" w:w="2041"/>
+          </w:tcPr>
+          <w:p>
+            <w:pPr>
+              <w:spacing w:after="0"/>
+            </w:pPr>
+            <w:r/>
+            <w:r>
+              <w:rPr>
+                <w:rFonts w:ascii="Noto Sans CJK SC" w:hAnsi="Noto Sans CJK SC" w:eastAsia="Noto Sans CJK SC"/>
+                <w:sz w:val="16"/>
+              </w:rPr>
+              <w:t>D6 高层火情</w:t>
+            </w:r>
+          </w:p>
+        </w:tc>
+        <w:tc>
+          <w:tcPr>
+            <w:tcW w:type="dxa" w:w="4535"/>
+          </w:tcPr>
+          <w:p>
+            <w:pPr>
+              <w:spacing w:after="0"/>
+            </w:pPr>
+            <w:r/>
+            <w:r>
+              <w:rPr>
+                <w:rFonts w:ascii="Noto Sans CJK SC" w:hAnsi="Noto Sans CJK SC" w:eastAsia="Noto Sans CJK SC"/>
+                <w:sz w:val="16"/>
+              </w:rPr>
+              <w:t>串行：三次握手，13 → 14 → 15 依次推进</w:t>
+            </w:r>
+          </w:p>
+        </w:tc>
+        <w:tc>
+          <w:tcPr>
+            <w:tcW w:type="dxa" w:w="3628"/>
+          </w:tcPr>
+          <w:p>
+            <w:pPr>
+              <w:spacing w:after="0"/>
+            </w:pPr>
+            <w:r/>
+            <w:r>
+              <w:rPr>
+                <w:rFonts w:ascii="Noto Sans CJK SC" w:hAnsi="Noto Sans CJK SC" w:eastAsia="Noto Sans CJK SC"/>
+                <w:sz w:val="16"/>
+              </w:rPr>
+              <w:t>t2：RECON 阻塞等 supply_ready</w:t>
+            </w:r>
+          </w:p>
+        </w:tc>
+        <w:tc>
+          <w:tcPr>
+            <w:tcW w:type="dxa" w:w="5102"/>
+          </w:tcPr>
+          <w:p>
+            <w:pPr>
+              <w:spacing w:after="0"/>
+            </w:pPr>
+            <w:r/>
+            <w:r>
+              <w:rPr>
+                <w:rFonts w:ascii="Noto Sans CJK SC" w:hAnsi="Noto Sans CJK SC" w:eastAsia="Noto Sans CJK SC"/>
+                <w:sz w:val="16"/>
+              </w:rPr>
+              <w:t>13/14/15 任一条丢 → 握手中断，RECON 或 SUPPLY 卡在等待直至超时</w:t>
+            </w:r>
+          </w:p>
+        </w:tc>
+      </w:tr>
+      <w:tr>
+        <w:tc>
+          <w:tcPr>
+            <w:tcW w:type="dxa" w:w="2041"/>
+          </w:tcPr>
+          <w:p>
+            <w:pPr>
+              <w:spacing w:after="0"/>
+            </w:pPr>
+            <w:r/>
+            <w:r>
+              <w:rPr>
+                <w:rFonts w:ascii="Noto Sans CJK SC" w:hAnsi="Noto Sans CJK SC" w:eastAsia="Noto Sans CJK SC"/>
+                <w:sz w:val="16"/>
+              </w:rPr>
+              <w:t>收尾</w:t>
+            </w:r>
+          </w:p>
+        </w:tc>
+        <w:tc>
+          <w:tcPr>
+            <w:tcW w:type="dxa" w:w="4535"/>
+          </w:tcPr>
+          <w:p>
+            <w:pPr>
+              <w:spacing w:after="0"/>
+            </w:pPr>
+            <w:r/>
+            <w:r>
+              <w:rPr>
+                <w:rFonts w:ascii="Noto Sans CJK SC" w:hAnsi="Noto Sans CJK SC" w:eastAsia="Noto Sans CJK SC"/>
+                <w:sz w:val="16"/>
+              </w:rPr>
+              <w:t>需要汇合：两标志位均成立</w:t>
+            </w:r>
+          </w:p>
+        </w:tc>
+        <w:tc>
+          <w:tcPr>
+            <w:tcW w:type="dxa" w:w="3628"/>
+          </w:tcPr>
+          <w:p>
+            <w:pPr>
+              <w:spacing w:after="0"/>
+            </w:pPr>
+            <w:r/>
+            <w:r>
+              <w:rPr>
+                <w:rFonts w:ascii="Noto Sans CJK SC" w:hAnsi="Noto Sans CJK SC" w:eastAsia="Noto Sans CJK SC"/>
+                <w:sz w:val="16"/>
+              </w:rPr>
+              <w:t>SUPPLY 在 STANDBY 循环等待</w:t>
+            </w:r>
+          </w:p>
+        </w:tc>
+        <w:tc>
+          <w:tcPr>
+            <w:tcW w:type="dxa" w:w="5102"/>
+          </w:tcPr>
+          <w:p>
+            <w:pPr>
+              <w:spacing w:after="0"/>
+            </w:pPr>
+            <w:r/>
+            <w:r>
+              <w:rPr>
+                <w:rFonts w:ascii="Noto Sans CJK SC" w:hAnsi="Noto Sans CJK SC" w:eastAsia="Noto Sans CJK SC"/>
+                <w:sz w:val="16"/>
+              </w:rPr>
+              <w:t>缺同步事件（见 14.3），SUPPLY 可能无法正确判断退出时机</w:t>
+            </w:r>
+          </w:p>
+        </w:tc>
+      </w:tr>
+    </w:tbl>
+    <w:p>
+      <w:pPr>
+        <w:spacing w:after="120"/>
+      </w:pPr>
+    </w:p>
+    <w:p>
+      <w:r>
+        <w:br w:type="page"/>
+      </w:r>
+    </w:p>
+    <w:p>
+      <w:pPr>
+        <w:pStyle w:val="Heading1"/>
+      </w:pPr>
+      <w:r>
+        <w:rPr>
+          <w:rFonts w:ascii="Noto Sans CJK SC" w:hAnsi="Noto Sans CJK SC" w:eastAsia="Noto Sans CJK SC"/>
+          <w:sz w:val="28"/>
+        </w:rPr>
+        <w:t>十五、方法论：从时序推导代码归属</w:t>
+      </w:r>
+    </w:p>
+    <w:p>
+      <w:pPr>
+        <w:spacing w:after="80"/>
+      </w:pPr>
+      <w:r>
+        <w:rPr>
+          <w:rFonts w:ascii="Noto Sans CJK SC" w:hAnsi="Noto Sans CJK SC" w:eastAsia="Noto Sans CJK SC"/>
+          <w:b w:val="0"/>
+          <w:i w:val="0"/>
+          <w:sz w:val="18"/>
+        </w:rPr>
+        <w:t>模块该放机载还是地面，不靠经验判断，而是从时序里读出来的——时序把"回路"暴露出来，看到回路就能量出它的周期、数据量和断链行为，归属随即确定。方案 1.0 节给的是原则，本章给的是应用这条原则的操作步骤。</w:t>
+      </w:r>
+    </w:p>
+    <w:p>
+      <w:pPr>
+        <w:pStyle w:val="Heading2"/>
+      </w:pPr>
+      <w:r>
+        <w:rPr>
+          <w:rFonts w:ascii="Noto Sans CJK SC" w:hAnsi="Noto Sans CJK SC" w:eastAsia="Noto Sans CJK SC"/>
+          <w:sz w:val="22"/>
+        </w:rPr>
+        <w:t>15.1 对每条回路问三个问题</w:t>
+      </w:r>
+    </w:p>
+    <w:tbl>
+      <w:tblPr>
+        <w:tblStyle w:val="TableGrid"/>
+        <w:tblW w:type="auto" w:w="0"/>
+        <w:jc w:val="center"/>
+        <w:tblLook w:firstColumn="1" w:firstRow="1" w:lastColumn="0" w:lastRow="0" w:noHBand="0" w:noVBand="1" w:val="04A0"/>
+      </w:tblPr>
+      <w:tblGrid>
+        <w:gridCol w:w="3784"/>
+        <w:gridCol w:w="3784"/>
+        <w:gridCol w:w="3784"/>
+        <w:gridCol w:w="3784"/>
+      </w:tblGrid>
+      <w:tr>
+        <w:tc>
+          <w:tcPr>
+            <w:tcW w:type="dxa" w:w="454"/>
+            <w:shd w:val="clear" w:fill="D9E2F3"/>
+          </w:tcPr>
+          <w:p>
+            <w:r/>
+            <w:r>
+              <w:rPr>
+                <w:rFonts w:ascii="Noto Sans CJK SC" w:hAnsi="Noto Sans CJK SC" w:eastAsia="Noto Sans CJK SC"/>
+                <w:b/>
+                <w:sz w:val="17"/>
+              </w:rPr>
+              <w:t>#</w:t>
+            </w:r>
+          </w:p>
+        </w:tc>
+        <w:tc>
+          <w:tcPr>
+            <w:tcW w:type="dxa" w:w="4309"/>
+            <w:shd w:val="clear" w:fill="D9E2F3"/>
+          </w:tcPr>
+          <w:p>
+            <w:r/>
+            <w:r>
+              <w:rPr>
+                <w:rFonts w:ascii="Noto Sans CJK SC" w:hAnsi="Noto Sans CJK SC" w:eastAsia="Noto Sans CJK SC"/>
+                <w:b/>
+                <w:sz w:val="17"/>
+              </w:rPr>
+              <w:t>问题</w:t>
+            </w:r>
+          </w:p>
+        </w:tc>
+        <w:tc>
+          <w:tcPr>
+            <w:tcW w:type="dxa" w:w="3061"/>
+            <w:shd w:val="clear" w:fill="D9E2F3"/>
+          </w:tcPr>
+          <w:p>
+            <w:r/>
+            <w:r>
+              <w:rPr>
+                <w:rFonts w:ascii="Noto Sans CJK SC" w:hAnsi="Noto Sans CJK SC" w:eastAsia="Noto Sans CJK SC"/>
+                <w:b/>
+                <w:sz w:val="17"/>
+              </w:rPr>
+              <w:t>判据</w:t>
+            </w:r>
+          </w:p>
+        </w:tc>
+        <w:tc>
+          <w:tcPr>
+            <w:tcW w:type="dxa" w:w="7257"/>
+            <w:shd w:val="clear" w:fill="D9E2F3"/>
+          </w:tcPr>
+          <w:p>
+            <w:r/>
+            <w:r>
+              <w:rPr>
+                <w:rFonts w:ascii="Noto Sans CJK SC" w:hAnsi="Noto Sans CJK SC" w:eastAsia="Noto Sans CJK SC"/>
+                <w:b/>
+                <w:sz w:val="17"/>
+              </w:rPr>
+              <w:t>结论</w:t>
+            </w:r>
+          </w:p>
+        </w:tc>
+      </w:tr>
+      <w:tr>
+        <w:tc>
+          <w:tcPr>
+            <w:tcW w:type="dxa" w:w="454"/>
+          </w:tcPr>
+          <w:p>
+            <w:pPr>
+              <w:spacing w:after="0"/>
+            </w:pPr>
+            <w:r/>
+            <w:r>
+              <w:rPr>
+                <w:rFonts w:ascii="Noto Sans CJK SC" w:hAnsi="Noto Sans CJK SC" w:eastAsia="Noto Sans CJK SC"/>
+                <w:sz w:val="16"/>
+              </w:rPr>
+              <w:t>1</w:t>
+            </w:r>
+          </w:p>
+        </w:tc>
+        <w:tc>
+          <w:tcPr>
+            <w:tcW w:type="dxa" w:w="4309"/>
+          </w:tcPr>
+          <w:p>
+            <w:pPr>
+              <w:spacing w:after="0"/>
+            </w:pPr>
+            <w:r/>
+            <w:r>
+              <w:rPr>
+                <w:rFonts w:ascii="Noto Sans CJK SC" w:hAnsi="Noto Sans CJK SC" w:eastAsia="Noto Sans CJK SC"/>
+                <w:sz w:val="16"/>
+              </w:rPr>
+              <w:t>这条回路的周期或延迟预算是多少？</w:t>
+            </w:r>
+          </w:p>
+        </w:tc>
+        <w:tc>
+          <w:tcPr>
+            <w:tcW w:type="dxa" w:w="3061"/>
+          </w:tcPr>
+          <w:p>
+            <w:pPr>
+              <w:spacing w:after="0"/>
+            </w:pPr>
+            <w:r/>
+            <w:r>
+              <w:rPr>
+                <w:rFonts w:ascii="Noto Sans CJK SC" w:hAnsi="Noto Sans CJK SC" w:eastAsia="Noto Sans CJK SC"/>
+                <w:sz w:val="16"/>
+              </w:rPr>
+              <w:t>小于约 200 毫秒</w:t>
+            </w:r>
+          </w:p>
+        </w:tc>
+        <w:tc>
+          <w:tcPr>
+            <w:tcW w:type="dxa" w:w="7257"/>
+          </w:tcPr>
+          <w:p>
+            <w:pPr>
+              <w:spacing w:after="0"/>
+            </w:pPr>
+            <w:r/>
+            <w:r>
+              <w:rPr>
+                <w:rFonts w:ascii="Noto Sans CJK SC" w:hAnsi="Noto Sans CJK SC" w:eastAsia="Noto Sans CJK SC"/>
+                <w:sz w:val="16"/>
+              </w:rPr>
+              <w:t>必须机载。跨链路每周期要承受一次往返，控制质量直接下降</w:t>
+            </w:r>
+          </w:p>
+        </w:tc>
+      </w:tr>
+      <w:tr>
+        <w:tc>
+          <w:tcPr>
+            <w:tcW w:type="dxa" w:w="454"/>
+          </w:tcPr>
+          <w:p>
+            <w:pPr>
+              <w:spacing w:after="0"/>
+            </w:pPr>
+            <w:r/>
+            <w:r>
+              <w:rPr>
+                <w:rFonts w:ascii="Noto Sans CJK SC" w:hAnsi="Noto Sans CJK SC" w:eastAsia="Noto Sans CJK SC"/>
+                <w:sz w:val="16"/>
+              </w:rPr>
+              <w:t>2</w:t>
+            </w:r>
+          </w:p>
+        </w:tc>
+        <w:tc>
+          <w:tcPr>
+            <w:tcW w:type="dxa" w:w="4309"/>
+          </w:tcPr>
+          <w:p>
+            <w:pPr>
+              <w:spacing w:after="0"/>
+            </w:pPr>
+            <w:r/>
+            <w:r>
+              <w:rPr>
+                <w:rFonts w:ascii="Noto Sans CJK SC" w:hAnsi="Noto Sans CJK SC" w:eastAsia="Noto Sans CJK SC"/>
+                <w:sz w:val="16"/>
+              </w:rPr>
+              <w:t>这条回路要搬多少数据？</w:t>
+            </w:r>
+          </w:p>
+        </w:tc>
+        <w:tc>
+          <w:tcPr>
+            <w:tcW w:type="dxa" w:w="3061"/>
+          </w:tcPr>
+          <w:p>
+            <w:pPr>
+              <w:spacing w:after="0"/>
+            </w:pPr>
+            <w:r/>
+            <w:r>
+              <w:rPr>
+                <w:rFonts w:ascii="Noto Sans CJK SC" w:hAnsi="Noto Sans CJK SC" w:eastAsia="Noto Sans CJK SC"/>
+                <w:sz w:val="16"/>
+              </w:rPr>
+              <w:t>超过链路可承受带宽</w:t>
+            </w:r>
+          </w:p>
+        </w:tc>
+        <w:tc>
+          <w:tcPr>
+            <w:tcW w:type="dxa" w:w="7257"/>
+          </w:tcPr>
+          <w:p>
+            <w:pPr>
+              <w:spacing w:after="0"/>
+            </w:pPr>
+            <w:r/>
+            <w:r>
+              <w:rPr>
+                <w:rFonts w:ascii="Noto Sans CJK SC" w:hAnsi="Noto Sans CJK SC" w:eastAsia="Noto Sans CJK SC"/>
+                <w:sz w:val="16"/>
+              </w:rPr>
+              <w:t>必须机载。原始数据在机载消费掉，只把结论送出去</w:t>
+            </w:r>
+          </w:p>
+        </w:tc>
+      </w:tr>
+      <w:tr>
+        <w:tc>
+          <w:tcPr>
+            <w:tcW w:type="dxa" w:w="454"/>
+          </w:tcPr>
+          <w:p>
+            <w:pPr>
+              <w:spacing w:after="0"/>
+            </w:pPr>
+            <w:r/>
+            <w:r>
+              <w:rPr>
+                <w:rFonts w:ascii="Noto Sans CJK SC" w:hAnsi="Noto Sans CJK SC" w:eastAsia="Noto Sans CJK SC"/>
+                <w:sz w:val="16"/>
+              </w:rPr>
+              <w:t>3</w:t>
+            </w:r>
+          </w:p>
+        </w:tc>
+        <w:tc>
+          <w:tcPr>
+            <w:tcW w:type="dxa" w:w="4309"/>
+          </w:tcPr>
+          <w:p>
+            <w:pPr>
+              <w:spacing w:after="0"/>
+            </w:pPr>
+            <w:r/>
+            <w:r>
+              <w:rPr>
+                <w:rFonts w:ascii="Noto Sans CJK SC" w:hAnsi="Noto Sans CJK SC" w:eastAsia="Noto Sans CJK SC"/>
+                <w:sz w:val="16"/>
+              </w:rPr>
+              <w:t>链路断了，这条回路必须继续吗？</w:t>
+            </w:r>
+          </w:p>
+        </w:tc>
+        <w:tc>
+          <w:tcPr>
+            <w:tcW w:type="dxa" w:w="3061"/>
+          </w:tcPr>
+          <w:p>
+            <w:pPr>
+              <w:spacing w:after="0"/>
+            </w:pPr>
+            <w:r/>
+            <w:r>
+              <w:rPr>
+                <w:rFonts w:ascii="Noto Sans CJK SC" w:hAnsi="Noto Sans CJK SC" w:eastAsia="Noto Sans CJK SC"/>
+                <w:sz w:val="16"/>
+              </w:rPr>
+              <w:t>必须继续</w:t>
+            </w:r>
+          </w:p>
+        </w:tc>
+        <w:tc>
+          <w:tcPr>
+            <w:tcW w:type="dxa" w:w="7257"/>
+          </w:tcPr>
+          <w:p>
+            <w:pPr>
+              <w:spacing w:after="0"/>
+            </w:pPr>
+            <w:r/>
+            <w:r>
+              <w:rPr>
+                <w:rFonts w:ascii="Noto Sans CJK SC" w:hAnsi="Noto Sans CJK SC" w:eastAsia="Noto Sans CJK SC"/>
+                <w:sz w:val="16"/>
+              </w:rPr>
+              <w:t>必须机载。这是安全关键与任务关键的分界线</w:t>
+            </w:r>
+          </w:p>
+        </w:tc>
+      </w:tr>
+    </w:tbl>
+    <w:p>
+      <w:pPr>
+        <w:spacing w:after="120"/>
+      </w:pPr>
+    </w:p>
+    <w:p>
+      <w:pPr>
+        <w:spacing w:after="80"/>
+      </w:pPr>
+      <w:r>
+        <w:rPr>
+          <w:rFonts w:ascii="Noto Sans CJK SC" w:hAnsi="Noto Sans CJK SC" w:eastAsia="Noto Sans CJK SC"/>
+          <w:b w:val="0"/>
+          <w:i w:val="0"/>
+          <w:sz w:val="18"/>
+        </w:rPr>
+        <w:t>第 3 条最具决定性，也最容易被忽略：控制回路断链必须继续——飞机不能因为地面断线就失控；而任务决策断链可以暂停——飞机悬停等待即可，不会出事。凡是"断了必须继续"的，一律机载，没有讨论余地。</w:t>
+      </w:r>
+    </w:p>
+    <w:p>
+      <w:pPr>
+        <w:pStyle w:val="Heading2"/>
+      </w:pPr>
+      <w:r>
+        <w:rPr>
+          <w:rFonts w:ascii="Noto Sans CJK SC" w:hAnsi="Noto Sans CJK SC" w:eastAsia="Noto Sans CJK SC"/>
+          <w:sz w:val="22"/>
+        </w:rPr>
+        <w:t>15.2 把时序里的每条回路过一遍</w:t>
+      </w:r>
+    </w:p>
+    <w:tbl>
+      <w:tblPr>
+        <w:tblStyle w:val="TableGrid"/>
+        <w:tblW w:type="auto" w:w="0"/>
+        <w:jc w:val="center"/>
+        <w:tblLook w:firstColumn="1" w:firstRow="1" w:lastColumn="0" w:lastRow="0" w:noHBand="0" w:noVBand="1" w:val="04A0"/>
+      </w:tblPr>
+      <w:tblGrid>
+        <w:gridCol w:w="3028"/>
+        <w:gridCol w:w="3028"/>
+        <w:gridCol w:w="3028"/>
+        <w:gridCol w:w="3028"/>
+        <w:gridCol w:w="3028"/>
+      </w:tblGrid>
+      <w:tr>
+        <w:tc>
+          <w:tcPr>
+            <w:tcW w:type="dxa" w:w="4762"/>
+            <w:shd w:val="clear" w:fill="D9E2F3"/>
+          </w:tcPr>
+          <w:p>
+            <w:r/>
+            <w:r>
+              <w:rPr>
+                <w:rFonts w:ascii="Noto Sans CJK SC" w:hAnsi="Noto Sans CJK SC" w:eastAsia="Noto Sans CJK SC"/>
+                <w:b/>
+                <w:sz w:val="17"/>
+              </w:rPr>
+              <w:t>回路（来自第十、十一、十四章的时序）</w:t>
+            </w:r>
+          </w:p>
+        </w:tc>
+        <w:tc>
+          <w:tcPr>
+            <w:tcW w:type="dxa" w:w="2835"/>
+            <w:shd w:val="clear" w:fill="D9E2F3"/>
+          </w:tcPr>
+          <w:p>
+            <w:r/>
+            <w:r>
+              <w:rPr>
+                <w:rFonts w:ascii="Noto Sans CJK SC" w:hAnsi="Noto Sans CJK SC" w:eastAsia="Noto Sans CJK SC"/>
+                <w:b/>
+                <w:sz w:val="17"/>
+              </w:rPr>
+              <w:t>周期 / 预算</w:t>
+            </w:r>
+          </w:p>
+        </w:tc>
+        <w:tc>
+          <w:tcPr>
+            <w:tcW w:type="dxa" w:w="2381"/>
+            <w:shd w:val="clear" w:fill="D9E2F3"/>
+          </w:tcPr>
+          <w:p>
+            <w:r/>
+            <w:r>
+              <w:rPr>
+                <w:rFonts w:ascii="Noto Sans CJK SC" w:hAnsi="Noto Sans CJK SC" w:eastAsia="Noto Sans CJK SC"/>
+                <w:b/>
+                <w:sz w:val="17"/>
+              </w:rPr>
+              <w:t>数据量</w:t>
+            </w:r>
+          </w:p>
+        </w:tc>
+        <w:tc>
+          <w:tcPr>
+            <w:tcW w:type="dxa" w:w="2041"/>
+            <w:shd w:val="clear" w:fill="D9E2F3"/>
+          </w:tcPr>
+          <w:p>
+            <w:r/>
+            <w:r>
+              <w:rPr>
+                <w:rFonts w:ascii="Noto Sans CJK SC" w:hAnsi="Noto Sans CJK SC" w:eastAsia="Noto Sans CJK SC"/>
+                <w:b/>
+                <w:sz w:val="17"/>
+              </w:rPr>
+              <w:t>断链须继续？</w:t>
+            </w:r>
+          </w:p>
+        </w:tc>
+        <w:tc>
+          <w:tcPr>
+            <w:tcW w:type="dxa" w:w="3175"/>
+            <w:shd w:val="clear" w:fill="D9E2F3"/>
+          </w:tcPr>
+          <w:p>
+            <w:r/>
+            <w:r>
+              <w:rPr>
+                <w:rFonts w:ascii="Noto Sans CJK SC" w:hAnsi="Noto Sans CJK SC" w:eastAsia="Noto Sans CJK SC"/>
+                <w:b/>
+                <w:sz w:val="17"/>
+              </w:rPr>
+              <w:t>归属</w:t>
+            </w:r>
+          </w:p>
+        </w:tc>
+      </w:tr>
+      <w:tr>
+        <w:tc>
+          <w:tcPr>
+            <w:tcW w:type="dxa" w:w="4762"/>
+          </w:tcPr>
+          <w:p>
+            <w:pPr>
+              <w:spacing w:after="0"/>
+            </w:pPr>
+            <w:r/>
+            <w:r>
+              <w:rPr>
+                <w:rFonts w:ascii="Noto Sans CJK SC" w:hAnsi="Noto Sans CJK SC" w:eastAsia="Noto Sans CJK SC"/>
+                <w:sz w:val="16"/>
+              </w:rPr>
+              <w:t>姿态与推力控制（pt4ctrl → 飞控）</w:t>
+            </w:r>
+          </w:p>
+        </w:tc>
+        <w:tc>
+          <w:tcPr>
+            <w:tcW w:type="dxa" w:w="2835"/>
+          </w:tcPr>
+          <w:p>
+            <w:pPr>
+              <w:spacing w:after="0"/>
+            </w:pPr>
+            <w:r/>
+            <w:r>
+              <w:rPr>
+                <w:rFonts w:ascii="Noto Sans CJK SC" w:hAnsi="Noto Sans CJK SC" w:eastAsia="Noto Sans CJK SC"/>
+                <w:sz w:val="16"/>
+              </w:rPr>
+              <w:t>100Hz 以上 / 约 10 毫秒</w:t>
+            </w:r>
+          </w:p>
+        </w:tc>
+        <w:tc>
+          <w:tcPr>
+            <w:tcW w:type="dxa" w:w="2381"/>
+          </w:tcPr>
+          <w:p>
+            <w:pPr>
+              <w:spacing w:after="0"/>
+            </w:pPr>
+            <w:r/>
+            <w:r>
+              <w:rPr>
+                <w:rFonts w:ascii="Noto Sans CJK SC" w:hAnsi="Noto Sans CJK SC" w:eastAsia="Noto Sans CJK SC"/>
+                <w:sz w:val="16"/>
+              </w:rPr>
+              <w:t>小</w:t>
+            </w:r>
+          </w:p>
+        </w:tc>
+        <w:tc>
+          <w:tcPr>
+            <w:tcW w:type="dxa" w:w="2041"/>
+          </w:tcPr>
+          <w:p>
+            <w:pPr>
+              <w:spacing w:after="0"/>
+            </w:pPr>
+            <w:r/>
+            <w:r>
+              <w:rPr>
+                <w:rFonts w:ascii="Noto Sans CJK SC" w:hAnsi="Noto Sans CJK SC" w:eastAsia="Noto Sans CJK SC"/>
+                <w:sz w:val="16"/>
+              </w:rPr>
+              <w:t>是</w:t>
+            </w:r>
+          </w:p>
+        </w:tc>
+        <w:tc>
+          <w:tcPr>
+            <w:tcW w:type="dxa" w:w="3175"/>
+          </w:tcPr>
+          <w:p>
+            <w:pPr>
+              <w:spacing w:after="0"/>
+            </w:pPr>
+            <w:r/>
+            <w:r>
+              <w:rPr>
+                <w:rFonts w:ascii="Noto Sans CJK SC" w:hAnsi="Noto Sans CJK SC" w:eastAsia="Noto Sans CJK SC"/>
+                <w:sz w:val="16"/>
+              </w:rPr>
+              <w:t>机载（不可议）</w:t>
+            </w:r>
+          </w:p>
+        </w:tc>
+      </w:tr>
+      <w:tr>
+        <w:tc>
+          <w:tcPr>
+            <w:tcW w:type="dxa" w:w="4762"/>
+          </w:tcPr>
+          <w:p>
+            <w:pPr>
+              <w:spacing w:after="0"/>
+            </w:pPr>
+            <w:r/>
+            <w:r>
+              <w:rPr>
+                <w:rFonts w:ascii="Noto Sans CJK SC" w:hAnsi="Noto Sans CJK SC" w:eastAsia="Noto Sans CJK SC"/>
+                <w:sz w:val="16"/>
+              </w:rPr>
+              <w:t>轨迹生成与跟踪（traj_server → position_cmd）</w:t>
+            </w:r>
+          </w:p>
+        </w:tc>
+        <w:tc>
+          <w:tcPr>
+            <w:tcW w:type="dxa" w:w="2835"/>
+          </w:tcPr>
+          <w:p>
+            <w:pPr>
+              <w:spacing w:after="0"/>
+            </w:pPr>
+            <w:r/>
+            <w:r>
+              <w:rPr>
+                <w:rFonts w:ascii="Noto Sans CJK SC" w:hAnsi="Noto Sans CJK SC" w:eastAsia="Noto Sans CJK SC"/>
+                <w:sz w:val="16"/>
+              </w:rPr>
+              <w:t>50–100Hz / 约 20 毫秒</w:t>
+            </w:r>
+          </w:p>
+        </w:tc>
+        <w:tc>
+          <w:tcPr>
+            <w:tcW w:type="dxa" w:w="2381"/>
+          </w:tcPr>
+          <w:p>
+            <w:pPr>
+              <w:spacing w:after="0"/>
+            </w:pPr>
+            <w:r/>
+            <w:r>
+              <w:rPr>
+                <w:rFonts w:ascii="Noto Sans CJK SC" w:hAnsi="Noto Sans CJK SC" w:eastAsia="Noto Sans CJK SC"/>
+                <w:sz w:val="16"/>
+              </w:rPr>
+              <w:t>小</w:t>
+            </w:r>
+          </w:p>
+        </w:tc>
+        <w:tc>
+          <w:tcPr>
+            <w:tcW w:type="dxa" w:w="2041"/>
+          </w:tcPr>
+          <w:p>
+            <w:pPr>
+              <w:spacing w:after="0"/>
+            </w:pPr>
+            <w:r/>
+            <w:r>
+              <w:rPr>
+                <w:rFonts w:ascii="Noto Sans CJK SC" w:hAnsi="Noto Sans CJK SC" w:eastAsia="Noto Sans CJK SC"/>
+                <w:sz w:val="16"/>
+              </w:rPr>
+              <w:t>是</w:t>
+            </w:r>
+          </w:p>
+        </w:tc>
+        <w:tc>
+          <w:tcPr>
+            <w:tcW w:type="dxa" w:w="3175"/>
+          </w:tcPr>
+          <w:p>
+            <w:pPr>
+              <w:spacing w:after="0"/>
+            </w:pPr>
+            <w:r/>
+            <w:r>
+              <w:rPr>
+                <w:rFonts w:ascii="Noto Sans CJK SC" w:hAnsi="Noto Sans CJK SC" w:eastAsia="Noto Sans CJK SC"/>
+                <w:sz w:val="16"/>
+              </w:rPr>
+              <w:t>机载</w:t>
+            </w:r>
+          </w:p>
+        </w:tc>
+      </w:tr>
+      <w:tr>
+        <w:tc>
+          <w:tcPr>
+            <w:tcW w:type="dxa" w:w="4762"/>
+          </w:tcPr>
+          <w:p>
+            <w:pPr>
+              <w:spacing w:after="0"/>
+            </w:pPr>
+            <w:r/>
+            <w:r>
+              <w:rPr>
+                <w:rFonts w:ascii="Noto Sans CJK SC" w:hAnsi="Noto Sans CJK SC" w:eastAsia="Noto Sans CJK SC"/>
+                <w:sz w:val="16"/>
+              </w:rPr>
+              <w:t>局部规划与重规划（ego_planner ← 点云）</w:t>
+            </w:r>
+          </w:p>
+        </w:tc>
+        <w:tc>
+          <w:tcPr>
+            <w:tcW w:type="dxa" w:w="2835"/>
+          </w:tcPr>
+          <w:p>
+            <w:pPr>
+              <w:spacing w:after="0"/>
+            </w:pPr>
+            <w:r/>
+            <w:r>
+              <w:rPr>
+                <w:rFonts w:ascii="Noto Sans CJK SC" w:hAnsi="Noto Sans CJK SC" w:eastAsia="Noto Sans CJK SC"/>
+                <w:sz w:val="16"/>
+              </w:rPr>
+              <w:t>10Hz 级 / 约 100 毫秒</w:t>
+            </w:r>
+          </w:p>
+        </w:tc>
+        <w:tc>
+          <w:tcPr>
+            <w:tcW w:type="dxa" w:w="2381"/>
+          </w:tcPr>
+          <w:p>
+            <w:pPr>
+              <w:spacing w:after="0"/>
+            </w:pPr>
+            <w:r/>
+            <w:r>
+              <w:rPr>
+                <w:rFonts w:ascii="Noto Sans CJK SC" w:hAnsi="Noto Sans CJK SC" w:eastAsia="Noto Sans CJK SC"/>
+                <w:sz w:val="16"/>
+              </w:rPr>
+              <w:t>点云，大</w:t>
+            </w:r>
+          </w:p>
+        </w:tc>
+        <w:tc>
+          <w:tcPr>
+            <w:tcW w:type="dxa" w:w="2041"/>
+          </w:tcPr>
+          <w:p>
+            <w:pPr>
+              <w:spacing w:after="0"/>
+            </w:pPr>
+            <w:r/>
+            <w:r>
+              <w:rPr>
+                <w:rFonts w:ascii="Noto Sans CJK SC" w:hAnsi="Noto Sans CJK SC" w:eastAsia="Noto Sans CJK SC"/>
+                <w:sz w:val="16"/>
+              </w:rPr>
+              <w:t>是</w:t>
+            </w:r>
+          </w:p>
+        </w:tc>
+        <w:tc>
+          <w:tcPr>
+            <w:tcW w:type="dxa" w:w="3175"/>
+          </w:tcPr>
+          <w:p>
+            <w:pPr>
+              <w:spacing w:after="0"/>
+            </w:pPr>
+            <w:r/>
+            <w:r>
+              <w:rPr>
+                <w:rFonts w:ascii="Noto Sans CJK SC" w:hAnsi="Noto Sans CJK SC" w:eastAsia="Noto Sans CJK SC"/>
+                <w:sz w:val="16"/>
+              </w:rPr>
+              <w:t>机载</w:t>
+            </w:r>
+          </w:p>
+        </w:tc>
+      </w:tr>
+      <w:tr>
+        <w:tc>
+          <w:tcPr>
+            <w:tcW w:type="dxa" w:w="4762"/>
+          </w:tcPr>
+          <w:p>
+            <w:pPr>
+              <w:spacing w:after="0"/>
+            </w:pPr>
+            <w:r/>
+            <w:r>
+              <w:rPr>
+                <w:rFonts w:ascii="Noto Sans CJK SC" w:hAnsi="Noto Sans CJK SC" w:eastAsia="Noto Sans CJK SC"/>
+                <w:sz w:val="16"/>
+              </w:rPr>
+              <w:t>视觉伺服（检测 → 目标点修正）</w:t>
+            </w:r>
+          </w:p>
+        </w:tc>
+        <w:tc>
+          <w:tcPr>
+            <w:tcW w:type="dxa" w:w="2835"/>
+          </w:tcPr>
+          <w:p>
+            <w:pPr>
+              <w:spacing w:after="0"/>
+            </w:pPr>
+            <w:r/>
+            <w:r>
+              <w:rPr>
+                <w:rFonts w:ascii="Noto Sans CJK SC" w:hAnsi="Noto Sans CJK SC" w:eastAsia="Noto Sans CJK SC"/>
+                <w:sz w:val="16"/>
+              </w:rPr>
+              <w:t>10Hz / 约 100 毫秒</w:t>
+            </w:r>
+          </w:p>
+        </w:tc>
+        <w:tc>
+          <w:tcPr>
+            <w:tcW w:type="dxa" w:w="2381"/>
+          </w:tcPr>
+          <w:p>
+            <w:pPr>
+              <w:spacing w:after="0"/>
+            </w:pPr>
+            <w:r/>
+            <w:r>
+              <w:rPr>
+                <w:rFonts w:ascii="Noto Sans CJK SC" w:hAnsi="Noto Sans CJK SC" w:eastAsia="Noto Sans CJK SC"/>
+                <w:sz w:val="16"/>
+              </w:rPr>
+              <w:t>图像 9MB/s</w:t>
+            </w:r>
+          </w:p>
+        </w:tc>
+        <w:tc>
+          <w:tcPr>
+            <w:tcW w:type="dxa" w:w="2041"/>
+          </w:tcPr>
+          <w:p>
+            <w:pPr>
+              <w:spacing w:after="0"/>
+            </w:pPr>
+            <w:r/>
+            <w:r>
+              <w:rPr>
+                <w:rFonts w:ascii="Noto Sans CJK SC" w:hAnsi="Noto Sans CJK SC" w:eastAsia="Noto Sans CJK SC"/>
+                <w:sz w:val="16"/>
+              </w:rPr>
+              <w:t>是</w:t>
+            </w:r>
+          </w:p>
+        </w:tc>
+        <w:tc>
+          <w:tcPr>
+            <w:tcW w:type="dxa" w:w="3175"/>
+          </w:tcPr>
+          <w:p>
+            <w:pPr>
+              <w:spacing w:after="0"/>
+            </w:pPr>
+            <w:r/>
+            <w:r>
+              <w:rPr>
+                <w:rFonts w:ascii="Noto Sans CJK SC" w:hAnsi="Noto Sans CJK SC" w:eastAsia="Noto Sans CJK SC"/>
+                <w:sz w:val="16"/>
+              </w:rPr>
+              <w:t>机载</w:t>
+            </w:r>
+          </w:p>
+        </w:tc>
+      </w:tr>
+      <w:tr>
+        <w:tc>
+          <w:tcPr>
+            <w:tcW w:type="dxa" w:w="4762"/>
+          </w:tcPr>
+          <w:p>
+            <w:pPr>
+              <w:spacing w:after="0"/>
+            </w:pPr>
+            <w:r/>
+            <w:r>
+              <w:rPr>
+                <w:rFonts w:ascii="Noto Sans CJK SC" w:hAnsi="Noto Sans CJK SC" w:eastAsia="Noto Sans CJK SC"/>
+                <w:sz w:val="16"/>
+              </w:rPr>
+              <w:t>编队跟随（长机 odom → 目标点）</w:t>
+            </w:r>
+          </w:p>
+        </w:tc>
+        <w:tc>
+          <w:tcPr>
+            <w:tcW w:type="dxa" w:w="2835"/>
+          </w:tcPr>
+          <w:p>
+            <w:pPr>
+              <w:spacing w:after="0"/>
+            </w:pPr>
+            <w:r/>
+            <w:r>
+              <w:rPr>
+                <w:rFonts w:ascii="Noto Sans CJK SC" w:hAnsi="Noto Sans CJK SC" w:eastAsia="Noto Sans CJK SC"/>
+                <w:sz w:val="16"/>
+              </w:rPr>
+              <w:t>5–10Hz / 100–200 毫秒</w:t>
+            </w:r>
+          </w:p>
+        </w:tc>
+        <w:tc>
+          <w:tcPr>
+            <w:tcW w:type="dxa" w:w="2381"/>
+          </w:tcPr>
+          <w:p>
+            <w:pPr>
+              <w:spacing w:after="0"/>
+            </w:pPr>
+            <w:r/>
+            <w:r>
+              <w:rPr>
+                <w:rFonts w:ascii="Noto Sans CJK SC" w:hAnsi="Noto Sans CJK SC" w:eastAsia="Noto Sans CJK SC"/>
+                <w:sz w:val="16"/>
+              </w:rPr>
+              <w:t>小</w:t>
+            </w:r>
+          </w:p>
+        </w:tc>
+        <w:tc>
+          <w:tcPr>
+            <w:tcW w:type="dxa" w:w="2041"/>
+          </w:tcPr>
+          <w:p>
+            <w:pPr>
+              <w:spacing w:after="0"/>
+            </w:pPr>
+            <w:r/>
+            <w:r>
+              <w:rPr>
+                <w:rFonts w:ascii="Noto Sans CJK SC" w:hAnsi="Noto Sans CJK SC" w:eastAsia="Noto Sans CJK SC"/>
+                <w:sz w:val="16"/>
+              </w:rPr>
+              <w:t>是</w:t>
+            </w:r>
+          </w:p>
+        </w:tc>
+        <w:tc>
+          <w:tcPr>
+            <w:tcW w:type="dxa" w:w="3175"/>
+          </w:tcPr>
+          <w:p>
+            <w:pPr>
+              <w:spacing w:after="0"/>
+            </w:pPr>
+            <w:r/>
+            <w:r>
+              <w:rPr>
+                <w:rFonts w:ascii="Noto Sans CJK SC" w:hAnsi="Noto Sans CJK SC" w:eastAsia="Noto Sans CJK SC"/>
+                <w:sz w:val="16"/>
+              </w:rPr>
+              <w:t>机载</w:t>
+            </w:r>
+          </w:p>
+        </w:tc>
+      </w:tr>
+      <w:tr>
+        <w:tc>
+          <w:tcPr>
+            <w:tcW w:type="dxa" w:w="4762"/>
+          </w:tcPr>
+          <w:p>
+            <w:pPr>
+              <w:spacing w:after="0"/>
+            </w:pPr>
+            <w:r/>
+            <w:r>
+              <w:rPr>
+                <w:rFonts w:ascii="Noto Sans CJK SC" w:hAnsi="Noto Sans CJK SC" w:eastAsia="Noto Sans CJK SC"/>
+                <w:sz w:val="16"/>
+              </w:rPr>
+              <w:t>执行机构保持（≥10Hz 持续发布 + 释放）</w:t>
+            </w:r>
+          </w:p>
+        </w:tc>
+        <w:tc>
+          <w:tcPr>
+            <w:tcW w:type="dxa" w:w="2835"/>
+          </w:tcPr>
+          <w:p>
+            <w:pPr>
+              <w:spacing w:after="0"/>
+            </w:pPr>
+            <w:r/>
+            <w:r>
+              <w:rPr>
+                <w:rFonts w:ascii="Noto Sans CJK SC" w:hAnsi="Noto Sans CJK SC" w:eastAsia="Noto Sans CJK SC"/>
+                <w:sz w:val="16"/>
+              </w:rPr>
+              <w:t>20Hz / 约 50 毫秒</w:t>
+            </w:r>
+          </w:p>
+        </w:tc>
+        <w:tc>
+          <w:tcPr>
+            <w:tcW w:type="dxa" w:w="2381"/>
+          </w:tcPr>
+          <w:p>
+            <w:pPr>
+              <w:spacing w:after="0"/>
+            </w:pPr>
+            <w:r/>
+            <w:r>
+              <w:rPr>
+                <w:rFonts w:ascii="Noto Sans CJK SC" w:hAnsi="Noto Sans CJK SC" w:eastAsia="Noto Sans CJK SC"/>
+                <w:sz w:val="16"/>
+              </w:rPr>
+              <w:t>小</w:t>
+            </w:r>
+          </w:p>
+        </w:tc>
+        <w:tc>
+          <w:tcPr>
+            <w:tcW w:type="dxa" w:w="2041"/>
+          </w:tcPr>
+          <w:p>
+            <w:pPr>
+              <w:spacing w:after="0"/>
+            </w:pPr>
+            <w:r/>
+            <w:r>
+              <w:rPr>
+                <w:rFonts w:ascii="Noto Sans CJK SC" w:hAnsi="Noto Sans CJK SC" w:eastAsia="Noto Sans CJK SC"/>
+                <w:sz w:val="16"/>
+              </w:rPr>
+              <w:t>是</w:t>
+            </w:r>
+          </w:p>
+        </w:tc>
+        <w:tc>
+          <w:tcPr>
+            <w:tcW w:type="dxa" w:w="3175"/>
+          </w:tcPr>
+          <w:p>
+            <w:pPr>
+              <w:spacing w:after="0"/>
+            </w:pPr>
+            <w:r/>
+            <w:r>
+              <w:rPr>
+                <w:rFonts w:ascii="Noto Sans CJK SC" w:hAnsi="Noto Sans CJK SC" w:eastAsia="Noto Sans CJK SC"/>
+                <w:sz w:val="16"/>
+              </w:rPr>
+              <w:t>机载</w:t>
+            </w:r>
+          </w:p>
+        </w:tc>
+      </w:tr>
+      <w:tr>
+        <w:tc>
+          <w:tcPr>
+            <w:tcW w:type="dxa" w:w="4762"/>
+          </w:tcPr>
+          <w:p>
+            <w:pPr>
+              <w:spacing w:after="0"/>
+            </w:pPr>
+            <w:r/>
+            <w:r>
+              <w:rPr>
+                <w:rFonts w:ascii="Noto Sans CJK SC" w:hAnsi="Noto Sans CJK SC" w:eastAsia="Noto Sans CJK SC"/>
+                <w:sz w:val="16"/>
+              </w:rPr>
+              <w:t>高层火情锁定与瞄准（检测 → 接管 relay）</w:t>
+            </w:r>
+          </w:p>
+        </w:tc>
+        <w:tc>
+          <w:tcPr>
+            <w:tcW w:type="dxa" w:w="2835"/>
+          </w:tcPr>
+          <w:p>
+            <w:pPr>
+              <w:spacing w:after="0"/>
+            </w:pPr>
+            <w:r/>
+            <w:r>
+              <w:rPr>
+                <w:rFonts w:ascii="Noto Sans CJK SC" w:hAnsi="Noto Sans CJK SC" w:eastAsia="Noto Sans CJK SC"/>
+                <w:sz w:val="16"/>
+              </w:rPr>
+              <w:t>10Hz 级</w:t>
+            </w:r>
+          </w:p>
+        </w:tc>
+        <w:tc>
+          <w:tcPr>
+            <w:tcW w:type="dxa" w:w="2381"/>
+          </w:tcPr>
+          <w:p>
+            <w:pPr>
+              <w:spacing w:after="0"/>
+            </w:pPr>
+            <w:r/>
+            <w:r>
+              <w:rPr>
+                <w:rFonts w:ascii="Noto Sans CJK SC" w:hAnsi="Noto Sans CJK SC" w:eastAsia="Noto Sans CJK SC"/>
+                <w:sz w:val="16"/>
+              </w:rPr>
+              <w:t>图像</w:t>
+            </w:r>
+          </w:p>
+        </w:tc>
+        <w:tc>
+          <w:tcPr>
+            <w:tcW w:type="dxa" w:w="2041"/>
+          </w:tcPr>
+          <w:p>
+            <w:pPr>
+              <w:spacing w:after="0"/>
+            </w:pPr>
+            <w:r/>
+            <w:r>
+              <w:rPr>
+                <w:rFonts w:ascii="Noto Sans CJK SC" w:hAnsi="Noto Sans CJK SC" w:eastAsia="Noto Sans CJK SC"/>
+                <w:sz w:val="16"/>
+              </w:rPr>
+              <w:t>是</w:t>
+            </w:r>
+          </w:p>
+        </w:tc>
+        <w:tc>
+          <w:tcPr>
+            <w:tcW w:type="dxa" w:w="3175"/>
+          </w:tcPr>
+          <w:p>
+            <w:pPr>
+              <w:spacing w:after="0"/>
+            </w:pPr>
+            <w:r/>
+            <w:r>
+              <w:rPr>
+                <w:rFonts w:ascii="Noto Sans CJK SC" w:hAnsi="Noto Sans CJK SC" w:eastAsia="Noto Sans CJK SC"/>
+                <w:sz w:val="16"/>
+              </w:rPr>
+              <w:t>机载（自主接管）</w:t>
+            </w:r>
+          </w:p>
+        </w:tc>
+      </w:tr>
+      <w:tr>
+        <w:tc>
+          <w:tcPr>
+            <w:tcW w:type="dxa" w:w="4762"/>
+          </w:tcPr>
+          <w:p>
+            <w:pPr>
+              <w:spacing w:after="0"/>
+            </w:pPr>
+            <w:r/>
+            <w:r>
+              <w:rPr>
+                <w:rFonts w:ascii="Noto Sans CJK SC" w:hAnsi="Noto Sans CJK SC" w:eastAsia="Noto Sans CJK SC"/>
+                <w:sz w:val="16"/>
+              </w:rPr>
+              <w:t>任务决策（检测命中 → 取消导航 → 切子流程）</w:t>
+            </w:r>
+          </w:p>
+        </w:tc>
+        <w:tc>
+          <w:tcPr>
+            <w:tcW w:type="dxa" w:w="2835"/>
+          </w:tcPr>
+          <w:p>
+            <w:pPr>
+              <w:spacing w:after="0"/>
+            </w:pPr>
+            <w:r/>
+            <w:r>
+              <w:rPr>
+                <w:rFonts w:ascii="Noto Sans CJK SC" w:hAnsi="Noto Sans CJK SC" w:eastAsia="Noto Sans CJK SC"/>
+                <w:sz w:val="16"/>
+              </w:rPr>
+              <w:t>事件驱动 / 秒级</w:t>
+            </w:r>
+          </w:p>
+        </w:tc>
+        <w:tc>
+          <w:tcPr>
+            <w:tcW w:type="dxa" w:w="2381"/>
+          </w:tcPr>
+          <w:p>
+            <w:pPr>
+              <w:spacing w:after="0"/>
+            </w:pPr>
+            <w:r/>
+            <w:r>
+              <w:rPr>
+                <w:rFonts w:ascii="Noto Sans CJK SC" w:hAnsi="Noto Sans CJK SC" w:eastAsia="Noto Sans CJK SC"/>
+                <w:sz w:val="16"/>
+              </w:rPr>
+              <w:t>小</w:t>
+            </w:r>
+          </w:p>
+        </w:tc>
+        <w:tc>
+          <w:tcPr>
+            <w:tcW w:type="dxa" w:w="2041"/>
+          </w:tcPr>
+          <w:p>
+            <w:pPr>
+              <w:spacing w:after="0"/>
+            </w:pPr>
+            <w:r/>
+            <w:r>
+              <w:rPr>
+                <w:rFonts w:ascii="Noto Sans CJK SC" w:hAnsi="Noto Sans CJK SC" w:eastAsia="Noto Sans CJK SC"/>
+                <w:sz w:val="16"/>
+              </w:rPr>
+              <w:t>否，可悬停等待</w:t>
+            </w:r>
+          </w:p>
+        </w:tc>
+        <w:tc>
+          <w:tcPr>
+            <w:tcW w:type="dxa" w:w="3175"/>
+          </w:tcPr>
+          <w:p>
+            <w:pPr>
+              <w:spacing w:after="0"/>
+            </w:pPr>
+            <w:r/>
+            <w:r>
+              <w:rPr>
+                <w:rFonts w:ascii="Noto Sans CJK SC" w:hAnsi="Noto Sans CJK SC" w:eastAsia="Noto Sans CJK SC"/>
+                <w:sz w:val="16"/>
+              </w:rPr>
+              <w:t>地面可</w:t>
+            </w:r>
+          </w:p>
+        </w:tc>
+      </w:tr>
+      <w:tr>
+        <w:tc>
+          <w:tcPr>
+            <w:tcW w:type="dxa" w:w="4762"/>
+          </w:tcPr>
+          <w:p>
+            <w:pPr>
+              <w:spacing w:after="0"/>
+            </w:pPr>
+            <w:r/>
+            <w:r>
+              <w:rPr>
+                <w:rFonts w:ascii="Noto Sans CJK SC" w:hAnsi="Noto Sans CJK SC" w:eastAsia="Noto Sans CJK SC"/>
+                <w:sz w:val="16"/>
+              </w:rPr>
+              <w:t>跨机握手（13 → 14 → 15）</w:t>
+            </w:r>
+          </w:p>
+        </w:tc>
+        <w:tc>
+          <w:tcPr>
+            <w:tcW w:type="dxa" w:w="2835"/>
+          </w:tcPr>
+          <w:p>
+            <w:pPr>
+              <w:spacing w:after="0"/>
+            </w:pPr>
+            <w:r/>
+            <w:r>
+              <w:rPr>
+                <w:rFonts w:ascii="Noto Sans CJK SC" w:hAnsi="Noto Sans CJK SC" w:eastAsia="Noto Sans CJK SC"/>
+                <w:sz w:val="16"/>
+              </w:rPr>
+              <w:t>秒至数十秒</w:t>
+            </w:r>
+          </w:p>
+        </w:tc>
+        <w:tc>
+          <w:tcPr>
+            <w:tcW w:type="dxa" w:w="2381"/>
+          </w:tcPr>
+          <w:p>
+            <w:pPr>
+              <w:spacing w:after="0"/>
+            </w:pPr>
+            <w:r/>
+            <w:r>
+              <w:rPr>
+                <w:rFonts w:ascii="Noto Sans CJK SC" w:hAnsi="Noto Sans CJK SC" w:eastAsia="Noto Sans CJK SC"/>
+                <w:sz w:val="16"/>
+              </w:rPr>
+              <w:t>小</w:t>
+            </w:r>
+          </w:p>
+        </w:tc>
+        <w:tc>
+          <w:tcPr>
+            <w:tcW w:type="dxa" w:w="2041"/>
+          </w:tcPr>
+          <w:p>
+            <w:pPr>
+              <w:spacing w:after="0"/>
+            </w:pPr>
+            <w:r/>
+            <w:r>
+              <w:rPr>
+                <w:rFonts w:ascii="Noto Sans CJK SC" w:hAnsi="Noto Sans CJK SC" w:eastAsia="Noto Sans CJK SC"/>
+                <w:sz w:val="16"/>
+              </w:rPr>
+              <w:t>否</w:t>
+            </w:r>
+          </w:p>
+        </w:tc>
+        <w:tc>
+          <w:tcPr>
+            <w:tcW w:type="dxa" w:w="3175"/>
+          </w:tcPr>
+          <w:p>
+            <w:pPr>
+              <w:spacing w:after="0"/>
+            </w:pPr>
+            <w:r/>
+            <w:r>
+              <w:rPr>
+                <w:rFonts w:ascii="Noto Sans CJK SC" w:hAnsi="Noto Sans CJK SC" w:eastAsia="Noto Sans CJK SC"/>
+                <w:sz w:val="16"/>
+              </w:rPr>
+              <w:t>地面可</w:t>
+            </w:r>
+          </w:p>
+        </w:tc>
+      </w:tr>
+      <w:tr>
+        <w:tc>
+          <w:tcPr>
+            <w:tcW w:type="dxa" w:w="4762"/>
+          </w:tcPr>
+          <w:p>
+            <w:pPr>
+              <w:spacing w:after="0"/>
+            </w:pPr>
+            <w:r/>
+            <w:r>
+              <w:rPr>
+                <w:rFonts w:ascii="Noto Sans CJK SC" w:hAnsi="Noto Sans CJK SC" w:eastAsia="Noto Sans CJK SC"/>
+                <w:sz w:val="16"/>
+              </w:rPr>
+              <w:t>搜索顺序与立柱选择</w:t>
+            </w:r>
+          </w:p>
+        </w:tc>
+        <w:tc>
+          <w:tcPr>
+            <w:tcW w:type="dxa" w:w="2835"/>
+          </w:tcPr>
+          <w:p>
+            <w:pPr>
+              <w:spacing w:after="0"/>
+            </w:pPr>
+            <w:r/>
+            <w:r>
+              <w:rPr>
+                <w:rFonts w:ascii="Noto Sans CJK SC" w:hAnsi="Noto Sans CJK SC" w:eastAsia="Noto Sans CJK SC"/>
+                <w:sz w:val="16"/>
+              </w:rPr>
+              <w:t>一次性计算</w:t>
+            </w:r>
+          </w:p>
+        </w:tc>
+        <w:tc>
+          <w:tcPr>
+            <w:tcW w:type="dxa" w:w="2381"/>
+          </w:tcPr>
+          <w:p>
+            <w:pPr>
+              <w:spacing w:after="0"/>
+            </w:pPr>
+            <w:r/>
+            <w:r>
+              <w:rPr>
+                <w:rFonts w:ascii="Noto Sans CJK SC" w:hAnsi="Noto Sans CJK SC" w:eastAsia="Noto Sans CJK SC"/>
+                <w:sz w:val="16"/>
+              </w:rPr>
+              <w:t>小</w:t>
+            </w:r>
+          </w:p>
+        </w:tc>
+        <w:tc>
+          <w:tcPr>
+            <w:tcW w:type="dxa" w:w="2041"/>
+          </w:tcPr>
+          <w:p>
+            <w:pPr>
+              <w:spacing w:after="0"/>
+            </w:pPr>
+            <w:r/>
+            <w:r>
+              <w:rPr>
+                <w:rFonts w:ascii="Noto Sans CJK SC" w:hAnsi="Noto Sans CJK SC" w:eastAsia="Noto Sans CJK SC"/>
+                <w:sz w:val="16"/>
+              </w:rPr>
+              <w:t>否</w:t>
+            </w:r>
+          </w:p>
+        </w:tc>
+        <w:tc>
+          <w:tcPr>
+            <w:tcW w:type="dxa" w:w="3175"/>
+          </w:tcPr>
+          <w:p>
+            <w:pPr>
+              <w:spacing w:after="0"/>
+            </w:pPr>
+            <w:r/>
+            <w:r>
+              <w:rPr>
+                <w:rFonts w:ascii="Noto Sans CJK SC" w:hAnsi="Noto Sans CJK SC" w:eastAsia="Noto Sans CJK SC"/>
+                <w:sz w:val="16"/>
+              </w:rPr>
+              <w:t>地面可</w:t>
+            </w:r>
+          </w:p>
+        </w:tc>
+      </w:tr>
+      <w:tr>
+        <w:tc>
+          <w:tcPr>
+            <w:tcW w:type="dxa" w:w="4762"/>
+          </w:tcPr>
+          <w:p>
+            <w:pPr>
+              <w:spacing w:after="0"/>
+            </w:pPr>
+            <w:r/>
+            <w:r>
+              <w:rPr>
+                <w:rFonts w:ascii="Noto Sans CJK SC" w:hAnsi="Noto Sans CJK SC" w:eastAsia="Noto Sans CJK SC"/>
+                <w:sz w:val="16"/>
+              </w:rPr>
+              <w:t>收尾判定（两标志位）</w:t>
+            </w:r>
+          </w:p>
+        </w:tc>
+        <w:tc>
+          <w:tcPr>
+            <w:tcW w:type="dxa" w:w="2835"/>
+          </w:tcPr>
+          <w:p>
+            <w:pPr>
+              <w:spacing w:after="0"/>
+            </w:pPr>
+            <w:r/>
+            <w:r>
+              <w:rPr>
+                <w:rFonts w:ascii="Noto Sans CJK SC" w:hAnsi="Noto Sans CJK SC" w:eastAsia="Noto Sans CJK SC"/>
+                <w:sz w:val="16"/>
+              </w:rPr>
+              <w:t>秒级</w:t>
+            </w:r>
+          </w:p>
+        </w:tc>
+        <w:tc>
+          <w:tcPr>
+            <w:tcW w:type="dxa" w:w="2381"/>
+          </w:tcPr>
+          <w:p>
+            <w:pPr>
+              <w:spacing w:after="0"/>
+            </w:pPr>
+            <w:r/>
+            <w:r>
+              <w:rPr>
+                <w:rFonts w:ascii="Noto Sans CJK SC" w:hAnsi="Noto Sans CJK SC" w:eastAsia="Noto Sans CJK SC"/>
+                <w:sz w:val="16"/>
+              </w:rPr>
+              <w:t>小</w:t>
+            </w:r>
+          </w:p>
+        </w:tc>
+        <w:tc>
+          <w:tcPr>
+            <w:tcW w:type="dxa" w:w="2041"/>
+          </w:tcPr>
+          <w:p>
+            <w:pPr>
+              <w:spacing w:after="0"/>
+            </w:pPr>
+            <w:r/>
+            <w:r>
+              <w:rPr>
+                <w:rFonts w:ascii="Noto Sans CJK SC" w:hAnsi="Noto Sans CJK SC" w:eastAsia="Noto Sans CJK SC"/>
+                <w:sz w:val="16"/>
+              </w:rPr>
+              <w:t>否</w:t>
+            </w:r>
+          </w:p>
+        </w:tc>
+        <w:tc>
+          <w:tcPr>
+            <w:tcW w:type="dxa" w:w="3175"/>
+          </w:tcPr>
+          <w:p>
+            <w:pPr>
+              <w:spacing w:after="0"/>
+            </w:pPr>
+            <w:r/>
+            <w:r>
+              <w:rPr>
+                <w:rFonts w:ascii="Noto Sans CJK SC" w:hAnsi="Noto Sans CJK SC" w:eastAsia="Noto Sans CJK SC"/>
+                <w:sz w:val="16"/>
+              </w:rPr>
+              <w:t>地面可</w:t>
+            </w:r>
+          </w:p>
+        </w:tc>
+      </w:tr>
+    </w:tbl>
+    <w:p>
+      <w:pPr>
+        <w:spacing w:after="120"/>
+      </w:pPr>
+    </w:p>
+    <w:p>
+      <w:pPr>
+        <w:spacing w:after="80"/>
+      </w:pPr>
+      <w:r>
+        <w:rPr>
+          <w:rFonts w:ascii="Noto Sans CJK SC" w:hAnsi="Noto Sans CJK SC" w:eastAsia="Noto Sans CJK SC"/>
+          <w:b w:val="0"/>
+          <w:i w:val="0"/>
+          <w:sz w:val="18"/>
+        </w:rPr>
+        <w:t>规律很清晰：前七条都是闭环，周期都在 200 毫秒以内，且断链必须继续——全部机载；后四条都是事件驱动的决策，秒级响应即可，断链时飞机悬停等待不会出事——都可以放地面。这不是两种"风格"，而是同一条判据在不同回路上的必然结果。</w:t>
+      </w:r>
+    </w:p>
+    <w:p>
+      <w:pPr>
+        <w:pStyle w:val="Heading2"/>
+      </w:pPr>
+      <w:r>
+        <w:rPr>
+          <w:rFonts w:ascii="Noto Sans CJK SC" w:hAnsi="Noto Sans CJK SC" w:eastAsia="Noto Sans CJK SC"/>
+          <w:sz w:val="22"/>
+        </w:rPr>
+        <w:t>15.3 时序还暴露了三处边界模糊</w:t>
+      </w:r>
+    </w:p>
+    <w:tbl>
+      <w:tblPr>
+        <w:tblStyle w:val="TableGrid"/>
+        <w:tblW w:type="auto" w:w="0"/>
+        <w:jc w:val="center"/>
+        <w:tblLook w:firstColumn="1" w:firstRow="1" w:lastColumn="0" w:lastRow="0" w:noHBand="0" w:noVBand="1" w:val="04A0"/>
+      </w:tblPr>
+      <w:tblGrid>
+        <w:gridCol w:w="3784"/>
+        <w:gridCol w:w="3784"/>
+        <w:gridCol w:w="3784"/>
+        <w:gridCol w:w="3784"/>
+      </w:tblGrid>
+      <w:tr>
+        <w:tc>
+          <w:tcPr>
+            <w:tcW w:type="dxa" w:w="454"/>
+            <w:shd w:val="clear" w:fill="D9E2F3"/>
+          </w:tcPr>
+          <w:p>
+            <w:r/>
+            <w:r>
+              <w:rPr>
+                <w:rFonts w:ascii="Noto Sans CJK SC" w:hAnsi="Noto Sans CJK SC" w:eastAsia="Noto Sans CJK SC"/>
+                <w:b/>
+                <w:sz w:val="17"/>
+              </w:rPr>
+              <w:t>#</w:t>
+            </w:r>
+          </w:p>
+        </w:tc>
+        <w:tc>
+          <w:tcPr>
+            <w:tcW w:type="dxa" w:w="2721"/>
+            <w:shd w:val="clear" w:fill="D9E2F3"/>
+          </w:tcPr>
+          <w:p>
+            <w:r/>
+            <w:r>
+              <w:rPr>
+                <w:rFonts w:ascii="Noto Sans CJK SC" w:hAnsi="Noto Sans CJK SC" w:eastAsia="Noto Sans CJK SC"/>
+                <w:b/>
+                <w:sz w:val="17"/>
+              </w:rPr>
+              <w:t>位置</w:t>
+            </w:r>
+          </w:p>
+        </w:tc>
+        <w:tc>
+          <w:tcPr>
+            <w:tcW w:type="dxa" w:w="4876"/>
+            <w:shd w:val="clear" w:fill="D9E2F3"/>
+          </w:tcPr>
+          <w:p>
+            <w:r/>
+            <w:r>
+              <w:rPr>
+                <w:rFonts w:ascii="Noto Sans CJK SC" w:hAnsi="Noto Sans CJK SC" w:eastAsia="Noto Sans CJK SC"/>
+                <w:b/>
+                <w:sz w:val="17"/>
+              </w:rPr>
+              <w:t>现状</w:t>
+            </w:r>
+          </w:p>
+        </w:tc>
+        <w:tc>
+          <w:tcPr>
+            <w:tcW w:type="dxa" w:w="7143"/>
+            <w:shd w:val="clear" w:fill="D9E2F3"/>
+          </w:tcPr>
+          <w:p>
+            <w:r/>
+            <w:r>
+              <w:rPr>
+                <w:rFonts w:ascii="Noto Sans CJK SC" w:hAnsi="Noto Sans CJK SC" w:eastAsia="Noto Sans CJK SC"/>
+                <w:b/>
+                <w:sz w:val="17"/>
+              </w:rPr>
+              <w:t>时序给出的判断</w:t>
+            </w:r>
+          </w:p>
+        </w:tc>
+      </w:tr>
+      <w:tr>
+        <w:tc>
+          <w:tcPr>
+            <w:tcW w:type="dxa" w:w="454"/>
+          </w:tcPr>
+          <w:p>
+            <w:pPr>
+              <w:spacing w:after="0"/>
+            </w:pPr>
+            <w:r/>
+            <w:r>
+              <w:rPr>
+                <w:rFonts w:ascii="Noto Sans CJK SC" w:hAnsi="Noto Sans CJK SC" w:eastAsia="Noto Sans CJK SC"/>
+                <w:sz w:val="16"/>
+              </w:rPr>
+              <w:t>1</w:t>
+            </w:r>
+          </w:p>
+        </w:tc>
+        <w:tc>
+          <w:tcPr>
+            <w:tcW w:type="dxa" w:w="2721"/>
+          </w:tcPr>
+          <w:p>
+            <w:pPr>
+              <w:spacing w:after="0"/>
+            </w:pPr>
+            <w:r/>
+            <w:r>
+              <w:rPr>
+                <w:rFonts w:ascii="Noto Sans CJK SC" w:hAnsi="Noto Sans CJK SC" w:eastAsia="Noto Sans CJK SC"/>
+                <w:sz w:val="16"/>
+              </w:rPr>
+              <w:t>takeoff 的完成判定</w:t>
+            </w:r>
+          </w:p>
+        </w:tc>
+        <w:tc>
+          <w:tcPr>
+            <w:tcW w:type="dxa" w:w="4876"/>
+          </w:tcPr>
+          <w:p>
+            <w:pPr>
+              <w:spacing w:after="0"/>
+            </w:pPr>
+            <w:r/>
+            <w:r>
+              <w:rPr>
+                <w:rFonts w:ascii="Noto Sans CJK SC" w:hAnsi="Noto Sans CJK SC" w:eastAsia="Noto Sans CJK SC"/>
+                <w:sz w:val="16"/>
+              </w:rPr>
+              <w:t>在选手侧轮询 armed 与位置稳定窗口（代码核实）</w:t>
+            </w:r>
+          </w:p>
+        </w:tc>
+        <w:tc>
+          <w:tcPr>
+            <w:tcW w:type="dxa" w:w="7143"/>
+          </w:tcPr>
+          <w:p>
+            <w:pPr>
+              <w:spacing w:after="0"/>
+            </w:pPr>
+            <w:r/>
+            <w:r>
+              <w:rPr>
+                <w:rFonts w:ascii="Noto Sans CJK SC" w:hAnsi="Noto Sans CJK SC" w:eastAsia="Noto Sans CJK SC"/>
+                <w:sz w:val="16"/>
+              </w:rPr>
+              <w:t>这是个判定回路，采样周期远小于 200 毫秒，且依赖里程计（真机上 BEST_EFFORT 过 WiFi）——应下沉到机载。这正是第十二章讨论"起飞改 Action"的实质收益</w:t>
+            </w:r>
+          </w:p>
+        </w:tc>
+      </w:tr>
+      <w:tr>
+        <w:tc>
+          <w:tcPr>
+            <w:tcW w:type="dxa" w:w="454"/>
+          </w:tcPr>
+          <w:p>
+            <w:pPr>
+              <w:spacing w:after="0"/>
+            </w:pPr>
+            <w:r/>
+            <w:r>
+              <w:rPr>
+                <w:rFonts w:ascii="Noto Sans CJK SC" w:hAnsi="Noto Sans CJK SC" w:eastAsia="Noto Sans CJK SC"/>
+                <w:sz w:val="16"/>
+              </w:rPr>
+              <w:t>2</w:t>
+            </w:r>
+          </w:p>
+        </w:tc>
+        <w:tc>
+          <w:tcPr>
+            <w:tcW w:type="dxa" w:w="2721"/>
+          </w:tcPr>
+          <w:p>
+            <w:pPr>
+              <w:spacing w:after="0"/>
+            </w:pPr>
+            <w:r/>
+            <w:r>
+              <w:rPr>
+                <w:rFonts w:ascii="Noto Sans CJK SC" w:hAnsi="Noto Sans CJK SC" w:eastAsia="Noto Sans CJK SC"/>
+                <w:sz w:val="16"/>
+              </w:rPr>
+              <w:t>编队完成判定</w:t>
+            </w:r>
+          </w:p>
+        </w:tc>
+        <w:tc>
+          <w:tcPr>
+            <w:tcW w:type="dxa" w:w="4876"/>
+          </w:tcPr>
+          <w:p>
+            <w:pPr>
+              <w:spacing w:after="0"/>
+            </w:pPr>
+            <w:r/>
+            <w:r>
+              <w:rPr>
+                <w:rFonts w:ascii="Noto Sans CJK SC" w:hAnsi="Noto Sans CJK SC" w:eastAsia="Noto Sans CJK SC"/>
+                <w:sz w:val="16"/>
+              </w:rPr>
+              <w:t>SUPPLY 侧 enroute:formation_follow_assumed_complete，注释自陈"近似判定"</w:t>
+            </w:r>
+          </w:p>
+        </w:tc>
+        <w:tc>
+          <w:tcPr>
+            <w:tcW w:type="dxa" w:w="7143"/>
+          </w:tcPr>
+          <w:p>
+            <w:pPr>
+              <w:spacing w:after="0"/>
+            </w:pPr>
+            <w:r/>
+            <w:r>
+              <w:rPr>
+                <w:rFonts w:ascii="Noto Sans CJK SC" w:hAnsi="Noto Sans CJK SC" w:eastAsia="Noto Sans CJK SC"/>
+                <w:sz w:val="16"/>
+              </w:rPr>
+              <w:t>跟随者无从得知长机航线是否真的飞完——判定所需的信息在长机那边，应由长机机载给出结论再经跨机事件告知，而不是跟随者估计</w:t>
+            </w:r>
+          </w:p>
+        </w:tc>
+      </w:tr>
+      <w:tr>
+        <w:tc>
+          <w:tcPr>
+            <w:tcW w:type="dxa" w:w="454"/>
+          </w:tcPr>
+          <w:p>
+            <w:pPr>
+              <w:spacing w:after="0"/>
+            </w:pPr>
+            <w:r/>
+            <w:r>
+              <w:rPr>
+                <w:rFonts w:ascii="Noto Sans CJK SC" w:hAnsi="Noto Sans CJK SC" w:eastAsia="Noto Sans CJK SC"/>
+                <w:sz w:val="16"/>
+              </w:rPr>
+              <w:t>3</w:t>
+            </w:r>
+          </w:p>
+        </w:tc>
+        <w:tc>
+          <w:tcPr>
+            <w:tcW w:type="dxa" w:w="2721"/>
+          </w:tcPr>
+          <w:p>
+            <w:pPr>
+              <w:spacing w:after="0"/>
+            </w:pPr>
+            <w:r/>
+            <w:r>
+              <w:rPr>
+                <w:rFonts w:ascii="Noto Sans CJK SC" w:hAnsi="Noto Sans CJK SC" w:eastAsia="Noto Sans CJK SC"/>
+                <w:sz w:val="16"/>
+              </w:rPr>
+              <w:t>pillar_candidates 的消费方</w:t>
+            </w:r>
+          </w:p>
+        </w:tc>
+        <w:tc>
+          <w:tcPr>
+            <w:tcW w:type="dxa" w:w="4876"/>
+          </w:tcPr>
+          <w:p>
+            <w:pPr>
+              <w:spacing w:after="0"/>
+            </w:pPr>
+            <w:r/>
+            <w:r>
+              <w:rPr>
+                <w:rFonts w:ascii="Noto Sans CJK SC" w:hAnsi="Noto Sans CJK SC" w:eastAsia="Noto Sans CJK SC"/>
+                <w:sz w:val="16"/>
+              </w:rPr>
+              <w:t>pillar_detector_node 发布，fire_pillar_aim_node 订阅（代码核实）；模块状态表记为"未集成、死代码"</w:t>
+            </w:r>
+          </w:p>
+        </w:tc>
+        <w:tc>
+          <w:tcPr>
+            <w:tcW w:type="dxa" w:w="7143"/>
+          </w:tcPr>
+          <w:p>
+            <w:pPr>
+              <w:spacing w:after="0"/>
+            </w:pPr>
+            <w:r/>
+            <w:r>
+              <w:rPr>
+                <w:rFonts w:ascii="Noto Sans CJK SC" w:hAnsi="Noto Sans CJK SC" w:eastAsia="Noto Sans CJK SC"/>
+                <w:sz w:val="16"/>
+              </w:rPr>
+              <w:t>按时序，这条回路完全在机载闭合，选手程序不参与——所以"死代码"的说法应修正为"选手程序不直接消费，机载侧由 fire_pillar_aim_node 消费"</w:t>
+            </w:r>
+          </w:p>
+        </w:tc>
+      </w:tr>
+    </w:tbl>
+    <w:p>
+      <w:pPr>
+        <w:spacing w:after="120"/>
+      </w:pPr>
+    </w:p>
+    <w:p>
+      <w:pPr>
+        <w:pStyle w:val="Heading2"/>
+      </w:pPr>
+      <w:r>
+        <w:rPr>
+          <w:rFonts w:ascii="Noto Sans CJK SC" w:hAnsi="Noto Sans CJK SC" w:eastAsia="Noto Sans CJK SC"/>
+          <w:sz w:val="22"/>
+        </w:rPr>
+        <w:t>15.4 一条推论：接口边界应当落在回路之外</w:t>
+      </w:r>
+    </w:p>
+    <w:p>
+      <w:pPr>
+        <w:spacing w:after="80"/>
+      </w:pPr>
+      <w:r>
+        <w:rPr>
+          <w:rFonts w:ascii="Noto Sans CJK SC" w:hAnsi="Noto Sans CJK SC" w:eastAsia="Noto Sans CJK SC"/>
+          <w:b w:val="0"/>
+          <w:i w:val="0"/>
+          <w:sz w:val="18"/>
+        </w:rPr>
+        <w:t>既然回路必须完整地待在机载，那么选手程序与机载之间的接口，就只能切在回路的外面——也就是"启动这个回路"和"这个回路的结论"这两个点上。这正是本项目现有设计的形态：center_on_target 触发机载伺服回路并取回收敛坐标、start_formation_follow 启停机载跟随回路、do_action 触发机载执行机构回路并等完成。接口切在回路外面，链路延迟就只影响响应快慢，不影响回路稳定性；一旦切进回路内部（比如把"读位置→算目标点→发指令"分到两端），延迟就会直接进入控制品质。</w:t>
+      </w:r>
     </w:p>
     <w:sectPr>
       <w:pgSz w:w="16838" w:h="11906" w:orient="landscape"/>

</xml_diff>

<commit_message>
Silence precision_servo standby ERROR; document the takeoff action landing
1) 日志噪音清理：precision_servo_node 空闲时每 5 秒刷一条 ERROR
   "servo_mode参数当前值''不合法"。但空字符串是刻意设计的"待命"状态——
   这个节点由 entrypoint 每架飞机常驻拉起，容器启动那一刻不可能知道该是
   center_only 还是 precision_land，就是要等 SDK 显式设置（见该文件头
   "2026-09-13补充"与构造函数里那段 warn）。待命是预期行为，不该按 ERROR
   报。改为：空字符串只在第一次进入待命时打一条 info，拿到合法模式后复位
   标志（这样将来模式被清回空值时还会再提示一次）；非空但不合法（真的设
   错了）仍然保留 ERROR 与原有 throttle。

2) 文档更新（23 页增至 25 页）：
   - 9.2 现状表 takeoff 行改为"已改 Action、判定在机载"，并注明
     ros2_px4_stack 那条路线仍不支持
   - 12.6 推进顺序把起飞标记为已完成，说明它原计划排最后、实际因判定下沉
     的收益明确而提前
   - 15.3 边界模糊第 1 条（takeoff 判定仍在客户端）标记为已解决
   - 新增第十六章"落地记录"：改了什么、为什么"已在空中"要单独短路、五项
     实测结果、收益与仍在的三条约束（ros2_px4_stack 不支持、多写者仍存在、
     build 顺序要求），以及本次顺带清理的日志噪音

Co-Authored-By: Claude Opus 5 <noreply@anthropic.com>
</commit_message>
<xml_diff>
--- a/模块运行位置与消息流转设计表.docx
+++ b/模块运行位置与消息流转设计表.docx
@@ -12231,7 +12231,7 @@
                 <w:rFonts w:ascii="Noto Sans CJK SC" w:hAnsi="Noto Sans CJK SC" w:eastAsia="Noto Sans CJK SC"/>
                 <w:sz w:val="16"/>
               </w:rPr>
-              <w:t>发布 TakeoffLand 到 takeoff_land 话题 + 选手侧轮询</w:t>
+              <w:t>2026-09-20 已改为 ROS 2 Action（quadrotor_msgs/action/Takeoff），server 在机载 takeoff_monitor_node；server 不在时自动退回原路径</w:t>
             </w:r>
           </w:p>
         </w:tc>
@@ -12249,7 +12249,7 @@
                 <w:rFonts w:ascii="Noto Sans CJK SC" w:hAnsi="Noto Sans CJK SC" w:eastAsia="Noto Sans CJK SC"/>
                 <w:sz w:val="16"/>
               </w:rPr>
-              <w:t>选手侧：轮询 armed，再连续采样位置稳定窗口 + 最小爬升量推断"起飞完成"</w:t>
+              <w:t>机载：server 自己发 takeoff_land、自己看 armed 与里程计、自己判完成</w:t>
             </w:r>
           </w:p>
         </w:tc>
@@ -12267,7 +12267,7 @@
                 <w:rFonts w:ascii="Noto Sans CJK SC" w:hAnsi="Noto Sans CJK SC" w:eastAsia="Noto Sans CJK SC"/>
                 <w:sz w:val="16"/>
               </w:rPr>
-              <w:t>判定逻辑在客户端；失败原因分不清"没解锁"还是"爬升不到位"；裸话题发布对端未匹配时永久丢失且发布方不知情</w:t>
+              <w:t>已解决（见第十六章）。失败按阶段分开报（armed / stable）；仍在的约束：CONTROLLER=ros2_px4_stack 那条路线没有 takeoff_land 话题，不支持</w:t>
             </w:r>
           </w:p>
         </w:tc>
@@ -20721,6 +20721,62 @@
                 <w:rFonts w:ascii="Noto Sans CJK SC" w:hAnsi="Noto Sans CJK SC" w:eastAsia="Noto Sans CJK SC"/>
                 <w:sz w:val="16"/>
               </w:rPr>
+              <w:t>已完成（2026-09-20）</w:t>
+            </w:r>
+          </w:p>
+        </w:tc>
+        <w:tc>
+          <w:tcPr>
+            <w:tcW w:type="dxa" w:w="5329"/>
+          </w:tcPr>
+          <w:p>
+            <w:pPr>
+              <w:spacing w:after="0"/>
+            </w:pPr>
+            <w:r/>
+            <w:r>
+              <w:rPr>
+                <w:rFonts w:ascii="Noto Sans CJK SC" w:hAnsi="Noto Sans CJK SC" w:eastAsia="Noto Sans CJK SC"/>
+                <w:sz w:val="16"/>
+              </w:rPr>
+              <w:t>起飞改 Action 并把完成判定下沉到机载</w:t>
+            </w:r>
+          </w:p>
+        </w:tc>
+        <w:tc>
+          <w:tcPr>
+            <w:tcW w:type="dxa" w:w="7824"/>
+          </w:tcPr>
+          <w:p>
+            <w:pPr>
+              <w:spacing w:after="0"/>
+            </w:pPr>
+            <w:r/>
+            <w:r>
+              <w:rPr>
+                <w:rFonts w:ascii="Noto Sans CJK SC" w:hAnsi="Noto Sans CJK SC" w:eastAsia="Noto Sans CJK SC"/>
+                <w:sz w:val="16"/>
+              </w:rPr>
+              <w:t>实测四项通过，见第十六章；原计划排在最后，实际因判定下沉的收益明确而提前</w:t>
+            </w:r>
+          </w:p>
+        </w:tc>
+      </w:tr>
+      <w:tr>
+        <w:tc>
+          <w:tcPr>
+            <w:tcW w:type="dxa" w:w="2041"/>
+          </w:tcPr>
+          <w:p>
+            <w:pPr>
+              <w:spacing w:after="0"/>
+            </w:pPr>
+            <w:r/>
+            <w:r>
+              <w:rPr>
+                <w:rFonts w:ascii="Noto Sans CJK SC" w:hAnsi="Noto Sans CJK SC" w:eastAsia="Noto Sans CJK SC"/>
+                <w:sz w:val="16"/>
+              </w:rPr>
               <w:t>赛后</w:t>
             </w:r>
           </w:p>
@@ -20739,7 +20795,7 @@
                 <w:rFonts w:ascii="Noto Sans CJK SC" w:hAnsi="Noto Sans CJK SC" w:eastAsia="Noto Sans CJK SC"/>
                 <w:sz w:val="16"/>
               </w:rPr>
-              <w:t>推广到 goto、编队跟随，最后是起飞</w:t>
+              <w:t>推广到 goto、编队跟随</w:t>
             </w:r>
           </w:p>
         </w:tc>
@@ -20757,7 +20813,7 @@
                 <w:rFonts w:ascii="Noto Sans CJK SC" w:hAnsi="Noto Sans CJK SC" w:eastAsia="Noto Sans CJK SC"/>
                 <w:sz w:val="16"/>
               </w:rPr>
-              <w:t>起飞是所有测试的入口，D3 尚未验收通过，此时换机制会让"失败是新机制还是任务逻辑"难以区分</w:t>
+              <w:t>两者都已有可用实现，换机制的收益不如起飞明显，不急</w:t>
             </w:r>
           </w:p>
         </w:tc>
@@ -25427,7 +25483,7 @@
                 <w:rFonts w:ascii="Noto Sans CJK SC" w:hAnsi="Noto Sans CJK SC" w:eastAsia="Noto Sans CJK SC"/>
                 <w:sz w:val="16"/>
               </w:rPr>
-              <w:t>在选手侧轮询 armed 与位置稳定窗口（代码核实）</w:t>
+              <w:t>已解决（2026-09-20）：下沉到机载 takeoff_monitor_node，见第十六章</w:t>
             </w:r>
           </w:p>
         </w:tc>
@@ -25445,7 +25501,7 @@
                 <w:rFonts w:ascii="Noto Sans CJK SC" w:hAnsi="Noto Sans CJK SC" w:eastAsia="Noto Sans CJK SC"/>
                 <w:sz w:val="16"/>
               </w:rPr>
-              <w:t>这是个判定回路，采样周期远小于 200 毫秒，且依赖里程计（真机上 BEST_EFFORT 过 WiFi）——应下沉到机载。这正是第十二章讨论"起飞改 Action"的实质收益</w:t>
+              <w:t>原状态是在选手侧轮询 armed 与位置稳定窗口。这是个判定回路，采样周期远小于 200 毫秒且依赖里程计（真机上 BEST_EFFORT 过 WiFi），按判据应当机载</w:t>
             </w:r>
           </w:p>
         </w:tc>
@@ -25628,6 +25684,1167 @@
           <w:sz w:val="18"/>
         </w:rPr>
         <w:t>既然回路必须完整地待在机载，那么选手程序与机载之间的接口，就只能切在回路的外面——也就是"启动这个回路"和"这个回路的结论"这两个点上。这正是本项目现有设计的形态：center_on_target 触发机载伺服回路并取回收敛坐标、start_formation_follow 启停机载跟随回路、do_action 触发机载执行机构回路并等完成。接口切在回路外面，链路延迟就只影响响应快慢，不影响回路稳定性；一旦切进回路内部（比如把"读位置→算目标点→发指令"分到两端），延迟就会直接进入控制品质。</w:t>
+      </w:r>
+    </w:p>
+    <w:p>
+      <w:r>
+        <w:br w:type="page"/>
+      </w:r>
+    </w:p>
+    <w:p>
+      <w:pPr>
+        <w:pStyle w:val="Heading1"/>
+      </w:pPr>
+      <w:r>
+        <w:rPr>
+          <w:rFonts w:ascii="Noto Sans CJK SC" w:hAnsi="Noto Sans CJK SC" w:eastAsia="Noto Sans CJK SC"/>
+          <w:sz w:val="28"/>
+        </w:rPr>
+        <w:t>十六、落地记录：起飞完成判定下沉到机载（2026-09-20）</w:t>
+      </w:r>
+    </w:p>
+    <w:p>
+      <w:pPr>
+        <w:spacing w:after="80"/>
+      </w:pPr>
+      <w:r>
+        <w:rPr>
+          <w:rFonts w:ascii="Noto Sans CJK SC" w:hAnsi="Noto Sans CJK SC" w:eastAsia="Noto Sans CJK SC"/>
+          <w:b w:val="0"/>
+          <w:i w:val="0"/>
+          <w:sz w:val="18"/>
+        </w:rPr>
+        <w:t>本章是第十三至十五章结论的第一次落地，也是"接口边界落在回路之外"这条推论的实例。</w:t>
+      </w:r>
+    </w:p>
+    <w:p>
+      <w:pPr>
+        <w:pStyle w:val="Heading2"/>
+      </w:pPr>
+      <w:r>
+        <w:rPr>
+          <w:rFonts w:ascii="Noto Sans CJK SC" w:hAnsi="Noto Sans CJK SC" w:eastAsia="Noto Sans CJK SC"/>
+          <w:sz w:val="22"/>
+        </w:rPr>
+        <w:t>16.1 改了什么</w:t>
+      </w:r>
+    </w:p>
+    <w:tbl>
+      <w:tblPr>
+        <w:tblStyle w:val="TableGrid"/>
+        <w:tblW w:type="auto" w:w="0"/>
+        <w:jc w:val="center"/>
+        <w:tblLook w:firstColumn="1" w:firstRow="1" w:lastColumn="0" w:lastRow="0" w:noHBand="0" w:noVBand="1" w:val="04A0"/>
+      </w:tblPr>
+      <w:tblGrid>
+        <w:gridCol w:w="7569"/>
+        <w:gridCol w:w="7569"/>
+      </w:tblGrid>
+      <w:tr>
+        <w:tc>
+          <w:tcPr>
+            <w:tcW w:type="dxa" w:w="2041"/>
+            <w:shd w:val="clear" w:fill="D9E2F3"/>
+          </w:tcPr>
+          <w:p>
+            <w:r/>
+            <w:r>
+              <w:rPr>
+                <w:rFonts w:ascii="Noto Sans CJK SC" w:hAnsi="Noto Sans CJK SC" w:eastAsia="Noto Sans CJK SC"/>
+                <w:b/>
+                <w:sz w:val="17"/>
+              </w:rPr>
+              <w:t>项</w:t>
+            </w:r>
+          </w:p>
+        </w:tc>
+        <w:tc>
+          <w:tcPr>
+            <w:tcW w:type="dxa" w:w="13153"/>
+            <w:shd w:val="clear" w:fill="D9E2F3"/>
+          </w:tcPr>
+          <w:p>
+            <w:r/>
+            <w:r>
+              <w:rPr>
+                <w:rFonts w:ascii="Noto Sans CJK SC" w:hAnsi="Noto Sans CJK SC" w:eastAsia="Noto Sans CJK SC"/>
+                <w:b/>
+                <w:sz w:val="17"/>
+              </w:rPr>
+              <w:t>内容</w:t>
+            </w:r>
+          </w:p>
+        </w:tc>
+      </w:tr>
+      <w:tr>
+        <w:tc>
+          <w:tcPr>
+            <w:tcW w:type="dxa" w:w="2041"/>
+          </w:tcPr>
+          <w:p>
+            <w:pPr>
+              <w:spacing w:after="0"/>
+            </w:pPr>
+            <w:r/>
+            <w:r>
+              <w:rPr>
+                <w:rFonts w:ascii="Noto Sans CJK SC" w:hAnsi="Noto Sans CJK SC" w:eastAsia="Noto Sans CJK SC"/>
+                <w:sz w:val="16"/>
+              </w:rPr>
+              <w:t>接口定义</w:t>
+            </w:r>
+          </w:p>
+        </w:tc>
+        <w:tc>
+          <w:tcPr>
+            <w:tcW w:type="dxa" w:w="13153"/>
+          </w:tcPr>
+          <w:p>
+            <w:pPr>
+              <w:spacing w:after="0"/>
+            </w:pPr>
+            <w:r/>
+            <w:r>
+              <w:rPr>
+                <w:rFonts w:ascii="Noto Sans CJK SC" w:hAnsi="Noto Sans CJK SC" w:eastAsia="Noto Sans CJK SC"/>
+                <w:sz w:val="16"/>
+              </w:rPr>
+              <w:t>quadrotor_msgs 新增 action/Takeoff.action：goal 带 timeout_s；result 带 success / stage / message / final_z；feedback 带 phase / armed / current_z / climb_m。CMakeLists 与 package.xml 各加 action_msgs 依赖与注册，共 4 行</w:t>
+            </w:r>
+          </w:p>
+        </w:tc>
+      </w:tr>
+      <w:tr>
+        <w:tc>
+          <w:tcPr>
+            <w:tcW w:type="dxa" w:w="2041"/>
+          </w:tcPr>
+          <w:p>
+            <w:pPr>
+              <w:spacing w:after="0"/>
+            </w:pPr>
+            <w:r/>
+            <w:r>
+              <w:rPr>
+                <w:rFonts w:ascii="Noto Sans CJK SC" w:hAnsi="Noto Sans CJK SC" w:eastAsia="Noto Sans CJK SC"/>
+                <w:sz w:val="16"/>
+              </w:rPr>
+              <w:t>机载 server</w:t>
+            </w:r>
+          </w:p>
+        </w:tc>
+        <w:tc>
+          <w:tcPr>
+            <w:tcW w:type="dxa" w:w="13153"/>
+          </w:tcPr>
+          <w:p>
+            <w:pPr>
+              <w:spacing w:after="0"/>
+            </w:pPr>
+            <w:r/>
+            <w:r>
+              <w:rPr>
+                <w:rFonts w:ascii="Noto Sans CJK SC" w:hAnsi="Noto Sans CJK SC" w:eastAsia="Noto Sans CJK SC"/>
+                <w:sz w:val="16"/>
+              </w:rPr>
+              <w:t>新增 contest_mission/takeoff_monitor_node.py：ActionServer，自己发 takeoff_land、自己看 armed 与里程计、自己判完成。判定逻辑与原 SDK 那段逐行对应，含 2026-09-14 踩过的 first_sample_time 那个坑（原样保留并加了反向验证用例）</w:t>
+            </w:r>
+          </w:p>
+        </w:tc>
+      </w:tr>
+      <w:tr>
+        <w:tc>
+          <w:tcPr>
+            <w:tcW w:type="dxa" w:w="2041"/>
+          </w:tcPr>
+          <w:p>
+            <w:pPr>
+              <w:spacing w:after="0"/>
+            </w:pPr>
+            <w:r/>
+            <w:r>
+              <w:rPr>
+                <w:rFonts w:ascii="Noto Sans CJK SC" w:hAnsi="Noto Sans CJK SC" w:eastAsia="Noto Sans CJK SC"/>
+                <w:sz w:val="16"/>
+              </w:rPr>
+              <w:t>SDK 客户端</w:t>
+            </w:r>
+          </w:p>
+        </w:tc>
+        <w:tc>
+          <w:tcPr>
+            <w:tcW w:type="dxa" w:w="13153"/>
+          </w:tcPr>
+          <w:p>
+            <w:pPr>
+              <w:spacing w:after="0"/>
+            </w:pPr>
+            <w:r/>
+            <w:r>
+              <w:rPr>
+                <w:rFonts w:ascii="Noto Sans CJK SC" w:hAnsi="Noto Sans CJK SC" w:eastAsia="Noto Sans CJK SC"/>
+                <w:sz w:val="16"/>
+              </w:rPr>
+              <w:t>capabilities.py::takeoff() 优先走 action；server 探测不到时自动退回原来的选手侧判定</w:t>
+            </w:r>
+          </w:p>
+        </w:tc>
+      </w:tr>
+      <w:tr>
+        <w:tc>
+          <w:tcPr>
+            <w:tcW w:type="dxa" w:w="2041"/>
+          </w:tcPr>
+          <w:p>
+            <w:pPr>
+              <w:spacing w:after="0"/>
+            </w:pPr>
+            <w:r/>
+            <w:r>
+              <w:rPr>
+                <w:rFonts w:ascii="Noto Sans CJK SC" w:hAnsi="Noto Sans CJK SC" w:eastAsia="Noto Sans CJK SC"/>
+                <w:sz w:val="16"/>
+              </w:rPr>
+              <w:t>已在空中短路</w:t>
+            </w:r>
+          </w:p>
+        </w:tc>
+        <w:tc>
+          <w:tcPr>
+            <w:tcW w:type="dxa" w:w="13153"/>
+          </w:tcPr>
+          <w:p>
+            <w:pPr>
+              <w:spacing w:after="0"/>
+            </w:pPr>
+            <w:r/>
+            <w:r>
+              <w:rPr>
+                <w:rFonts w:ascii="Noto Sans CJK SC" w:hAnsi="Noto Sans CJK SC" w:eastAsia="Noto Sans CJK SC"/>
+                <w:sz w:val="16"/>
+              </w:rPr>
+              <w:t>两条路径都补上：飞机已解锁且高度超过阈值时直接返回成功，且不重复下发起飞指令</w:t>
+            </w:r>
+          </w:p>
+        </w:tc>
+      </w:tr>
+      <w:tr>
+        <w:tc>
+          <w:tcPr>
+            <w:tcW w:type="dxa" w:w="2041"/>
+          </w:tcPr>
+          <w:p>
+            <w:pPr>
+              <w:spacing w:after="0"/>
+            </w:pPr>
+            <w:r/>
+            <w:r>
+              <w:rPr>
+                <w:rFonts w:ascii="Noto Sans CJK SC" w:hAnsi="Noto Sans CJK SC" w:eastAsia="Noto Sans CJK SC"/>
+                <w:sz w:val="16"/>
+              </w:rPr>
+              <w:t>启动配置</w:t>
+            </w:r>
+          </w:p>
+        </w:tc>
+        <w:tc>
+          <w:tcPr>
+            <w:tcW w:type="dxa" w:w="13153"/>
+          </w:tcPr>
+          <w:p>
+            <w:pPr>
+              <w:spacing w:after="0"/>
+            </w:pPr>
+            <w:r/>
+            <w:r>
+              <w:rPr>
+                <w:rFonts w:ascii="Noto Sans CJK SC" w:hAnsi="Noto Sans CJK SC" w:eastAsia="Noto Sans CJK SC"/>
+                <w:sz w:val="16"/>
+              </w:rPr>
+              <w:t>setup.py 注册 entry point；flight-stack-entrypoint.sh 增加启动行</w:t>
+            </w:r>
+          </w:p>
+        </w:tc>
+      </w:tr>
+      <w:tr>
+        <w:tc>
+          <w:tcPr>
+            <w:tcW w:type="dxa" w:w="2041"/>
+          </w:tcPr>
+          <w:p>
+            <w:pPr>
+              <w:spacing w:after="0"/>
+            </w:pPr>
+            <w:r/>
+            <w:r>
+              <w:rPr>
+                <w:rFonts w:ascii="Noto Sans CJK SC" w:hAnsi="Noto Sans CJK SC" w:eastAsia="Noto Sans CJK SC"/>
+                <w:sz w:val="16"/>
+              </w:rPr>
+              <w:t>不改的</w:t>
+            </w:r>
+          </w:p>
+        </w:tc>
+        <w:tc>
+          <w:tcPr>
+            <w:tcW w:type="dxa" w:w="13153"/>
+          </w:tcPr>
+          <w:p>
+            <w:pPr>
+              <w:spacing w:after="0"/>
+            </w:pPr>
+            <w:r/>
+            <w:r>
+              <w:rPr>
+                <w:rFonts w:ascii="Noto Sans CJK SC" w:hAnsi="Noto Sans CJK SC" w:eastAsia="Noto Sans CJK SC"/>
+                <w:sz w:val="16"/>
+              </w:rPr>
+              <w:t>任何控制器都没动。server 对下仍发 takeoff_land，pt4ctrl / px4ctrl / so3ctrl 三者共享 vendor/px4ctrl_ros2 同一套 FSM 结构，一份实现通吃</w:t>
+            </w:r>
+          </w:p>
+        </w:tc>
+      </w:tr>
+    </w:tbl>
+    <w:p>
+      <w:pPr>
+        <w:spacing w:after="120"/>
+      </w:pPr>
+    </w:p>
+    <w:p>
+      <w:pPr>
+        <w:pStyle w:val="Heading2"/>
+      </w:pPr>
+      <w:r>
+        <w:rPr>
+          <w:rFonts w:ascii="Noto Sans CJK SC" w:hAnsi="Noto Sans CJK SC" w:eastAsia="Noto Sans CJK SC"/>
+          <w:sz w:val="22"/>
+        </w:rPr>
+        <w:t>16.2 为什么"已在空中"要单独短路</w:t>
+      </w:r>
+    </w:p>
+    <w:p>
+      <w:pPr>
+        <w:spacing w:after="80"/>
+      </w:pPr>
+      <w:r>
+        <w:rPr>
+          <w:rFonts w:ascii="Noto Sans CJK SC" w:hAnsi="Noto Sans CJK SC" w:eastAsia="Noto Sans CJK SC"/>
+          <w:b w:val="0"/>
+          <w:i w:val="0"/>
+          <w:sz w:val="18"/>
+        </w:rPr>
+        <w:t>原来（以及改造前的 SDK 判定）在飞机已经悬停时再调一次 takeoff()，爬升基线 z_at_armed 会取成当前悬停高度，"相对基线再爬升 min_climb_m"这个条件永远不成立，于是白白等到超时才报错——2026-09-20 实测复现过（60 秒超时失败）。正确行为是立刻返回成功，并且不重复下发起飞指令：飞机正在 AUTO_HOVER，再塞一条 TAKEOFF 只会扰动控制器状态机。判定条件是"armed 为真"且"里程计高度超过阈值"——只看 armed 不够，地面上解锁待命也是 armed，那种情况必须继续走正常起飞流程。</w:t>
+      </w:r>
+    </w:p>
+    <w:p>
+      <w:pPr>
+        <w:pStyle w:val="Heading2"/>
+      </w:pPr>
+      <w:r>
+        <w:rPr>
+          <w:rFonts w:ascii="Noto Sans CJK SC" w:hAnsi="Noto Sans CJK SC" w:eastAsia="Noto Sans CJK SC"/>
+          <w:sz w:val="22"/>
+        </w:rPr>
+        <w:t>16.3 实测结果（2026-09-20，双机仿真）</w:t>
+      </w:r>
+    </w:p>
+    <w:tbl>
+      <w:tblPr>
+        <w:tblStyle w:val="TableGrid"/>
+        <w:tblW w:type="auto" w:w="0"/>
+        <w:jc w:val="center"/>
+        <w:tblLook w:firstColumn="1" w:firstRow="1" w:lastColumn="0" w:lastRow="0" w:noHBand="0" w:noVBand="1" w:val="04A0"/>
+      </w:tblPr>
+      <w:tblGrid>
+        <w:gridCol w:w="5046"/>
+        <w:gridCol w:w="5046"/>
+        <w:gridCol w:w="5046"/>
+      </w:tblGrid>
+      <w:tr>
+        <w:tc>
+          <w:tcPr>
+            <w:tcW w:type="dxa" w:w="454"/>
+            <w:shd w:val="clear" w:fill="D9E2F3"/>
+          </w:tcPr>
+          <w:p>
+            <w:r/>
+            <w:r>
+              <w:rPr>
+                <w:rFonts w:ascii="Noto Sans CJK SC" w:hAnsi="Noto Sans CJK SC" w:eastAsia="Noto Sans CJK SC"/>
+                <w:b/>
+                <w:sz w:val="17"/>
+              </w:rPr>
+              <w:t>#</w:t>
+            </w:r>
+          </w:p>
+        </w:tc>
+        <w:tc>
+          <w:tcPr>
+            <w:tcW w:type="dxa" w:w="5102"/>
+            <w:shd w:val="clear" w:fill="D9E2F3"/>
+          </w:tcPr>
+          <w:p>
+            <w:r/>
+            <w:r>
+              <w:rPr>
+                <w:rFonts w:ascii="Noto Sans CJK SC" w:hAnsi="Noto Sans CJK SC" w:eastAsia="Noto Sans CJK SC"/>
+                <w:b/>
+                <w:sz w:val="17"/>
+              </w:rPr>
+              <w:t>测试</w:t>
+            </w:r>
+          </w:p>
+        </w:tc>
+        <w:tc>
+          <w:tcPr>
+            <w:tcW w:type="dxa" w:w="9638"/>
+            <w:shd w:val="clear" w:fill="D9E2F3"/>
+          </w:tcPr>
+          <w:p>
+            <w:r/>
+            <w:r>
+              <w:rPr>
+                <w:rFonts w:ascii="Noto Sans CJK SC" w:hAnsi="Noto Sans CJK SC" w:eastAsia="Noto Sans CJK SC"/>
+                <w:b/>
+                <w:sz w:val="17"/>
+              </w:rPr>
+              <w:t>结果</w:t>
+            </w:r>
+          </w:p>
+        </w:tc>
+      </w:tr>
+      <w:tr>
+        <w:tc>
+          <w:tcPr>
+            <w:tcW w:type="dxa" w:w="454"/>
+          </w:tcPr>
+          <w:p>
+            <w:pPr>
+              <w:spacing w:after="0"/>
+            </w:pPr>
+            <w:r/>
+            <w:r>
+              <w:rPr>
+                <w:rFonts w:ascii="Noto Sans CJK SC" w:hAnsi="Noto Sans CJK SC" w:eastAsia="Noto Sans CJK SC"/>
+                <w:sz w:val="16"/>
+              </w:rPr>
+              <w:t>1</w:t>
+            </w:r>
+          </w:p>
+        </w:tc>
+        <w:tc>
+          <w:tcPr>
+            <w:tcW w:type="dxa" w:w="5102"/>
+          </w:tcPr>
+          <w:p>
+            <w:pPr>
+              <w:spacing w:after="0"/>
+            </w:pPr>
+            <w:r/>
+            <w:r>
+              <w:rPr>
+                <w:rFonts w:ascii="Noto Sans CJK SC" w:hAnsi="Noto Sans CJK SC" w:eastAsia="Noto Sans CJK SC"/>
+                <w:sz w:val="16"/>
+              </w:rPr>
+              <w:t>ros2 action send_goal 直接调用（绕过 SDK）</w:t>
+            </w:r>
+          </w:p>
+        </w:tc>
+        <w:tc>
+          <w:tcPr>
+            <w:tcW w:type="dxa" w:w="9638"/>
+          </w:tcPr>
+          <w:p>
+            <w:pPr>
+              <w:spacing w:after="0"/>
+            </w:pPr>
+            <w:r/>
+            <w:r>
+              <w:rPr>
+                <w:rFonts w:ascii="Noto Sans CJK SC" w:hAnsi="Noto Sans CJK SC" w:eastAsia="Noto Sans CJK SC"/>
+                <w:sz w:val="16"/>
+              </w:rPr>
+              <w:t>通过：goal 接受、feedback 推送阶段、result success=true stage=done final_z=0.93m</w:t>
+            </w:r>
+          </w:p>
+        </w:tc>
+      </w:tr>
+      <w:tr>
+        <w:tc>
+          <w:tcPr>
+            <w:tcW w:type="dxa" w:w="454"/>
+          </w:tcPr>
+          <w:p>
+            <w:pPr>
+              <w:spacing w:after="0"/>
+            </w:pPr>
+            <w:r/>
+            <w:r>
+              <w:rPr>
+                <w:rFonts w:ascii="Noto Sans CJK SC" w:hAnsi="Noto Sans CJK SC" w:eastAsia="Noto Sans CJK SC"/>
+                <w:sz w:val="16"/>
+              </w:rPr>
+              <w:t>2</w:t>
+            </w:r>
+          </w:p>
+        </w:tc>
+        <w:tc>
+          <w:tcPr>
+            <w:tcW w:type="dxa" w:w="5102"/>
+          </w:tcPr>
+          <w:p>
+            <w:pPr>
+              <w:spacing w:after="0"/>
+            </w:pPr>
+            <w:r/>
+            <w:r>
+              <w:rPr>
+                <w:rFonts w:ascii="Noto Sans CJK SC" w:hAnsi="Noto Sans CJK SC" w:eastAsia="Noto Sans CJK SC"/>
+                <w:sz w:val="16"/>
+              </w:rPr>
+              <w:t>SDK 走 action 路径（NX02）</w:t>
+            </w:r>
+          </w:p>
+        </w:tc>
+        <w:tc>
+          <w:tcPr>
+            <w:tcW w:type="dxa" w:w="9638"/>
+          </w:tcPr>
+          <w:p>
+            <w:pPr>
+              <w:spacing w:after="0"/>
+            </w:pPr>
+            <w:r/>
+            <w:r>
+              <w:rPr>
+                <w:rFonts w:ascii="Noto Sans CJK SC" w:hAnsi="Noto Sans CJK SC" w:eastAsia="Noto Sans CJK SC"/>
+                <w:sz w:val="16"/>
+              </w:rPr>
+              <w:t>通过：feedback 带"判定在机载"，起飞成功</w:t>
+            </w:r>
+          </w:p>
+        </w:tc>
+      </w:tr>
+      <w:tr>
+        <w:tc>
+          <w:tcPr>
+            <w:tcW w:type="dxa" w:w="454"/>
+          </w:tcPr>
+          <w:p>
+            <w:pPr>
+              <w:spacing w:after="0"/>
+            </w:pPr>
+            <w:r/>
+            <w:r>
+              <w:rPr>
+                <w:rFonts w:ascii="Noto Sans CJK SC" w:hAnsi="Noto Sans CJK SC" w:eastAsia="Noto Sans CJK SC"/>
+                <w:sz w:val="16"/>
+              </w:rPr>
+              <w:t>3</w:t>
+            </w:r>
+          </w:p>
+        </w:tc>
+        <w:tc>
+          <w:tcPr>
+            <w:tcW w:type="dxa" w:w="5102"/>
+          </w:tcPr>
+          <w:p>
+            <w:pPr>
+              <w:spacing w:after="0"/>
+            </w:pPr>
+            <w:r/>
+            <w:r>
+              <w:rPr>
+                <w:rFonts w:ascii="Noto Sans CJK SC" w:hAnsi="Noto Sans CJK SC" w:eastAsia="Noto Sans CJK SC"/>
+                <w:sz w:val="16"/>
+              </w:rPr>
+              <w:t>退路：杀掉机载节点后调 takeoff()（NX01）</w:t>
+            </w:r>
+          </w:p>
+        </w:tc>
+        <w:tc>
+          <w:tcPr>
+            <w:tcW w:type="dxa" w:w="9638"/>
+          </w:tcPr>
+          <w:p>
+            <w:pPr>
+              <w:spacing w:after="0"/>
+            </w:pPr>
+            <w:r/>
+            <w:r>
+              <w:rPr>
+                <w:rFonts w:ascii="Noto Sans CJK SC" w:hAnsi="Noto Sans CJK SC" w:eastAsia="Noto Sans CJK SC"/>
+                <w:sz w:val="16"/>
+              </w:rPr>
+              <w:t>通过：打印"退回选手侧判定"，按原路径起飞成功</w:t>
+            </w:r>
+          </w:p>
+        </w:tc>
+      </w:tr>
+      <w:tr>
+        <w:tc>
+          <w:tcPr>
+            <w:tcW w:type="dxa" w:w="454"/>
+          </w:tcPr>
+          <w:p>
+            <w:pPr>
+              <w:spacing w:after="0"/>
+            </w:pPr>
+            <w:r/>
+            <w:r>
+              <w:rPr>
+                <w:rFonts w:ascii="Noto Sans CJK SC" w:hAnsi="Noto Sans CJK SC" w:eastAsia="Noto Sans CJK SC"/>
+                <w:sz w:val="16"/>
+              </w:rPr>
+              <w:t>4</w:t>
+            </w:r>
+          </w:p>
+        </w:tc>
+        <w:tc>
+          <w:tcPr>
+            <w:tcW w:type="dxa" w:w="5102"/>
+          </w:tcPr>
+          <w:p>
+            <w:pPr>
+              <w:spacing w:after="0"/>
+            </w:pPr>
+            <w:r/>
+            <w:r>
+              <w:rPr>
+                <w:rFonts w:ascii="Noto Sans CJK SC" w:hAnsi="Noto Sans CJK SC" w:eastAsia="Noto Sans CJK SC"/>
+                <w:sz w:val="16"/>
+              </w:rPr>
+              <w:t>已在空中短路：悬停时再调一次 takeoff()</w:t>
+            </w:r>
+          </w:p>
+        </w:tc>
+        <w:tc>
+          <w:tcPr>
+            <w:tcW w:type="dxa" w:w="9638"/>
+          </w:tcPr>
+          <w:p>
+            <w:pPr>
+              <w:spacing w:after="0"/>
+            </w:pPr>
+            <w:r/>
+            <w:r>
+              <w:rPr>
+                <w:rFonts w:ascii="Noto Sans CJK SC" w:hAnsi="Noto Sans CJK SC" w:eastAsia="Noto Sans CJK SC"/>
+                <w:sz w:val="16"/>
+              </w:rPr>
+              <w:t>通过：3 秒返回成功（改造前为 60 秒超时失败）</w:t>
+            </w:r>
+          </w:p>
+        </w:tc>
+      </w:tr>
+      <w:tr>
+        <w:tc>
+          <w:tcPr>
+            <w:tcW w:type="dxa" w:w="454"/>
+          </w:tcPr>
+          <w:p>
+            <w:pPr>
+              <w:spacing w:after="0"/>
+            </w:pPr>
+            <w:r/>
+            <w:r>
+              <w:rPr>
+                <w:rFonts w:ascii="Noto Sans CJK SC" w:hAnsi="Noto Sans CJK SC" w:eastAsia="Noto Sans CJK SC"/>
+                <w:sz w:val="16"/>
+              </w:rPr>
+              <w:t>5</w:t>
+            </w:r>
+          </w:p>
+        </w:tc>
+        <w:tc>
+          <w:tcPr>
+            <w:tcW w:type="dxa" w:w="5102"/>
+          </w:tcPr>
+          <w:p>
+            <w:pPr>
+              <w:spacing w:after="0"/>
+            </w:pPr>
+            <w:r/>
+            <w:r>
+              <w:rPr>
+                <w:rFonts w:ascii="Noto Sans CJK SC" w:hAnsi="Noto Sans CJK SC" w:eastAsia="Noto Sans CJK SC"/>
+                <w:sz w:val="16"/>
+              </w:rPr>
+              <w:t>单元测试 test_takeoff_monitor.py</w:t>
+            </w:r>
+          </w:p>
+        </w:tc>
+        <w:tc>
+          <w:tcPr>
+            <w:tcW w:type="dxa" w:w="9638"/>
+          </w:tcPr>
+          <w:p>
+            <w:pPr>
+              <w:spacing w:after="0"/>
+            </w:pPr>
+            <w:r/>
+            <w:r>
+              <w:rPr>
+                <w:rFonts w:ascii="Noto Sans CJK SC" w:hAnsi="Noto Sans CJK SC" w:eastAsia="Noto Sans CJK SC"/>
+                <w:sz w:val="16"/>
+              </w:rPr>
+              <w:t>通过：桩件替掉 rclpy，13 项断言覆盖稳定窗口、爬升量不足、位置漂移、无里程计、外部发布者监测、已在空中判定</w:t>
+            </w:r>
+          </w:p>
+        </w:tc>
+      </w:tr>
+    </w:tbl>
+    <w:p>
+      <w:pPr>
+        <w:spacing w:after="120"/>
+      </w:pPr>
+    </w:p>
+    <w:p>
+      <w:pPr>
+        <w:pStyle w:val="Heading2"/>
+      </w:pPr>
+      <w:r>
+        <w:rPr>
+          <w:rFonts w:ascii="Noto Sans CJK SC" w:hAnsi="Noto Sans CJK SC" w:eastAsia="Noto Sans CJK SC"/>
+          <w:sz w:val="22"/>
+        </w:rPr>
+        <w:t>16.4 收益与仍在的约束</w:t>
+      </w:r>
+    </w:p>
+    <w:tbl>
+      <w:tblPr>
+        <w:tblStyle w:val="TableGrid"/>
+        <w:tblW w:type="auto" w:w="0"/>
+        <w:jc w:val="center"/>
+        <w:tblLook w:firstColumn="1" w:firstRow="1" w:lastColumn="0" w:lastRow="0" w:noHBand="0" w:noVBand="1" w:val="04A0"/>
+      </w:tblPr>
+      <w:tblGrid>
+        <w:gridCol w:w="7569"/>
+        <w:gridCol w:w="7569"/>
+      </w:tblGrid>
+      <w:tr>
+        <w:tc>
+          <w:tcPr>
+            <w:tcW w:type="dxa" w:w="3402"/>
+            <w:shd w:val="clear" w:fill="D9E2F3"/>
+          </w:tcPr>
+          <w:p>
+            <w:r/>
+            <w:r>
+              <w:rPr>
+                <w:rFonts w:ascii="Noto Sans CJK SC" w:hAnsi="Noto Sans CJK SC" w:eastAsia="Noto Sans CJK SC"/>
+                <w:b/>
+                <w:sz w:val="17"/>
+              </w:rPr>
+              <w:t>收益</w:t>
+            </w:r>
+          </w:p>
+        </w:tc>
+        <w:tc>
+          <w:tcPr>
+            <w:tcW w:type="dxa" w:w="11792"/>
+            <w:shd w:val="clear" w:fill="D9E2F3"/>
+          </w:tcPr>
+          <w:p>
+            <w:r/>
+            <w:r>
+              <w:rPr>
+                <w:rFonts w:ascii="Noto Sans CJK SC" w:hAnsi="Noto Sans CJK SC" w:eastAsia="Noto Sans CJK SC"/>
+                <w:b/>
+                <w:sz w:val="17"/>
+              </w:rPr>
+              <w:t>说明</w:t>
+            </w:r>
+          </w:p>
+        </w:tc>
+      </w:tr>
+      <w:tr>
+        <w:tc>
+          <w:tcPr>
+            <w:tcW w:type="dxa" w:w="3402"/>
+          </w:tcPr>
+          <w:p>
+            <w:pPr>
+              <w:spacing w:after="0"/>
+            </w:pPr>
+            <w:r/>
+            <w:r>
+              <w:rPr>
+                <w:rFonts w:ascii="Noto Sans CJK SC" w:hAnsi="Noto Sans CJK SC" w:eastAsia="Noto Sans CJK SC"/>
+                <w:sz w:val="16"/>
+              </w:rPr>
+              <w:t>判定不再受链路影响</w:t>
+            </w:r>
+          </w:p>
+        </w:tc>
+        <w:tc>
+          <w:tcPr>
+            <w:tcW w:type="dxa" w:w="11792"/>
+          </w:tcPr>
+          <w:p>
+            <w:pPr>
+              <w:spacing w:after="0"/>
+            </w:pPr>
+            <w:r/>
+            <w:r>
+              <w:rPr>
+                <w:rFonts w:ascii="Noto Sans CJK SC" w:hAnsi="Noto Sans CJK SC" w:eastAsia="Noto Sans CJK SC"/>
+                <w:sz w:val="16"/>
+              </w:rPr>
+              <w:t>armed 与里程计都在机载读，真机部署时链路抖动不会再误判成"还没起来"</w:t>
+            </w:r>
+          </w:p>
+        </w:tc>
+      </w:tr>
+      <w:tr>
+        <w:tc>
+          <w:tcPr>
+            <w:tcW w:type="dxa" w:w="3402"/>
+          </w:tcPr>
+          <w:p>
+            <w:pPr>
+              <w:spacing w:after="0"/>
+            </w:pPr>
+            <w:r/>
+            <w:r>
+              <w:rPr>
+                <w:rFonts w:ascii="Noto Sans CJK SC" w:hAnsi="Noto Sans CJK SC" w:eastAsia="Noto Sans CJK SC"/>
+                <w:sz w:val="16"/>
+              </w:rPr>
+              <w:t>失败原因可区分</w:t>
+            </w:r>
+          </w:p>
+        </w:tc>
+        <w:tc>
+          <w:tcPr>
+            <w:tcW w:type="dxa" w:w="11792"/>
+          </w:tcPr>
+          <w:p>
+            <w:pPr>
+              <w:spacing w:after="0"/>
+            </w:pPr>
+            <w:r/>
+            <w:r>
+              <w:rPr>
+                <w:rFonts w:ascii="Noto Sans CJK SC" w:hAnsi="Noto Sans CJK SC" w:eastAsia="Noto Sans CJK SC"/>
+                <w:sz w:val="16"/>
+              </w:rPr>
+              <w:t>result.stage 明确区分 armed（没解锁）与 stable（解锁了但爬升不到位），两者处置完全不同</w:t>
+            </w:r>
+          </w:p>
+        </w:tc>
+      </w:tr>
+      <w:tr>
+        <w:tc>
+          <w:tcPr>
+            <w:tcW w:type="dxa" w:w="3402"/>
+          </w:tcPr>
+          <w:p>
+            <w:pPr>
+              <w:spacing w:after="0"/>
+            </w:pPr>
+            <w:r/>
+            <w:r>
+              <w:rPr>
+                <w:rFonts w:ascii="Noto Sans CJK SC" w:hAnsi="Noto Sans CJK SC" w:eastAsia="Noto Sans CJK SC"/>
+                <w:sz w:val="16"/>
+              </w:rPr>
+              <w:t>可单独调试</w:t>
+            </w:r>
+          </w:p>
+        </w:tc>
+        <w:tc>
+          <w:tcPr>
+            <w:tcW w:type="dxa" w:w="11792"/>
+          </w:tcPr>
+          <w:p>
+            <w:pPr>
+              <w:spacing w:after="0"/>
+            </w:pPr>
+            <w:r/>
+            <w:r>
+              <w:rPr>
+                <w:rFonts w:ascii="Noto Sans CJK SC" w:hAnsi="Noto Sans CJK SC" w:eastAsia="Noto Sans CJK SC"/>
+                <w:sz w:val="16"/>
+              </w:rPr>
+              <w:t>ros2 action send_goal 直接能起飞，不必起选手容器</w:t>
+            </w:r>
+          </w:p>
+        </w:tc>
+      </w:tr>
+      <w:tr>
+        <w:tc>
+          <w:tcPr>
+            <w:tcW w:type="dxa" w:w="3402"/>
+          </w:tcPr>
+          <w:p>
+            <w:pPr>
+              <w:spacing w:after="0"/>
+            </w:pPr>
+            <w:r/>
+            <w:r>
+              <w:rPr>
+                <w:rFonts w:ascii="Noto Sans CJK SC" w:hAnsi="Noto Sans CJK SC" w:eastAsia="Noto Sans CJK SC"/>
+                <w:sz w:val="16"/>
+              </w:rPr>
+              <w:t>可取消</w:t>
+            </w:r>
+          </w:p>
+        </w:tc>
+        <w:tc>
+          <w:tcPr>
+            <w:tcW w:type="dxa" w:w="11792"/>
+          </w:tcPr>
+          <w:p>
+            <w:pPr>
+              <w:spacing w:after="0"/>
+            </w:pPr>
+            <w:r/>
+            <w:r>
+              <w:rPr>
+                <w:rFonts w:ascii="Noto Sans CJK SC" w:hAnsi="Noto Sans CJK SC" w:eastAsia="Noto Sans CJK SC"/>
+                <w:sz w:val="16"/>
+              </w:rPr>
+              <w:t>原来起飞指令发出后收不回来</w:t>
+            </w:r>
+          </w:p>
+        </w:tc>
+      </w:tr>
+      <w:tr>
+        <w:tc>
+          <w:tcPr>
+            <w:tcW w:type="dxa" w:w="3402"/>
+          </w:tcPr>
+          <w:p>
+            <w:pPr>
+              <w:spacing w:after="0"/>
+            </w:pPr>
+            <w:r/>
+            <w:r>
+              <w:rPr>
+                <w:rFonts w:ascii="Noto Sans CJK SC" w:hAnsi="Noto Sans CJK SC" w:eastAsia="Noto Sans CJK SC"/>
+                <w:sz w:val="16"/>
+              </w:rPr>
+              <w:t>两镜像可分开重建</w:t>
+            </w:r>
+          </w:p>
+        </w:tc>
+        <w:tc>
+          <w:tcPr>
+            <w:tcW w:type="dxa" w:w="11792"/>
+          </w:tcPr>
+          <w:p>
+            <w:pPr>
+              <w:spacing w:after="0"/>
+            </w:pPr>
+            <w:r/>
+            <w:r>
+              <w:rPr>
+                <w:rFonts w:ascii="Noto Sans CJK SC" w:hAnsi="Noto Sans CJK SC" w:eastAsia="Noto Sans CJK SC"/>
+                <w:sz w:val="16"/>
+              </w:rPr>
+              <w:t>server 不在时 SDK 自动退回老路，中间状态不会坏</w:t>
+            </w:r>
+          </w:p>
+        </w:tc>
+      </w:tr>
+    </w:tbl>
+    <w:p>
+      <w:pPr>
+        <w:spacing w:after="120"/>
+      </w:pPr>
+    </w:p>
+    <w:tbl>
+      <w:tblPr>
+        <w:tblStyle w:val="TableGrid"/>
+        <w:tblW w:type="auto" w:w="0"/>
+        <w:jc w:val="center"/>
+        <w:tblLook w:firstColumn="1" w:firstRow="1" w:lastColumn="0" w:lastRow="0" w:noHBand="0" w:noVBand="1" w:val="04A0"/>
+      </w:tblPr>
+      <w:tblGrid>
+        <w:gridCol w:w="7569"/>
+        <w:gridCol w:w="7569"/>
+      </w:tblGrid>
+      <w:tr>
+        <w:tc>
+          <w:tcPr>
+            <w:tcW w:type="dxa" w:w="3175"/>
+            <w:shd w:val="clear" w:fill="D9E2F3"/>
+          </w:tcPr>
+          <w:p>
+            <w:r/>
+            <w:r>
+              <w:rPr>
+                <w:rFonts w:ascii="Noto Sans CJK SC" w:hAnsi="Noto Sans CJK SC" w:eastAsia="Noto Sans CJK SC"/>
+                <w:b/>
+                <w:sz w:val="17"/>
+              </w:rPr>
+              <w:t>仍在的约束</w:t>
+            </w:r>
+          </w:p>
+        </w:tc>
+        <w:tc>
+          <w:tcPr>
+            <w:tcW w:type="dxa" w:w="12019"/>
+            <w:shd w:val="clear" w:fill="D9E2F3"/>
+          </w:tcPr>
+          <w:p>
+            <w:r/>
+            <w:r>
+              <w:rPr>
+                <w:rFonts w:ascii="Noto Sans CJK SC" w:hAnsi="Noto Sans CJK SC" w:eastAsia="Noto Sans CJK SC"/>
+                <w:b/>
+                <w:sz w:val="17"/>
+              </w:rPr>
+              <w:t>说明</w:t>
+            </w:r>
+          </w:p>
+        </w:tc>
+      </w:tr>
+      <w:tr>
+        <w:tc>
+          <w:tcPr>
+            <w:tcW w:type="dxa" w:w="3175"/>
+          </w:tcPr>
+          <w:p>
+            <w:pPr>
+              <w:spacing w:after="0"/>
+            </w:pPr>
+            <w:r/>
+            <w:r>
+              <w:rPr>
+                <w:rFonts w:ascii="Noto Sans CJK SC" w:hAnsi="Noto Sans CJK SC" w:eastAsia="Noto Sans CJK SC"/>
+                <w:sz w:val="16"/>
+              </w:rPr>
+              <w:t>CONTROLLER=ros2_px4_stack 不支持</w:t>
+            </w:r>
+          </w:p>
+        </w:tc>
+        <w:tc>
+          <w:tcPr>
+            <w:tcW w:type="dxa" w:w="12019"/>
+          </w:tcPr>
+          <w:p>
+            <w:pPr>
+              <w:spacing w:after="0"/>
+            </w:pPr>
+            <w:r/>
+            <w:r>
+              <w:rPr>
+                <w:rFonts w:ascii="Noto Sans CJK SC" w:hAnsi="Noto Sans CJK SC" w:eastAsia="Noto Sans CJK SC"/>
+                <w:sz w:val="16"/>
+              </w:rPr>
+              <w:t>那条路线没有 takeoff_land 话题（走 takeoff_and_track_trajectory 那套）。这是既有约束，不是本次引入——改造前的 sdk.takeoff() 同样发这条话题。将来若要支持，应在同一个 server 内加后端分支（参数选 controller_kind），而不是再写第二个 server</w:t>
+            </w:r>
+          </w:p>
+        </w:tc>
+      </w:tr>
+      <w:tr>
+        <w:tc>
+          <w:tcPr>
+            <w:tcW w:type="dxa" w:w="3175"/>
+          </w:tcPr>
+          <w:p>
+            <w:pPr>
+              <w:spacing w:after="0"/>
+            </w:pPr>
+            <w:r/>
+            <w:r>
+              <w:rPr>
+                <w:rFonts w:ascii="Noto Sans CJK SC" w:hAnsi="Noto Sans CJK SC" w:eastAsia="Noto Sans CJK SC"/>
+                <w:sz w:val="16"/>
+              </w:rPr>
+              <w:t>多写者仍然存在</w:t>
+            </w:r>
+          </w:p>
+        </w:tc>
+        <w:tc>
+          <w:tcPr>
+            <w:tcW w:type="dxa" w:w="12019"/>
+          </w:tcPr>
+          <w:p>
+            <w:pPr>
+              <w:spacing w:after="0"/>
+            </w:pPr>
+            <w:r/>
+            <w:r>
+              <w:rPr>
+                <w:rFonts w:ascii="Noto Sans CJK SC" w:hAnsi="Noto Sans CJK SC" w:eastAsia="Noto Sans CJK SC"/>
+                <w:sz w:val="16"/>
+              </w:rPr>
+              <w:t>takeoff_land 上还有 takeoff_gate 与 GCS 两路发布者。server 订阅该话题，发现非自己发出的 TAKEOFF 就在 result.message 中标注，做到可追溯；不做拦截——要独占得改控制器只认 server 的指令，那要动 vendor 的 C++</w:t>
+            </w:r>
+          </w:p>
+        </w:tc>
+      </w:tr>
+      <w:tr>
+        <w:tc>
+          <w:tcPr>
+            <w:tcW w:type="dxa" w:w="3175"/>
+          </w:tcPr>
+          <w:p>
+            <w:pPr>
+              <w:spacing w:after="0"/>
+            </w:pPr>
+            <w:r/>
+            <w:r>
+              <w:rPr>
+                <w:rFonts w:ascii="Noto Sans CJK SC" w:hAnsi="Noto Sans CJK SC" w:eastAsia="Noto Sans CJK SC"/>
+                <w:sz w:val="16"/>
+              </w:rPr>
+              <w:t>build 顺序有要求</w:t>
+            </w:r>
+          </w:p>
+        </w:tc>
+        <w:tc>
+          <w:tcPr>
+            <w:tcW w:type="dxa" w:w="12019"/>
+          </w:tcPr>
+          <w:p>
+            <w:pPr>
+              <w:spacing w:after="0"/>
+            </w:pPr>
+            <w:r/>
+            <w:r>
+              <w:rPr>
+                <w:rFonts w:ascii="Noto Sans CJK SC" w:hAnsi="Noto Sans CJK SC" w:eastAsia="Noto Sans CJK SC"/>
+                <w:sz w:val="16"/>
+              </w:rPr>
+              <w:t>先 flight-stack（quadrotor_msgs 在此编译，action 类型在这一步生成），再 contestant-sdk（COPY --from=flight-stack:latest 拿其安装产物）。顺序颠倒会拷到旧的 quadrotor_msgs，SDK 静默退回老路，看起来像"改动没生效"</w:t>
+            </w:r>
+          </w:p>
+        </w:tc>
+      </w:tr>
+    </w:tbl>
+    <w:p>
+      <w:pPr>
+        <w:spacing w:after="120"/>
+      </w:pPr>
+    </w:p>
+    <w:p>
+      <w:pPr>
+        <w:pStyle w:val="Heading2"/>
+      </w:pPr>
+      <w:r>
+        <w:rPr>
+          <w:rFonts w:ascii="Noto Sans CJK SC" w:hAnsi="Noto Sans CJK SC" w:eastAsia="Noto Sans CJK SC"/>
+          <w:sz w:val="22"/>
+        </w:rPr>
+        <w:t>16.5 顺带清理的日志噪音</w:t>
+      </w:r>
+    </w:p>
+    <w:p>
+      <w:pPr>
+        <w:spacing w:after="80"/>
+      </w:pPr>
+      <w:r>
+        <w:rPr>
+          <w:rFonts w:ascii="Noto Sans CJK SC" w:hAnsi="Noto Sans CJK SC" w:eastAsia="Noto Sans CJK SC"/>
+          <w:b w:val="0"/>
+          <w:i w:val="0"/>
+          <w:sz w:val="18"/>
+        </w:rPr>
+        <w:t>precision_servo_node 在空闲时每 5 秒刷一条 ERROR："servo_mode参数当前值''不合法"。但空字符串是刻意设计的"待命"状态——该节点由 entrypoint 每架飞机常驻拉起，容器启动那一刻不可能知道该是 center_only 还是 precision_land，就是要等 SDK 显式设置。待命是预期行为，不该按 ERROR 报。已改为：空字符串只在第一次进入待命时打一条 info，拿到合法模式后复位标志；非空但不合法（真的设错了）仍然保留 ERROR。</w:t>
       </w:r>
     </w:p>
     <w:sectPr>

</xml_diff>